<commit_message>
Update E6 Word documents
</commit_message>
<xml_diff>
--- a/public/Fiche_E6_SPIRINE realisation 1.docx
+++ b/public/Fiche_E6_SPIRINE realisation 1.docx
@@ -674,7 +674,31 @@
                 <w:sz w:val="20"/>
                 <w:szCs w:val="20"/>
               </w:rPr>
-              <w:t>24/03/2026</w:t>
+              <w:t>08</w:t>
+            </w:r>
+            <w:r>
+              <w:rPr>
+                <w:rFonts w:ascii="Arial" w:hAnsi="Arial" w:cs="Arial"/>
+                <w:sz w:val="20"/>
+                <w:szCs w:val="20"/>
+              </w:rPr>
+              <w:t>/0</w:t>
+            </w:r>
+            <w:r>
+              <w:rPr>
+                <w:rFonts w:ascii="Arial" w:hAnsi="Arial" w:cs="Arial"/>
+                <w:sz w:val="20"/>
+                <w:szCs w:val="20"/>
+              </w:rPr>
+              <w:t>6</w:t>
+            </w:r>
+            <w:r>
+              <w:rPr>
+                <w:rFonts w:ascii="Arial" w:hAnsi="Arial" w:cs="Arial"/>
+                <w:sz w:val="20"/>
+                <w:szCs w:val="20"/>
+              </w:rPr>
+              <w:t>/2026</w:t>
             </w:r>
           </w:p>
         </w:tc>

</xml_diff>

<commit_message>
Update E6 documents and add RB_TKTS demo video
</commit_message>
<xml_diff>
--- a/public/Fiche_E6_SPIRINE realisation 1.docx
+++ b/public/Fiche_E6_SPIRINE realisation 1.docx
@@ -1305,45 +1305,19 @@
               <w:snapToGrid w:val="0"/>
               <w:rPr>
                 <w:bCs/>
-                <w:sz w:val="18"/>
-              </w:rPr>
-            </w:pPr>
-            <w:r>
-              <w:rPr>
-                <w:bCs/>
-                <w:sz w:val="18"/>
-              </w:rPr>
-              <w:t xml:space="preserve">Ressources fournies : Exports de tickets </w:t>
-            </w:r>
-            <w:proofErr w:type="spellStart"/>
-            <w:r>
-              <w:rPr>
-                <w:bCs/>
-                <w:sz w:val="18"/>
-              </w:rPr>
-              <w:t>Zendesk</w:t>
-            </w:r>
-            <w:proofErr w:type="spellEnd"/>
-            <w:r>
-              <w:rPr>
-                <w:bCs/>
-                <w:sz w:val="18"/>
-              </w:rPr>
-              <w:t xml:space="preserve"> au format XML, environnement de développement Ruby, accès aux données utiles du support, outils locaux d’analyse et de traitement</w:t>
-            </w:r>
-            <w:r>
-              <w:rPr>
-                <w:bCs/>
-                <w:sz w:val="18"/>
-              </w:rPr>
-              <w:t xml:space="preserve"> LLM</w:t>
-            </w:r>
-            <w:r>
-              <w:rPr>
-                <w:bCs/>
-                <w:sz w:val="18"/>
-              </w:rPr>
-              <w:t>.</w:t>
+              </w:rPr>
+            </w:pPr>
+            <w:r>
+              <w:rPr>
+                <w:b/>
+              </w:rPr>
+              <w:t>Ressources fournies</w:t>
+            </w:r>
+            <w:r>
+              <w:rPr>
+                <w:bCs/>
+              </w:rPr>
+              <w:t xml:space="preserve"> :</w:t>
             </w:r>
           </w:p>
           <w:p>
@@ -1354,15 +1328,67 @@
               </w:tabs>
               <w:snapToGrid w:val="0"/>
               <w:rPr>
-                <w:sz w:val="20"/>
-              </w:rPr>
-            </w:pPr>
-            <w:r>
-              <w:rPr>
-                <w:bCs/>
-                <w:sz w:val="18"/>
-              </w:rPr>
-              <w:t>Résultats attendus : Mettre en place un outil capable d’importer, nettoyer, structurer et analyser les tickets afin d’identifier les problèmes récurrents, faciliter leur exploitation et produire des résultats utiles sous forme de regroupements, résumés et statistiques.</w:t>
+                <w:bCs/>
+              </w:rPr>
+            </w:pPr>
+            <w:r>
+              <w:rPr>
+                <w:bCs/>
+              </w:rPr>
+              <w:t xml:space="preserve">Exports de tickets issus de la plateforme </w:t>
+            </w:r>
+            <w:proofErr w:type="spellStart"/>
+            <w:r>
+              <w:rPr>
+                <w:bCs/>
+              </w:rPr>
+              <w:t>Zendesk</w:t>
+            </w:r>
+            <w:proofErr w:type="spellEnd"/>
+            <w:r>
+              <w:rPr>
+                <w:bCs/>
+              </w:rPr>
+              <w:t xml:space="preserve"> au format XML, environnement de développement en langage Ruby, accès aux données nécessaires provenant du service support, ainsi que des outils locaux d’analyse et de traitement intégrant un modèle de langage (LLM) pour l’exploitation automatisée des informations.</w:t>
+            </w:r>
+          </w:p>
+          <w:p>
+            <w:pPr>
+              <w:pStyle w:val="Titre9"/>
+              <w:tabs>
+                <w:tab w:val="left" w:pos="0"/>
+              </w:tabs>
+              <w:snapToGrid w:val="0"/>
+              <w:rPr>
+                <w:bCs/>
+              </w:rPr>
+            </w:pPr>
+            <w:r>
+              <w:rPr>
+                <w:b/>
+              </w:rPr>
+              <w:t>Résultats attendus</w:t>
+            </w:r>
+            <w:r>
+              <w:rPr>
+                <w:bCs/>
+              </w:rPr>
+              <w:t xml:space="preserve"> : </w:t>
+            </w:r>
+          </w:p>
+          <w:p>
+            <w:pPr>
+              <w:pStyle w:val="Titre9"/>
+              <w:tabs>
+                <w:tab w:val="left" w:pos="0"/>
+              </w:tabs>
+              <w:snapToGrid w:val="0"/>
+            </w:pPr>
+            <w:r>
+              <w:rPr>
+                <w:bCs/>
+              </w:rPr>
+              <w:t>Mettre en place un outil capable d’importer, nettoyer, structurer et analyser les tickets afin d’identifier les problèmes récurrents, faciliter leur exploitation et produire des résultats utiles sous forme de regroupements, résumés et statistiques.</w:t>
             </w:r>
           </w:p>
         </w:tc>
@@ -1385,296 +1411,322 @@
           </w:tcPr>
           <w:p>
             <w:pPr>
-              <w:snapToGrid w:val="0"/>
-              <w:jc w:val="both"/>
-              <w:rPr>
-                <w:rFonts w:ascii="Arial" w:hAnsi="Arial" w:cs="Arial"/>
-                <w:b/>
-                <w:sz w:val="20"/>
-              </w:rPr>
-            </w:pPr>
-            <w:r>
-              <w:rPr>
-                <w:rFonts w:ascii="Arial" w:hAnsi="Arial" w:cs="Arial"/>
-                <w:b/>
-                <w:sz w:val="20"/>
-              </w:rPr>
-              <w:t>Description des ressources</w:t>
-            </w:r>
-            <w:r>
-              <w:rPr>
-                <w:rFonts w:ascii="Arial" w:hAnsi="Arial" w:cs="Arial"/>
-                <w:b/>
-                <w:sz w:val="20"/>
-              </w:rPr>
-              <w:t xml:space="preserve"> documentaires,</w:t>
-            </w:r>
-            <w:r>
-              <w:rPr>
-                <w:rFonts w:ascii="Arial" w:hAnsi="Arial" w:cs="Arial"/>
-                <w:b/>
-                <w:sz w:val="20"/>
-              </w:rPr>
-              <w:t xml:space="preserve"> matér</w:t>
-            </w:r>
-            <w:r>
-              <w:rPr>
-                <w:rFonts w:ascii="Arial" w:hAnsi="Arial" w:cs="Arial"/>
-                <w:b/>
-                <w:sz w:val="20"/>
-              </w:rPr>
-              <w:t>ielles et logicielles utilisées</w:t>
-            </w:r>
-            <w:r>
-              <w:rPr>
-                <w:rStyle w:val="Appelnotedebasdep"/>
-                <w:rFonts w:ascii="Arial" w:hAnsi="Arial" w:cs="Arial"/>
-                <w:b/>
-                <w:sz w:val="20"/>
-              </w:rPr>
-              <w:footnoteReference w:id="2"/>
-            </w:r>
-          </w:p>
-          <w:p>
-            <w:pPr>
-              <w:snapToGrid w:val="0"/>
-              <w:jc w:val="both"/>
-              <w:rPr>
-                <w:rFonts w:ascii="Arial" w:hAnsi="Arial" w:cs="Arial"/>
-                <w:bCs/>
-                <w:sz w:val="20"/>
-              </w:rPr>
-            </w:pPr>
-            <w:r>
-              <w:rPr>
-                <w:rFonts w:ascii="Arial" w:hAnsi="Arial" w:cs="Arial"/>
-                <w:bCs/>
-                <w:sz w:val="20"/>
+              <w:rPr>
+                <w:rFonts w:ascii="Arial" w:hAnsi="Arial" w:cs="Arial"/>
+                <w:b/>
+                <w:bCs/>
+              </w:rPr>
+            </w:pPr>
+            <w:r>
+              <w:rPr>
+                <w:rFonts w:ascii="Arial" w:hAnsi="Arial" w:cs="Arial"/>
+                <w:b/>
+                <w:bCs/>
+              </w:rPr>
+              <w:lastRenderedPageBreak/>
+              <w:t>Description des ressources documentaires, matérielles et logicielles utilisées</w:t>
+            </w:r>
+          </w:p>
+          <w:p>
+            <w:pPr>
+              <w:rPr>
+                <w:rFonts w:ascii="Arial" w:hAnsi="Arial" w:cs="Arial"/>
+                <w:b/>
+                <w:bCs/>
+              </w:rPr>
+            </w:pPr>
+            <w:r>
+              <w:rPr>
+                <w:rFonts w:ascii="Arial" w:hAnsi="Arial" w:cs="Arial"/>
+                <w:b/>
+                <w:bCs/>
               </w:rPr>
               <w:t>Ressources documentaires :</w:t>
             </w:r>
           </w:p>
           <w:p>
             <w:pPr>
-              <w:snapToGrid w:val="0"/>
-              <w:jc w:val="both"/>
-              <w:rPr>
-                <w:rFonts w:ascii="Arial" w:hAnsi="Arial" w:cs="Arial"/>
-                <w:bCs/>
-                <w:sz w:val="20"/>
-              </w:rPr>
-            </w:pPr>
-            <w:r>
-              <w:rPr>
-                <w:rFonts w:ascii="Arial" w:hAnsi="Arial" w:cs="Arial"/>
-                <w:bCs/>
-                <w:sz w:val="20"/>
-              </w:rPr>
-              <w:t xml:space="preserve">Documentation Ruby, documentation </w:t>
-            </w:r>
-            <w:proofErr w:type="spellStart"/>
-            <w:r>
-              <w:rPr>
-                <w:rFonts w:ascii="Arial" w:hAnsi="Arial" w:cs="Arial"/>
-                <w:bCs/>
-                <w:sz w:val="20"/>
-              </w:rPr>
-              <w:t>Nokogiri</w:t>
-            </w:r>
-            <w:proofErr w:type="spellEnd"/>
-            <w:r>
-              <w:rPr>
-                <w:rFonts w:ascii="Arial" w:hAnsi="Arial" w:cs="Arial"/>
-                <w:bCs/>
-                <w:sz w:val="20"/>
-              </w:rPr>
-              <w:t xml:space="preserve">, documentation </w:t>
-            </w:r>
-            <w:proofErr w:type="spellStart"/>
-            <w:r>
-              <w:rPr>
-                <w:rFonts w:ascii="Arial" w:hAnsi="Arial" w:cs="Arial"/>
-                <w:bCs/>
-                <w:sz w:val="20"/>
-              </w:rPr>
-              <w:t>Zendesk</w:t>
-            </w:r>
-            <w:proofErr w:type="spellEnd"/>
-            <w:r>
-              <w:rPr>
-                <w:rFonts w:ascii="Arial" w:hAnsi="Arial" w:cs="Arial"/>
-                <w:bCs/>
-                <w:sz w:val="20"/>
-              </w:rPr>
-              <w:t xml:space="preserve"> API, documentation Ollama, documentation Git ainsi que les échanges et besoins </w:t>
-            </w:r>
-            <w:proofErr w:type="gramStart"/>
-            <w:r>
-              <w:rPr>
-                <w:rFonts w:ascii="Arial" w:hAnsi="Arial" w:cs="Arial"/>
-                <w:bCs/>
-                <w:sz w:val="20"/>
-              </w:rPr>
-              <w:t>métier liés</w:t>
-            </w:r>
-            <w:proofErr w:type="gramEnd"/>
-            <w:r>
-              <w:rPr>
-                <w:rFonts w:ascii="Arial" w:hAnsi="Arial" w:cs="Arial"/>
-                <w:bCs/>
-                <w:sz w:val="20"/>
-              </w:rPr>
-              <w:t xml:space="preserve"> à l’analyse des tickets.</w:t>
-            </w:r>
-          </w:p>
-          <w:p>
-            <w:pPr>
-              <w:snapToGrid w:val="0"/>
-              <w:jc w:val="both"/>
-              <w:rPr>
-                <w:rFonts w:ascii="Arial" w:hAnsi="Arial" w:cs="Arial"/>
-                <w:bCs/>
-                <w:sz w:val="20"/>
-              </w:rPr>
-            </w:pPr>
-          </w:p>
-          <w:p>
-            <w:pPr>
-              <w:snapToGrid w:val="0"/>
-              <w:jc w:val="both"/>
-              <w:rPr>
-                <w:rFonts w:ascii="Arial" w:hAnsi="Arial" w:cs="Arial"/>
-                <w:bCs/>
-                <w:sz w:val="20"/>
-              </w:rPr>
-            </w:pPr>
-            <w:r>
-              <w:rPr>
-                <w:rFonts w:ascii="Arial" w:hAnsi="Arial" w:cs="Arial"/>
-                <w:bCs/>
-                <w:sz w:val="20"/>
+              <w:rPr>
+                <w:rFonts w:ascii="Arial" w:hAnsi="Arial" w:cs="Arial"/>
+                <w:sz w:val="22"/>
+                <w:szCs w:val="22"/>
+              </w:rPr>
+            </w:pPr>
+            <w:r>
+              <w:rPr>
+                <w:rFonts w:ascii="Arial" w:hAnsi="Arial" w:cs="Arial"/>
+                <w:sz w:val="22"/>
+                <w:szCs w:val="22"/>
+              </w:rPr>
+              <w:t>Les ressources documentaires mobilisées comprennent la documentation officielle de Ruby, la documentation de la bibliothèque Nokogiri pour le traitement XML/HTML, la documentation de l’API Zendesk pour l’exploitation des tickets, ainsi que la documentation d’Ollama (utilisé comme API locale pour orchestrer les LLM employés pour la vectorisation et la génération de résumés thématiques). La documentation Git a également été utilisée, en complément des échanges avec les utilisateurs et de l’analyse des besoins métier liés au traitement des tickets.</w:t>
+            </w:r>
+          </w:p>
+          <w:p>
+            <w:pPr>
+              <w:rPr>
+                <w:rFonts w:ascii="Arial" w:hAnsi="Arial" w:cs="Arial"/>
+                <w:sz w:val="22"/>
+                <w:szCs w:val="22"/>
+              </w:rPr>
+            </w:pPr>
+          </w:p>
+          <w:p>
+            <w:pPr>
+              <w:rPr>
+                <w:rFonts w:ascii="Arial" w:hAnsi="Arial" w:cs="Arial"/>
+                <w:b/>
+                <w:bCs/>
+              </w:rPr>
+            </w:pPr>
+            <w:r>
+              <w:rPr>
+                <w:rFonts w:ascii="Arial" w:hAnsi="Arial" w:cs="Arial"/>
+                <w:b/>
+                <w:bCs/>
               </w:rPr>
               <w:t>Ressources matérielles :</w:t>
             </w:r>
           </w:p>
           <w:p>
             <w:pPr>
-              <w:snapToGrid w:val="0"/>
-              <w:jc w:val="both"/>
-              <w:rPr>
-                <w:rFonts w:ascii="Arial" w:hAnsi="Arial" w:cs="Arial"/>
-                <w:bCs/>
-                <w:sz w:val="20"/>
-              </w:rPr>
-            </w:pPr>
-            <w:r>
-              <w:rPr>
-                <w:rFonts w:ascii="Arial" w:hAnsi="Arial" w:cs="Arial"/>
-                <w:bCs/>
-                <w:sz w:val="20"/>
-              </w:rPr>
-              <w:t>Ordinateur de développement, environnement local de test et d’exécution</w:t>
-            </w:r>
-            <w:r>
-              <w:rPr>
-                <w:rFonts w:ascii="Arial" w:hAnsi="Arial" w:cs="Arial"/>
-                <w:bCs/>
-                <w:sz w:val="20"/>
-              </w:rPr>
-              <w:t>, LLM</w:t>
-            </w:r>
-            <w:r>
-              <w:rPr>
-                <w:rFonts w:ascii="Arial" w:hAnsi="Arial" w:cs="Arial"/>
-                <w:bCs/>
-                <w:sz w:val="20"/>
-              </w:rPr>
-              <w:t>.</w:t>
-            </w:r>
-          </w:p>
-          <w:p>
-            <w:pPr>
-              <w:snapToGrid w:val="0"/>
-              <w:jc w:val="both"/>
-              <w:rPr>
-                <w:rFonts w:ascii="Arial" w:hAnsi="Arial" w:cs="Arial"/>
-                <w:bCs/>
-                <w:sz w:val="20"/>
-              </w:rPr>
-            </w:pPr>
-          </w:p>
-          <w:p>
-            <w:pPr>
-              <w:snapToGrid w:val="0"/>
-              <w:jc w:val="both"/>
-              <w:rPr>
-                <w:rFonts w:ascii="Arial" w:hAnsi="Arial" w:cs="Arial"/>
-                <w:bCs/>
-                <w:sz w:val="20"/>
-              </w:rPr>
-            </w:pPr>
-            <w:r>
-              <w:rPr>
-                <w:rFonts w:ascii="Arial" w:hAnsi="Arial" w:cs="Arial"/>
-                <w:bCs/>
-                <w:sz w:val="20"/>
+              <w:pStyle w:val="Paragraphedeliste"/>
+              <w:numPr>
+                <w:ilvl w:val="0"/>
+                <w:numId w:val="14"/>
+              </w:numPr>
+              <w:rPr>
+                <w:rFonts w:ascii="Arial" w:hAnsi="Arial" w:cs="Arial"/>
+                <w:sz w:val="22"/>
+                <w:szCs w:val="22"/>
+              </w:rPr>
+            </w:pPr>
+            <w:r>
+              <w:rPr>
+                <w:rFonts w:ascii="Arial" w:hAnsi="Arial" w:cs="Arial"/>
+                <w:sz w:val="22"/>
+                <w:szCs w:val="22"/>
+              </w:rPr>
+              <w:t>Ordinateur de développement dédié au projet ;</w:t>
+            </w:r>
+          </w:p>
+          <w:p>
+            <w:pPr>
+              <w:pStyle w:val="Paragraphedeliste"/>
+              <w:numPr>
+                <w:ilvl w:val="0"/>
+                <w:numId w:val="14"/>
+              </w:numPr>
+              <w:rPr>
+                <w:rFonts w:ascii="Arial" w:hAnsi="Arial" w:cs="Arial"/>
+                <w:sz w:val="22"/>
+                <w:szCs w:val="22"/>
+              </w:rPr>
+            </w:pPr>
+            <w:r>
+              <w:rPr>
+                <w:rFonts w:ascii="Arial" w:hAnsi="Arial" w:cs="Arial"/>
+                <w:sz w:val="22"/>
+                <w:szCs w:val="22"/>
+              </w:rPr>
+              <w:t>Environnement local de test et d’exécution ;</w:t>
+            </w:r>
+          </w:p>
+          <w:p>
+            <w:pPr>
+              <w:pStyle w:val="Paragraphedeliste"/>
+              <w:numPr>
+                <w:ilvl w:val="0"/>
+                <w:numId w:val="14"/>
+              </w:numPr>
+              <w:rPr>
+                <w:rFonts w:ascii="Arial" w:hAnsi="Arial" w:cs="Arial"/>
+                <w:sz w:val="22"/>
+                <w:szCs w:val="22"/>
+              </w:rPr>
+            </w:pPr>
+            <w:r>
+              <w:rPr>
+                <w:rFonts w:ascii="Arial" w:hAnsi="Arial" w:cs="Arial"/>
+                <w:sz w:val="22"/>
+                <w:szCs w:val="22"/>
+              </w:rPr>
+              <w:t>Poste configuré pour les traitements de données et l’exécution locale des modèles.</w:t>
+            </w:r>
+          </w:p>
+          <w:p>
+            <w:pPr>
+              <w:rPr>
+                <w:rFonts w:ascii="Arial" w:hAnsi="Arial" w:cs="Arial"/>
+              </w:rPr>
+            </w:pPr>
+          </w:p>
+          <w:p>
+            <w:pPr>
+              <w:rPr>
+                <w:rFonts w:ascii="Arial" w:hAnsi="Arial" w:cs="Arial"/>
+                <w:b/>
+                <w:bCs/>
+              </w:rPr>
+            </w:pPr>
+            <w:r>
+              <w:rPr>
+                <w:rFonts w:ascii="Arial" w:hAnsi="Arial" w:cs="Arial"/>
+                <w:b/>
+                <w:bCs/>
               </w:rPr>
               <w:t>Ressources logicielles :</w:t>
             </w:r>
           </w:p>
           <w:p>
             <w:pPr>
-              <w:snapToGrid w:val="0"/>
-              <w:jc w:val="both"/>
-              <w:rPr>
-                <w:rFonts w:ascii="Arial" w:hAnsi="Arial" w:cs="Arial"/>
-                <w:bCs/>
-                <w:sz w:val="20"/>
-              </w:rPr>
-            </w:pPr>
-            <w:r>
-              <w:rPr>
-                <w:rFonts w:ascii="Arial" w:hAnsi="Arial" w:cs="Arial"/>
-                <w:bCs/>
-                <w:sz w:val="20"/>
-              </w:rPr>
-              <w:t xml:space="preserve">Ruby, </w:t>
-            </w:r>
-            <w:proofErr w:type="spellStart"/>
-            <w:r>
-              <w:rPr>
-                <w:rFonts w:ascii="Arial" w:hAnsi="Arial" w:cs="Arial"/>
-                <w:bCs/>
-                <w:sz w:val="20"/>
-              </w:rPr>
-              <w:t>Nokogiri</w:t>
-            </w:r>
-            <w:proofErr w:type="spellEnd"/>
-            <w:r>
-              <w:rPr>
-                <w:rFonts w:ascii="Arial" w:hAnsi="Arial" w:cs="Arial"/>
-                <w:bCs/>
-                <w:sz w:val="20"/>
-              </w:rPr>
-              <w:t xml:space="preserve">, </w:t>
-            </w:r>
-            <w:proofErr w:type="spellStart"/>
-            <w:r>
-              <w:rPr>
-                <w:rFonts w:ascii="Arial" w:hAnsi="Arial" w:cs="Arial"/>
-                <w:bCs/>
-                <w:sz w:val="20"/>
-              </w:rPr>
-              <w:t>Zendesk</w:t>
-            </w:r>
-            <w:proofErr w:type="spellEnd"/>
-            <w:r>
-              <w:rPr>
-                <w:rFonts w:ascii="Arial" w:hAnsi="Arial" w:cs="Arial"/>
-                <w:bCs/>
-                <w:sz w:val="20"/>
-              </w:rPr>
-              <w:t xml:space="preserve"> API, Ollama, Git, Visual Studio Code, outils de traitement et d’analyse de données.</w:t>
+              <w:pStyle w:val="Paragraphedeliste"/>
+              <w:numPr>
+                <w:ilvl w:val="0"/>
+                <w:numId w:val="15"/>
+              </w:numPr>
+              <w:rPr>
+                <w:rFonts w:ascii="Arial" w:hAnsi="Arial" w:cs="Arial"/>
+                <w:sz w:val="22"/>
+                <w:szCs w:val="22"/>
+              </w:rPr>
+            </w:pPr>
+            <w:r>
+              <w:rPr>
+                <w:rFonts w:ascii="Arial" w:hAnsi="Arial" w:cs="Arial"/>
+                <w:sz w:val="22"/>
+                <w:szCs w:val="22"/>
+              </w:rPr>
+              <w:t>Ruby (version 3.x utilisée sur le projet) ;</w:t>
+            </w:r>
+          </w:p>
+          <w:p>
+            <w:pPr>
+              <w:pStyle w:val="Paragraphedeliste"/>
+              <w:numPr>
+                <w:ilvl w:val="0"/>
+                <w:numId w:val="15"/>
+              </w:numPr>
+              <w:rPr>
+                <w:rFonts w:ascii="Arial" w:hAnsi="Arial" w:cs="Arial"/>
+                <w:sz w:val="22"/>
+                <w:szCs w:val="22"/>
+              </w:rPr>
+            </w:pPr>
+            <w:r>
+              <w:rPr>
+                <w:rFonts w:ascii="Arial" w:hAnsi="Arial" w:cs="Arial"/>
+                <w:sz w:val="22"/>
+                <w:szCs w:val="22"/>
+              </w:rPr>
+              <w:t>Nokogiri pour le traitement XML/HTML ;</w:t>
+            </w:r>
+          </w:p>
+          <w:p>
+            <w:pPr>
+              <w:pStyle w:val="Paragraphedeliste"/>
+              <w:numPr>
+                <w:ilvl w:val="0"/>
+                <w:numId w:val="15"/>
+              </w:numPr>
+              <w:rPr>
+                <w:rFonts w:ascii="Arial" w:hAnsi="Arial" w:cs="Arial"/>
+                <w:sz w:val="22"/>
+                <w:szCs w:val="22"/>
+              </w:rPr>
+            </w:pPr>
+            <w:r>
+              <w:rPr>
+                <w:rFonts w:ascii="Arial" w:hAnsi="Arial" w:cs="Arial"/>
+                <w:sz w:val="22"/>
+                <w:szCs w:val="22"/>
+              </w:rPr>
+              <w:t>API Zendesk pour la récupération et l’exploitation des tickets ;</w:t>
+            </w:r>
+          </w:p>
+          <w:p>
+            <w:pPr>
+              <w:pStyle w:val="Paragraphedeliste"/>
+              <w:numPr>
+                <w:ilvl w:val="0"/>
+                <w:numId w:val="15"/>
+              </w:numPr>
+              <w:rPr>
+                <w:rFonts w:ascii="Arial" w:hAnsi="Arial" w:cs="Arial"/>
+                <w:sz w:val="22"/>
+                <w:szCs w:val="22"/>
+              </w:rPr>
+            </w:pPr>
+            <w:r>
+              <w:rPr>
+                <w:rFonts w:ascii="Arial" w:hAnsi="Arial" w:cs="Arial"/>
+                <w:sz w:val="22"/>
+                <w:szCs w:val="22"/>
+              </w:rPr>
+              <w:t>Ollama comme API locale donnant accès aux LLM utilisés pour la vectorisation et les résumés thématiques ;</w:t>
+            </w:r>
+          </w:p>
+          <w:p>
+            <w:pPr>
+              <w:pStyle w:val="Paragraphedeliste"/>
+              <w:numPr>
+                <w:ilvl w:val="0"/>
+                <w:numId w:val="15"/>
+              </w:numPr>
+              <w:rPr>
+                <w:rFonts w:ascii="Arial" w:hAnsi="Arial" w:cs="Arial"/>
+                <w:sz w:val="22"/>
+                <w:szCs w:val="22"/>
+              </w:rPr>
+            </w:pPr>
+            <w:r>
+              <w:rPr>
+                <w:rFonts w:ascii="Arial" w:hAnsi="Arial" w:cs="Arial"/>
+                <w:sz w:val="22"/>
+                <w:szCs w:val="22"/>
+              </w:rPr>
+              <w:t>Git pour le versionnement ;</w:t>
+            </w:r>
+          </w:p>
+          <w:p>
+            <w:pPr>
+              <w:pStyle w:val="Paragraphedeliste"/>
+              <w:numPr>
+                <w:ilvl w:val="0"/>
+                <w:numId w:val="15"/>
+              </w:numPr>
+              <w:rPr>
+                <w:rFonts w:ascii="Arial" w:hAnsi="Arial" w:cs="Arial"/>
+                <w:sz w:val="22"/>
+                <w:szCs w:val="22"/>
+              </w:rPr>
+            </w:pPr>
+            <w:r>
+              <w:rPr>
+                <w:rFonts w:ascii="Arial" w:hAnsi="Arial" w:cs="Arial"/>
+                <w:sz w:val="22"/>
+                <w:szCs w:val="22"/>
+              </w:rPr>
+              <w:t>Visual Studio Code comme environnement de développement ;</w:t>
+            </w:r>
+          </w:p>
+          <w:p>
+            <w:pPr>
+              <w:pStyle w:val="Paragraphedeliste"/>
+              <w:numPr>
+                <w:ilvl w:val="0"/>
+                <w:numId w:val="15"/>
+              </w:numPr>
+              <w:rPr>
+                <w:rFonts w:ascii="Arial" w:hAnsi="Arial" w:cs="Arial"/>
+              </w:rPr>
+            </w:pPr>
+            <w:r>
+              <w:rPr>
+                <w:rFonts w:ascii="Arial" w:hAnsi="Arial" w:cs="Arial"/>
+                <w:sz w:val="22"/>
+                <w:szCs w:val="22"/>
+              </w:rPr>
+              <w:t>Outils d’analyse de données (scripts Ruby, clustering KMeans, similarité cosinus, génération de rapports).</w:t>
             </w:r>
           </w:p>
         </w:tc>
@@ -1697,132 +1749,251 @@
           </w:tcPr>
           <w:p>
             <w:pPr>
-              <w:snapToGrid w:val="0"/>
-              <w:jc w:val="both"/>
-              <w:rPr>
-                <w:rFonts w:ascii="Arial" w:hAnsi="Arial" w:cs="Arial"/>
-                <w:b/>
-                <w:sz w:val="20"/>
-              </w:rPr>
-            </w:pPr>
-            <w:r>
-              <w:rPr>
-                <w:rFonts w:ascii="Arial" w:hAnsi="Arial" w:cs="Arial"/>
-                <w:b/>
-                <w:sz w:val="20"/>
-              </w:rPr>
-              <w:t>Mo</w:t>
-            </w:r>
-            <w:r>
-              <w:rPr>
-                <w:rFonts w:ascii="Arial" w:hAnsi="Arial" w:cs="Arial"/>
-                <w:b/>
-                <w:sz w:val="20"/>
-              </w:rPr>
-              <w:t>dalités d’accès aux productions</w:t>
-            </w:r>
-            <w:r>
-              <w:rPr>
-                <w:rFonts w:ascii="Arial" w:hAnsi="Arial" w:cs="Arial"/>
-                <w:b/>
-                <w:sz w:val="20"/>
-                <w:vertAlign w:val="superscript"/>
-              </w:rPr>
-              <w:footnoteReference w:id="3"/>
-            </w:r>
-            <w:r>
-              <w:rPr>
-                <w:rFonts w:ascii="Arial" w:hAnsi="Arial" w:cs="Arial"/>
-                <w:b/>
-                <w:sz w:val="20"/>
-              </w:rPr>
-              <w:t xml:space="preserve"> </w:t>
-            </w:r>
-            <w:r>
-              <w:rPr>
-                <w:rFonts w:ascii="Arial" w:hAnsi="Arial" w:cs="Arial"/>
-                <w:b/>
-                <w:sz w:val="20"/>
-              </w:rPr>
-              <w:t>et à l</w:t>
-            </w:r>
-            <w:r>
-              <w:rPr>
-                <w:rFonts w:ascii="Arial" w:hAnsi="Arial" w:cs="Arial"/>
-                <w:b/>
-                <w:sz w:val="20"/>
-              </w:rPr>
-              <w:t>eur</w:t>
-            </w:r>
-            <w:r>
-              <w:rPr>
-                <w:rFonts w:ascii="Arial" w:hAnsi="Arial" w:cs="Arial"/>
-                <w:b/>
-                <w:sz w:val="20"/>
-              </w:rPr>
-              <w:t xml:space="preserve"> documentation</w:t>
-            </w:r>
-            <w:r>
-              <w:rPr>
-                <w:rFonts w:ascii="Arial" w:hAnsi="Arial" w:cs="Arial"/>
-                <w:b/>
-                <w:sz w:val="20"/>
-                <w:vertAlign w:val="superscript"/>
-              </w:rPr>
-              <w:footnoteReference w:id="4"/>
-            </w:r>
-          </w:p>
-          <w:p>
-            <w:pPr>
-              <w:snapToGrid w:val="0"/>
-              <w:jc w:val="both"/>
-              <w:rPr>
-                <w:rFonts w:ascii="Arial" w:hAnsi="Arial" w:cs="Arial"/>
-                <w:bCs/>
-                <w:sz w:val="20"/>
-              </w:rPr>
-            </w:pPr>
-          </w:p>
-          <w:p>
-            <w:pPr>
-              <w:snapToGrid w:val="0"/>
-              <w:jc w:val="both"/>
-              <w:rPr>
-                <w:rFonts w:ascii="Arial" w:hAnsi="Arial" w:cs="Arial"/>
-                <w:bCs/>
-                <w:sz w:val="20"/>
-              </w:rPr>
-            </w:pPr>
-            <w:r>
-              <w:rPr>
-                <w:rFonts w:ascii="Arial" w:hAnsi="Arial" w:cs="Arial"/>
-                <w:bCs/>
-                <w:sz w:val="20"/>
-              </w:rPr>
-              <w:t>https://github.com/Farounaga/rb_tkts</w:t>
-            </w:r>
-          </w:p>
-          <w:p>
-            <w:pPr>
-              <w:snapToGrid w:val="0"/>
-              <w:jc w:val="both"/>
-              <w:rPr>
-                <w:rFonts w:ascii="Arial" w:hAnsi="Arial" w:cs="Arial"/>
-                <w:bCs/>
-                <w:sz w:val="20"/>
-              </w:rPr>
-            </w:pPr>
-          </w:p>
-          <w:p>
-            <w:pPr>
-              <w:snapToGrid w:val="0"/>
-              <w:jc w:val="both"/>
-              <w:rPr>
-                <w:rFonts w:ascii="Arial" w:hAnsi="Arial" w:cs="Arial"/>
-                <w:bCs/>
-                <w:sz w:val="20"/>
-              </w:rPr>
-            </w:pPr>
+              <w:rPr>
+                <w:rFonts w:ascii="Arial" w:hAnsi="Arial" w:cs="Arial"/>
+                <w:b/>
+                <w:bCs/>
+              </w:rPr>
+            </w:pPr>
+            <w:r>
+              <w:rPr>
+                <w:rFonts w:ascii="Arial" w:hAnsi="Arial" w:cs="Arial"/>
+                <w:b/>
+                <w:bCs/>
+              </w:rPr>
+              <w:t>Modalités d’accès aux productions et à leur documentation</w:t>
+            </w:r>
+          </w:p>
+          <w:p>
+            <w:pPr>
+              <w:rPr>
+                <w:rFonts w:ascii="Arial" w:hAnsi="Arial" w:cs="Arial"/>
+              </w:rPr>
+            </w:pPr>
+            <w:r>
+              <w:rPr>
+                <w:rFonts w:ascii="Arial" w:hAnsi="Arial" w:cs="Arial"/>
+                <w:b/>
+                <w:bCs/>
+                <w:i/>
+                <w:iCs/>
+              </w:rPr>
+              <w:t>Code source</w:t>
+            </w:r>
+            <w:r>
+              <w:rPr>
+                <w:rFonts w:ascii="Arial" w:hAnsi="Arial" w:cs="Arial"/>
+              </w:rPr>
+              <w:t xml:space="preserve"> :</w:t>
+            </w:r>
+          </w:p>
+          <w:p>
+            <w:pPr>
+              <w:pStyle w:val="Paragraphedeliste"/>
+              <w:numPr>
+                <w:ilvl w:val="0"/>
+                <w:numId w:val="19"/>
+              </w:numPr>
+              <w:rPr>
+                <w:rFonts w:ascii="Arial" w:hAnsi="Arial" w:cs="Arial"/>
+                <w:sz w:val="22"/>
+                <w:szCs w:val="22"/>
+              </w:rPr>
+            </w:pPr>
+            <w:r>
+              <w:rPr>
+                <w:rFonts w:ascii="Arial" w:hAnsi="Arial" w:cs="Arial"/>
+                <w:sz w:val="22"/>
+                <w:szCs w:val="22"/>
+              </w:rPr>
+              <w:t>Dépôt GitHub du projet : https://github.com/Farounaga/rb_tkts</w:t>
+            </w:r>
+          </w:p>
+          <w:p>
+            <w:pPr>
+              <w:rPr>
+                <w:rFonts w:ascii="Arial" w:hAnsi="Arial" w:cs="Arial"/>
+                <w:b/>
+                <w:bCs/>
+              </w:rPr>
+            </w:pPr>
+            <w:r>
+              <w:rPr>
+                <w:rFonts w:ascii="Arial" w:hAnsi="Arial" w:cs="Arial"/>
+                <w:b/>
+                <w:bCs/>
+              </w:rPr>
+              <w:t>Documentation du projet :</w:t>
+            </w:r>
+          </w:p>
+          <w:p>
+            <w:pPr>
+              <w:pStyle w:val="Paragraphedeliste"/>
+              <w:numPr>
+                <w:ilvl w:val="0"/>
+                <w:numId w:val="18"/>
+              </w:numPr>
+              <w:rPr>
+                <w:rFonts w:ascii="Arial" w:hAnsi="Arial" w:cs="Arial"/>
+                <w:sz w:val="22"/>
+                <w:szCs w:val="22"/>
+              </w:rPr>
+            </w:pPr>
+            <w:r>
+              <w:rPr>
+                <w:rFonts w:ascii="Arial" w:hAnsi="Arial" w:cs="Arial"/>
+                <w:sz w:val="22"/>
+                <w:szCs w:val="22"/>
+              </w:rPr>
+              <w:t>Dossier documentaire partagé (Drive / interne) : lien à compléter</w:t>
+            </w:r>
+          </w:p>
+          <w:p>
+            <w:pPr>
+              <w:rPr>
+                <w:rFonts w:ascii="Arial" w:hAnsi="Arial" w:cs="Arial"/>
+                <w:b/>
+                <w:bCs/>
+              </w:rPr>
+            </w:pPr>
+            <w:r>
+              <w:rPr>
+                <w:rFonts w:ascii="Arial" w:hAnsi="Arial" w:cs="Arial"/>
+                <w:b/>
+                <w:bCs/>
+              </w:rPr>
+              <w:t>Documents disponibles :</w:t>
+            </w:r>
+          </w:p>
+          <w:p>
+            <w:pPr>
+              <w:pStyle w:val="Paragraphedeliste"/>
+              <w:numPr>
+                <w:ilvl w:val="0"/>
+                <w:numId w:val="17"/>
+              </w:numPr>
+              <w:rPr>
+                <w:rFonts w:ascii="Arial" w:hAnsi="Arial" w:cs="Arial"/>
+                <w:sz w:val="22"/>
+                <w:szCs w:val="22"/>
+              </w:rPr>
+            </w:pPr>
+            <w:r>
+              <w:rPr>
+                <w:rFonts w:ascii="Arial" w:hAnsi="Arial" w:cs="Arial"/>
+                <w:sz w:val="22"/>
+                <w:szCs w:val="22"/>
+              </w:rPr>
+              <w:t>Schéma de la base de données (BDD)</w:t>
+            </w:r>
+          </w:p>
+          <w:p>
+            <w:pPr>
+              <w:pStyle w:val="Paragraphedeliste"/>
+              <w:numPr>
+                <w:ilvl w:val="0"/>
+                <w:numId w:val="17"/>
+              </w:numPr>
+              <w:rPr>
+                <w:rFonts w:ascii="Arial" w:hAnsi="Arial" w:cs="Arial"/>
+                <w:sz w:val="22"/>
+                <w:szCs w:val="22"/>
+              </w:rPr>
+            </w:pPr>
+            <w:r>
+              <w:rPr>
+                <w:rFonts w:ascii="Arial" w:hAnsi="Arial" w:cs="Arial"/>
+                <w:sz w:val="22"/>
+                <w:szCs w:val="22"/>
+              </w:rPr>
+              <w:t>Cahier des spécifications / cahier des charges</w:t>
+            </w:r>
+          </w:p>
+          <w:p>
+            <w:pPr>
+              <w:pStyle w:val="Paragraphedeliste"/>
+              <w:numPr>
+                <w:ilvl w:val="0"/>
+                <w:numId w:val="17"/>
+              </w:numPr>
+              <w:rPr>
+                <w:rFonts w:ascii="Arial" w:hAnsi="Arial" w:cs="Arial"/>
+                <w:sz w:val="22"/>
+                <w:szCs w:val="22"/>
+              </w:rPr>
+            </w:pPr>
+            <w:r>
+              <w:rPr>
+                <w:rFonts w:ascii="Arial" w:hAnsi="Arial" w:cs="Arial"/>
+                <w:sz w:val="22"/>
+                <w:szCs w:val="22"/>
+              </w:rPr>
+              <w:t>Cahier de tests</w:t>
+            </w:r>
+          </w:p>
+          <w:p>
+            <w:pPr>
+              <w:pStyle w:val="Paragraphedeliste"/>
+              <w:numPr>
+                <w:ilvl w:val="0"/>
+                <w:numId w:val="17"/>
+              </w:numPr>
+              <w:rPr>
+                <w:rFonts w:ascii="Arial" w:hAnsi="Arial" w:cs="Arial"/>
+                <w:sz w:val="22"/>
+                <w:szCs w:val="22"/>
+              </w:rPr>
+            </w:pPr>
+            <w:r>
+              <w:rPr>
+                <w:rFonts w:ascii="Arial" w:hAnsi="Arial" w:cs="Arial"/>
+                <w:sz w:val="22"/>
+                <w:szCs w:val="22"/>
+              </w:rPr>
+              <w:t>Documentation technique</w:t>
+            </w:r>
+          </w:p>
+          <w:p>
+            <w:pPr>
+              <w:pStyle w:val="Paragraphedeliste"/>
+              <w:numPr>
+                <w:ilvl w:val="0"/>
+                <w:numId w:val="17"/>
+              </w:numPr>
+              <w:rPr>
+                <w:rFonts w:ascii="Arial" w:hAnsi="Arial" w:cs="Arial"/>
+                <w:sz w:val="22"/>
+                <w:szCs w:val="22"/>
+              </w:rPr>
+            </w:pPr>
+            <w:r>
+              <w:rPr>
+                <w:rFonts w:ascii="Arial" w:hAnsi="Arial" w:cs="Arial"/>
+                <w:sz w:val="22"/>
+                <w:szCs w:val="22"/>
+              </w:rPr>
+              <w:t>Documentation utilisateur</w:t>
+            </w:r>
+          </w:p>
+          <w:p>
+            <w:pPr>
+              <w:pStyle w:val="Paragraphedeliste"/>
+              <w:numPr>
+                <w:ilvl w:val="0"/>
+                <w:numId w:val="17"/>
+              </w:numPr>
+              <w:rPr>
+                <w:rFonts w:ascii="Arial" w:hAnsi="Arial" w:cs="Arial"/>
+              </w:rPr>
+            </w:pPr>
+            <w:r>
+              <w:rPr>
+                <w:rFonts w:ascii="Arial" w:hAnsi="Arial" w:cs="Arial"/>
+                <w:sz w:val="22"/>
+                <w:szCs w:val="22"/>
+              </w:rPr>
+              <w:t>Guides d’exploitation</w:t>
+            </w:r>
           </w:p>
         </w:tc>
       </w:tr>
@@ -2120,11 +2291,11 @@
           </w:tcPr>
           <w:p>
             <w:pPr>
-              <w:snapToGrid w:val="0"/>
+              <w:pStyle w:val="Standard"/>
               <w:spacing w:line="276" w:lineRule="auto"/>
               <w:rPr>
                 <w:rFonts w:ascii="Arial" w:hAnsi="Arial" w:cs="Arial"/>
-                <w:bCs/>
+                <w:b/>
                 <w:sz w:val="20"/>
                 <w:szCs w:val="20"/>
               </w:rPr>
@@ -2136,406 +2307,761 @@
                 <w:sz w:val="20"/>
                 <w:szCs w:val="20"/>
               </w:rPr>
-              <w:t xml:space="preserve">Descriptif de la </w:t>
-            </w:r>
-            <w:r>
-              <w:rPr>
-                <w:rFonts w:ascii="Arial" w:hAnsi="Arial" w:cs="Arial"/>
-                <w:b/>
-                <w:sz w:val="20"/>
-                <w:szCs w:val="20"/>
-              </w:rPr>
-              <w:t>réalisation</w:t>
-            </w:r>
-            <w:r>
-              <w:rPr>
-                <w:rFonts w:ascii="Arial" w:hAnsi="Arial" w:cs="Arial"/>
-                <w:b/>
-                <w:sz w:val="20"/>
-                <w:szCs w:val="20"/>
-              </w:rPr>
-              <w:t xml:space="preserve"> professionnelle</w:t>
-            </w:r>
-            <w:r>
-              <w:rPr>
-                <w:rFonts w:ascii="Arial" w:hAnsi="Arial" w:cs="Arial"/>
-                <w:b/>
-                <w:sz w:val="20"/>
-                <w:szCs w:val="20"/>
-              </w:rPr>
-              <w:t>, y compris l</w:t>
-            </w:r>
-            <w:r>
-              <w:rPr>
-                <w:rFonts w:ascii="Arial" w:hAnsi="Arial" w:cs="Arial"/>
-                <w:b/>
-                <w:sz w:val="20"/>
-                <w:szCs w:val="20"/>
-              </w:rPr>
-              <w:t>es productions réalisées et schémas explicatifs</w:t>
-            </w:r>
-          </w:p>
-          <w:p>
-            <w:pPr>
-              <w:snapToGrid w:val="0"/>
-              <w:spacing w:line="276" w:lineRule="auto"/>
-              <w:rPr>
-                <w:rFonts w:ascii="Arial" w:hAnsi="Arial"/>
-                <w:bCs/>
-                <w:sz w:val="20"/>
-                <w:szCs w:val="20"/>
-              </w:rPr>
-            </w:pPr>
-            <w:r>
-              <w:rPr>
-                <w:rFonts w:ascii="Arial" w:hAnsi="Arial"/>
-                <w:bCs/>
-                <w:sz w:val="20"/>
-                <w:szCs w:val="20"/>
-              </w:rPr>
-              <w:t>Cette réalisation professionnelle a consisté en la conception et le développement d’un outil d’analyse de tickets de support en Ruby, dans le cadre de mon alternance chez SYADEM.</w:t>
-            </w:r>
-          </w:p>
-          <w:p>
-            <w:pPr>
-              <w:snapToGrid w:val="0"/>
-              <w:spacing w:line="276" w:lineRule="auto"/>
-              <w:rPr>
-                <w:rFonts w:ascii="Arial" w:hAnsi="Arial"/>
-                <w:bCs/>
-                <w:sz w:val="20"/>
-                <w:szCs w:val="20"/>
-              </w:rPr>
-            </w:pPr>
-          </w:p>
-          <w:p>
-            <w:pPr>
-              <w:snapToGrid w:val="0"/>
-              <w:spacing w:line="276" w:lineRule="auto"/>
-              <w:rPr>
-                <w:rFonts w:ascii="Arial" w:hAnsi="Arial"/>
-                <w:bCs/>
-                <w:sz w:val="20"/>
-                <w:szCs w:val="20"/>
-              </w:rPr>
-            </w:pPr>
-            <w:r>
-              <w:rPr>
-                <w:rFonts w:ascii="Arial" w:hAnsi="Arial"/>
-                <w:bCs/>
-                <w:sz w:val="20"/>
-                <w:szCs w:val="20"/>
-              </w:rPr>
-              <w:t>L’objectif était de faciliter l’exploitation d’un volume important de tickets en automatisant plusieurs étapes de traitement : importation des données depuis des exports XML, extraction des informations utiles, nettoyage et normalisation des contenus textuels, puis préparation des données pour leur analyse.</w:t>
-            </w:r>
-          </w:p>
-          <w:p>
-            <w:pPr>
-              <w:snapToGrid w:val="0"/>
-              <w:spacing w:line="276" w:lineRule="auto"/>
-              <w:rPr>
-                <w:rFonts w:ascii="Arial" w:hAnsi="Arial"/>
-                <w:bCs/>
-                <w:sz w:val="20"/>
-                <w:szCs w:val="20"/>
-              </w:rPr>
-            </w:pPr>
-          </w:p>
-          <w:p>
-            <w:pPr>
-              <w:snapToGrid w:val="0"/>
-              <w:spacing w:line="276" w:lineRule="auto"/>
-              <w:rPr>
-                <w:rFonts w:ascii="Arial" w:hAnsi="Arial"/>
-                <w:bCs/>
-                <w:sz w:val="20"/>
-                <w:szCs w:val="20"/>
-              </w:rPr>
-            </w:pPr>
-            <w:r>
-              <w:rPr>
-                <w:rFonts w:ascii="Arial" w:hAnsi="Arial"/>
-                <w:bCs/>
-                <w:sz w:val="20"/>
-                <w:szCs w:val="20"/>
-              </w:rPr>
-              <w:t>Les productions réalisées comprennent :</w:t>
-            </w:r>
-          </w:p>
-          <w:p>
-            <w:pPr>
-              <w:snapToGrid w:val="0"/>
-              <w:spacing w:line="276" w:lineRule="auto"/>
-              <w:rPr>
-                <w:rFonts w:ascii="Arial" w:hAnsi="Arial"/>
-                <w:bCs/>
-                <w:sz w:val="20"/>
-                <w:szCs w:val="20"/>
-              </w:rPr>
-            </w:pPr>
-            <w:r>
-              <w:rPr>
-                <w:rFonts w:ascii="Arial" w:hAnsi="Arial"/>
-                <w:bCs/>
-                <w:sz w:val="20"/>
-                <w:szCs w:val="20"/>
-              </w:rPr>
-              <w:t>- le développement de scripts Ruby dédiés à l’import et au traitement des tickets ;</w:t>
-            </w:r>
-          </w:p>
-          <w:p>
-            <w:pPr>
-              <w:snapToGrid w:val="0"/>
-              <w:spacing w:line="276" w:lineRule="auto"/>
-              <w:rPr>
-                <w:rFonts w:ascii="Arial" w:hAnsi="Arial"/>
-                <w:bCs/>
-                <w:sz w:val="20"/>
-                <w:szCs w:val="20"/>
-              </w:rPr>
-            </w:pPr>
-            <w:r>
-              <w:rPr>
-                <w:rFonts w:ascii="Arial" w:hAnsi="Arial"/>
-                <w:bCs/>
-                <w:sz w:val="20"/>
-                <w:szCs w:val="20"/>
-              </w:rPr>
-              <w:t>- la structuration des données extraites ;</w:t>
-            </w:r>
-          </w:p>
-          <w:p>
-            <w:pPr>
-              <w:snapToGrid w:val="0"/>
-              <w:spacing w:line="276" w:lineRule="auto"/>
-              <w:rPr>
-                <w:rFonts w:ascii="Arial" w:hAnsi="Arial"/>
-                <w:bCs/>
-                <w:sz w:val="20"/>
-                <w:szCs w:val="20"/>
-              </w:rPr>
-            </w:pPr>
-            <w:r>
-              <w:rPr>
-                <w:rFonts w:ascii="Arial" w:hAnsi="Arial"/>
-                <w:bCs/>
-                <w:sz w:val="20"/>
-                <w:szCs w:val="20"/>
-              </w:rPr>
-              <w:t>- la mise en place d’étapes de nettoyage et de normalisation ;</w:t>
-            </w:r>
-          </w:p>
-          <w:p>
-            <w:pPr>
-              <w:snapToGrid w:val="0"/>
-              <w:spacing w:line="276" w:lineRule="auto"/>
-              <w:rPr>
-                <w:rFonts w:ascii="Arial" w:hAnsi="Arial"/>
-                <w:bCs/>
-                <w:sz w:val="20"/>
-                <w:szCs w:val="20"/>
-              </w:rPr>
-            </w:pPr>
-            <w:r>
-              <w:rPr>
-                <w:rFonts w:ascii="Arial" w:hAnsi="Arial"/>
-                <w:bCs/>
-                <w:sz w:val="20"/>
-                <w:szCs w:val="20"/>
-              </w:rPr>
-              <w:t>- la préparation des données pour l’analyse et l’identification de récurrences ;</w:t>
-            </w:r>
-          </w:p>
-          <w:p>
-            <w:pPr>
-              <w:snapToGrid w:val="0"/>
-              <w:spacing w:line="276" w:lineRule="auto"/>
-              <w:rPr>
-                <w:rFonts w:ascii="Arial" w:hAnsi="Arial"/>
-                <w:bCs/>
-                <w:sz w:val="20"/>
-                <w:szCs w:val="20"/>
-              </w:rPr>
-            </w:pPr>
-            <w:r>
-              <w:rPr>
-                <w:rFonts w:ascii="Arial" w:hAnsi="Arial"/>
-                <w:bCs/>
-                <w:sz w:val="20"/>
-                <w:szCs w:val="20"/>
-              </w:rPr>
-              <w:t>- la production de résultats exploitables sous forme de regroupements, de synthèses et de statistiques.</w:t>
-            </w:r>
-          </w:p>
-          <w:p>
-            <w:pPr>
-              <w:snapToGrid w:val="0"/>
-              <w:spacing w:line="276" w:lineRule="auto"/>
-              <w:rPr>
-                <w:rFonts w:ascii="Arial" w:hAnsi="Arial"/>
-                <w:bCs/>
-                <w:sz w:val="20"/>
-                <w:szCs w:val="20"/>
-              </w:rPr>
-            </w:pPr>
-          </w:p>
-          <w:p>
-            <w:pPr>
-              <w:snapToGrid w:val="0"/>
-              <w:spacing w:line="276" w:lineRule="auto"/>
-              <w:rPr>
-                <w:rFonts w:ascii="Arial" w:hAnsi="Arial"/>
-                <w:bCs/>
-                <w:sz w:val="20"/>
-                <w:szCs w:val="20"/>
-              </w:rPr>
-            </w:pPr>
-            <w:r>
-              <w:rPr>
-                <w:rFonts w:ascii="Arial" w:hAnsi="Arial"/>
-                <w:bCs/>
-                <w:sz w:val="20"/>
-                <w:szCs w:val="20"/>
-              </w:rPr>
-              <w:t>Schéma explicatif :</w:t>
-            </w:r>
-          </w:p>
-          <w:p>
-            <w:pPr>
-              <w:snapToGrid w:val="0"/>
-              <w:spacing w:line="276" w:lineRule="auto"/>
-              <w:rPr>
-                <w:rFonts w:ascii="Arial" w:hAnsi="Arial"/>
-                <w:bCs/>
-                <w:sz w:val="20"/>
-                <w:szCs w:val="20"/>
-              </w:rPr>
-            </w:pPr>
-            <w:r>
-              <w:rPr>
-                <w:rFonts w:ascii="Arial" w:hAnsi="Arial"/>
-                <w:bCs/>
-                <w:sz w:val="20"/>
-                <w:szCs w:val="20"/>
-              </w:rPr>
-              <w:t>1. Importation des tickets</w:t>
-            </w:r>
-          </w:p>
-          <w:p>
-            <w:pPr>
-              <w:snapToGrid w:val="0"/>
-              <w:spacing w:line="276" w:lineRule="auto"/>
-              <w:rPr>
-                <w:rFonts w:ascii="Arial" w:hAnsi="Arial"/>
-                <w:bCs/>
-                <w:sz w:val="20"/>
-                <w:szCs w:val="20"/>
-              </w:rPr>
-            </w:pPr>
-            <w:r>
-              <w:rPr>
-                <w:rFonts w:ascii="Arial" w:hAnsi="Arial"/>
-                <w:bCs/>
-                <w:sz w:val="20"/>
-                <w:szCs w:val="20"/>
-              </w:rPr>
-              <w:t>2. Extraction des données</w:t>
-            </w:r>
-          </w:p>
-          <w:p>
-            <w:pPr>
-              <w:snapToGrid w:val="0"/>
-              <w:spacing w:line="276" w:lineRule="auto"/>
-              <w:rPr>
-                <w:rFonts w:ascii="Arial" w:hAnsi="Arial"/>
-                <w:bCs/>
-                <w:sz w:val="20"/>
-                <w:szCs w:val="20"/>
-              </w:rPr>
-            </w:pPr>
-            <w:r>
-              <w:rPr>
-                <w:rFonts w:ascii="Arial" w:hAnsi="Arial"/>
-                <w:bCs/>
-                <w:sz w:val="20"/>
-                <w:szCs w:val="20"/>
-              </w:rPr>
-              <w:t>3. Nettoyage et normalisation</w:t>
-            </w:r>
-          </w:p>
-          <w:p>
-            <w:pPr>
-              <w:snapToGrid w:val="0"/>
-              <w:spacing w:line="276" w:lineRule="auto"/>
-              <w:rPr>
-                <w:rFonts w:ascii="Arial" w:hAnsi="Arial"/>
-                <w:bCs/>
-                <w:sz w:val="20"/>
-                <w:szCs w:val="20"/>
-              </w:rPr>
-            </w:pPr>
-            <w:r>
-              <w:rPr>
-                <w:rFonts w:ascii="Arial" w:hAnsi="Arial"/>
-                <w:bCs/>
-                <w:sz w:val="20"/>
-                <w:szCs w:val="20"/>
-              </w:rPr>
-              <w:t>4. Analyse et regroupement</w:t>
-            </w:r>
-          </w:p>
-          <w:p>
-            <w:pPr>
-              <w:snapToGrid w:val="0"/>
-              <w:spacing w:line="276" w:lineRule="auto"/>
-              <w:rPr>
-                <w:rFonts w:ascii="Arial" w:hAnsi="Arial"/>
-                <w:bCs/>
-                <w:sz w:val="20"/>
-                <w:szCs w:val="20"/>
-              </w:rPr>
-            </w:pPr>
-            <w:r>
-              <w:rPr>
-                <w:rFonts w:ascii="Arial" w:hAnsi="Arial"/>
-                <w:bCs/>
-                <w:sz w:val="20"/>
-                <w:szCs w:val="20"/>
-              </w:rPr>
-              <w:t>5. Restitution des résultats</w:t>
-            </w:r>
-          </w:p>
-          <w:p>
-            <w:pPr>
-              <w:snapToGrid w:val="0"/>
-              <w:spacing w:line="276" w:lineRule="auto"/>
-              <w:rPr>
-                <w:rFonts w:ascii="Arial" w:hAnsi="Arial"/>
-                <w:bCs/>
-                <w:sz w:val="20"/>
-                <w:szCs w:val="20"/>
-              </w:rPr>
-            </w:pPr>
-          </w:p>
-          <w:p>
-            <w:pPr>
-              <w:snapToGrid w:val="0"/>
-              <w:spacing w:line="276" w:lineRule="auto"/>
-              <w:rPr>
-                <w:rFonts w:ascii="Arial" w:hAnsi="Arial"/>
-                <w:bCs/>
-                <w:sz w:val="20"/>
-                <w:szCs w:val="20"/>
-              </w:rPr>
-            </w:pPr>
-            <w:r>
-              <w:rPr>
-                <w:rFonts w:ascii="Arial" w:hAnsi="Arial"/>
-                <w:bCs/>
-                <w:sz w:val="20"/>
-                <w:szCs w:val="20"/>
-              </w:rPr>
-              <w:t>Cette réalisation s’inscrit dans une démarche de développement applicatif et de gestion de données, appliquée à un besoin concret en entreprise.</w:t>
+              <w:t>Descriptif de la réalisation professionnelle, y compris les productions réalisées et schémas explicatifs</w:t>
+            </w:r>
+          </w:p>
+          <w:p>
+            <w:pPr>
+              <w:rPr>
+                <w:rFonts w:ascii="Arial" w:hAnsi="Arial" w:cs="Arial"/>
+                <w:b/>
+                <w:bCs/>
+              </w:rPr>
+            </w:pPr>
+            <w:r>
+              <w:rPr>
+                <w:rFonts w:ascii="Arial" w:hAnsi="Arial" w:cs="Arial"/>
+                <w:b/>
+                <w:bCs/>
+              </w:rPr>
+              <w:t>Contexte</w:t>
+            </w:r>
+          </w:p>
+          <w:p>
+            <w:pPr>
+              <w:rPr>
+                <w:rFonts w:ascii="Arial" w:hAnsi="Arial" w:cs="Arial"/>
+                <w:sz w:val="22"/>
+                <w:szCs w:val="22"/>
+              </w:rPr>
+            </w:pPr>
+            <w:r>
+              <w:rPr>
+                <w:rFonts w:ascii="Arial" w:hAnsi="Arial" w:cs="Arial"/>
+                <w:sz w:val="22"/>
+                <w:szCs w:val="22"/>
+              </w:rPr>
+              <w:t xml:space="preserve">Cette réalisation s’inscrit dans le cadre de mon alternance au sein de </w:t>
+            </w:r>
+            <w:r>
+              <w:rPr>
+                <w:rFonts w:ascii="Arial" w:hAnsi="Arial" w:cs="Arial"/>
+                <w:b/>
+                <w:bCs/>
+                <w:sz w:val="22"/>
+                <w:szCs w:val="22"/>
+              </w:rPr>
+              <w:t>SYADEM</w:t>
+            </w:r>
+            <w:r>
+              <w:rPr>
+                <w:rFonts w:ascii="Arial" w:hAnsi="Arial" w:cs="Arial"/>
+                <w:sz w:val="22"/>
+                <w:szCs w:val="22"/>
+              </w:rPr>
+              <w:t>, éditeur de solutions logicielles dédiées à la vaccination et à la prévention. En tant que jeune développeur intégré à l’équipe de développement, ce</w:t>
+            </w:r>
+            <w:r>
+              <w:rPr>
+                <w:rFonts w:ascii="Arial" w:hAnsi="Arial" w:cs="Arial"/>
+                <w:sz w:val="22"/>
+                <w:szCs w:val="22"/>
+              </w:rPr>
+              <w:t>tte mission</w:t>
+            </w:r>
+            <w:r>
+              <w:rPr>
+                <w:rFonts w:ascii="Arial" w:hAnsi="Arial" w:cs="Arial"/>
+                <w:sz w:val="22"/>
+                <w:szCs w:val="22"/>
+              </w:rPr>
+              <w:t xml:space="preserve"> m’a été confié</w:t>
+            </w:r>
+            <w:r>
+              <w:rPr>
+                <w:rFonts w:ascii="Arial" w:hAnsi="Arial" w:cs="Arial"/>
+                <w:sz w:val="22"/>
+                <w:szCs w:val="22"/>
+              </w:rPr>
+              <w:t>e</w:t>
+            </w:r>
+            <w:r>
+              <w:rPr>
+                <w:rFonts w:ascii="Arial" w:hAnsi="Arial" w:cs="Arial"/>
+                <w:sz w:val="22"/>
+                <w:szCs w:val="22"/>
+              </w:rPr>
+              <w:t xml:space="preserve"> afin de me permettre de monter progressivement en compétences sur un besoin concret de l’entreprise.</w:t>
+            </w:r>
+            <w:r>
+              <w:rPr>
+                <w:rFonts w:ascii="Arial" w:hAnsi="Arial" w:cs="Arial"/>
+                <w:sz w:val="22"/>
+                <w:szCs w:val="22"/>
+              </w:rPr>
+              <w:br/>
+              <w:t>La mission portait sur le traitement et l’analyse d’un volume important de tickets issus de l’activité support, un domaine nécessitant rigueur, fiabilité et autonomie.</w:t>
+            </w:r>
+          </w:p>
+          <w:p>
+            <w:pPr>
+              <w:rPr>
+                <w:rFonts w:ascii="Arial" w:hAnsi="Arial" w:cs="Arial"/>
+              </w:rPr>
+            </w:pPr>
+          </w:p>
+          <w:p>
+            <w:pPr>
+              <w:rPr>
+                <w:rFonts w:ascii="Arial" w:hAnsi="Arial" w:cs="Arial"/>
+              </w:rPr>
+            </w:pPr>
+            <w:r>
+              <w:rPr>
+                <w:rFonts w:ascii="Arial" w:hAnsi="Arial" w:cs="Arial"/>
+                <w:b/>
+                <w:bCs/>
+              </w:rPr>
+              <w:t>Objectif de la réalisation</w:t>
+            </w:r>
+            <w:r>
+              <w:rPr>
+                <w:rFonts w:ascii="Arial" w:hAnsi="Arial" w:cs="Arial"/>
+              </w:rPr>
+              <w:t xml:space="preserve">  </w:t>
+            </w:r>
+          </w:p>
+          <w:p>
+            <w:pPr>
+              <w:rPr>
+                <w:rFonts w:ascii="Arial" w:hAnsi="Arial" w:cs="Arial"/>
+                <w:sz w:val="22"/>
+                <w:szCs w:val="22"/>
+              </w:rPr>
+            </w:pPr>
+            <w:r>
+              <w:rPr>
+                <w:rFonts w:ascii="Arial" w:hAnsi="Arial" w:cs="Arial"/>
+                <w:sz w:val="22"/>
+                <w:szCs w:val="22"/>
+              </w:rPr>
+              <w:t>C</w:t>
+            </w:r>
+            <w:r>
+              <w:rPr>
+                <w:rFonts w:ascii="Arial" w:hAnsi="Arial" w:cs="Arial"/>
+                <w:sz w:val="22"/>
+                <w:szCs w:val="22"/>
+              </w:rPr>
+              <w:t>oncevoir et développer un outil Ruby d’analyse de tickets permettant d’automatiser la chaîne de traitement, depuis l’import des données jusqu’à la restitution d’indicateurs utiles aux équipes support et produit.</w:t>
+            </w:r>
+          </w:p>
+          <w:p>
+            <w:pPr>
+              <w:rPr>
+                <w:rFonts w:ascii="Arial" w:hAnsi="Arial" w:cs="Arial"/>
+              </w:rPr>
+            </w:pPr>
+          </w:p>
+          <w:p>
+            <w:pPr>
+              <w:rPr>
+                <w:rFonts w:ascii="Arial" w:hAnsi="Arial" w:cs="Arial"/>
+              </w:rPr>
+            </w:pPr>
+            <w:r>
+              <w:rPr>
+                <w:rFonts w:ascii="Arial" w:hAnsi="Arial" w:cs="Arial"/>
+                <w:b/>
+                <w:bCs/>
+              </w:rPr>
+              <w:t>Méthodologie de travail mise en œuvre</w:t>
+            </w:r>
+            <w:r>
+              <w:rPr>
+                <w:rFonts w:ascii="Arial" w:hAnsi="Arial" w:cs="Arial"/>
+              </w:rPr>
+              <w:t xml:space="preserve"> </w:t>
+            </w:r>
+          </w:p>
+          <w:p>
+            <w:pPr>
+              <w:pStyle w:val="Paragraphedeliste"/>
+              <w:numPr>
+                <w:ilvl w:val="0"/>
+                <w:numId w:val="21"/>
+              </w:numPr>
+              <w:rPr>
+                <w:rFonts w:ascii="Arial" w:hAnsi="Arial" w:cs="Arial"/>
+                <w:sz w:val="22"/>
+                <w:szCs w:val="22"/>
+              </w:rPr>
+            </w:pPr>
+            <w:r>
+              <w:rPr>
+                <w:rFonts w:ascii="Arial" w:hAnsi="Arial" w:cs="Arial"/>
+                <w:sz w:val="22"/>
+                <w:szCs w:val="22"/>
+              </w:rPr>
+              <w:t>Recueil et clarification du besoin métier avec les utilisateurs ;</w:t>
+            </w:r>
+          </w:p>
+          <w:p>
+            <w:pPr>
+              <w:pStyle w:val="Paragraphedeliste"/>
+              <w:numPr>
+                <w:ilvl w:val="0"/>
+                <w:numId w:val="21"/>
+              </w:numPr>
+              <w:rPr>
+                <w:rFonts w:ascii="Arial" w:hAnsi="Arial" w:cs="Arial"/>
+                <w:sz w:val="22"/>
+                <w:szCs w:val="22"/>
+              </w:rPr>
+            </w:pPr>
+            <w:r>
+              <w:rPr>
+                <w:rFonts w:ascii="Arial" w:hAnsi="Arial" w:cs="Arial"/>
+                <w:sz w:val="22"/>
+                <w:szCs w:val="22"/>
+              </w:rPr>
+              <w:t>Découpage en modules (import, parsing, nettoyage, vectorisation, clustering, similarité, reporting) ;</w:t>
+            </w:r>
+          </w:p>
+          <w:p>
+            <w:pPr>
+              <w:pStyle w:val="Paragraphedeliste"/>
+              <w:numPr>
+                <w:ilvl w:val="0"/>
+                <w:numId w:val="21"/>
+              </w:numPr>
+              <w:rPr>
+                <w:rFonts w:ascii="Arial" w:hAnsi="Arial" w:cs="Arial"/>
+                <w:sz w:val="22"/>
+                <w:szCs w:val="22"/>
+              </w:rPr>
+            </w:pPr>
+            <w:r>
+              <w:rPr>
+                <w:rFonts w:ascii="Arial" w:hAnsi="Arial" w:cs="Arial"/>
+                <w:sz w:val="22"/>
+                <w:szCs w:val="22"/>
+              </w:rPr>
+              <w:t>Développement itératif avec tests réguliers sur des exports réels ;</w:t>
+            </w:r>
+          </w:p>
+          <w:p>
+            <w:pPr>
+              <w:pStyle w:val="Paragraphedeliste"/>
+              <w:numPr>
+                <w:ilvl w:val="0"/>
+                <w:numId w:val="21"/>
+              </w:numPr>
+              <w:rPr>
+                <w:rFonts w:ascii="Arial" w:hAnsi="Arial" w:cs="Arial"/>
+                <w:sz w:val="22"/>
+                <w:szCs w:val="22"/>
+              </w:rPr>
+            </w:pPr>
+            <w:r>
+              <w:rPr>
+                <w:rFonts w:ascii="Arial" w:hAnsi="Arial" w:cs="Arial"/>
+                <w:sz w:val="22"/>
+                <w:szCs w:val="22"/>
+              </w:rPr>
+              <w:t>Version</w:t>
+            </w:r>
+            <w:r>
+              <w:rPr>
+                <w:rFonts w:ascii="Arial" w:hAnsi="Arial" w:cs="Arial"/>
+                <w:sz w:val="22"/>
+                <w:szCs w:val="22"/>
+              </w:rPr>
+              <w:t>ing</w:t>
+            </w:r>
+            <w:r>
+              <w:rPr>
+                <w:rFonts w:ascii="Arial" w:hAnsi="Arial" w:cs="Arial"/>
+                <w:sz w:val="22"/>
+                <w:szCs w:val="22"/>
+              </w:rPr>
+              <w:t xml:space="preserve"> Git et validation progressive des résultats ;</w:t>
+            </w:r>
+          </w:p>
+          <w:p>
+            <w:pPr>
+              <w:pStyle w:val="Paragraphedeliste"/>
+              <w:numPr>
+                <w:ilvl w:val="0"/>
+                <w:numId w:val="21"/>
+              </w:numPr>
+              <w:rPr>
+                <w:rFonts w:ascii="Arial" w:hAnsi="Arial" w:cs="Arial"/>
+                <w:sz w:val="22"/>
+                <w:szCs w:val="22"/>
+              </w:rPr>
+            </w:pPr>
+            <w:r>
+              <w:rPr>
+                <w:rFonts w:ascii="Arial" w:hAnsi="Arial" w:cs="Arial"/>
+                <w:sz w:val="22"/>
+                <w:szCs w:val="22"/>
+              </w:rPr>
+              <w:t>Ajustements des paramètres d’analyse selon les retours métier.</w:t>
+            </w:r>
+          </w:p>
+          <w:p>
+            <w:pPr>
+              <w:rPr>
+                <w:rFonts w:ascii="Arial" w:hAnsi="Arial" w:cs="Arial"/>
+              </w:rPr>
+            </w:pPr>
+          </w:p>
+          <w:p>
+            <w:pPr>
+              <w:rPr>
+                <w:rFonts w:ascii="Arial" w:hAnsi="Arial" w:cs="Arial"/>
+              </w:rPr>
+            </w:pPr>
+            <w:r>
+              <w:rPr>
+                <w:rFonts w:ascii="Arial" w:hAnsi="Arial" w:cs="Arial"/>
+                <w:b/>
+                <w:bCs/>
+              </w:rPr>
+              <w:t>Architecture de la solution</w:t>
+            </w:r>
+            <w:r>
+              <w:rPr>
+                <w:rFonts w:ascii="Arial" w:hAnsi="Arial" w:cs="Arial"/>
+              </w:rPr>
+              <w:t xml:space="preserve"> </w:t>
+            </w:r>
+          </w:p>
+          <w:p>
+            <w:pPr>
+              <w:pStyle w:val="Paragraphedeliste"/>
+              <w:numPr>
+                <w:ilvl w:val="0"/>
+                <w:numId w:val="21"/>
+              </w:numPr>
+              <w:rPr>
+                <w:rFonts w:ascii="Arial" w:hAnsi="Arial" w:cs="Arial"/>
+                <w:sz w:val="22"/>
+                <w:szCs w:val="22"/>
+              </w:rPr>
+            </w:pPr>
+            <w:r>
+              <w:rPr>
+                <w:rFonts w:ascii="Arial" w:hAnsi="Arial" w:cs="Arial"/>
+                <w:sz w:val="22"/>
+                <w:szCs w:val="22"/>
+              </w:rPr>
+              <w:t>Source de données : exports de tickets Zendesk (XML) ;</w:t>
+            </w:r>
+          </w:p>
+          <w:p>
+            <w:pPr>
+              <w:pStyle w:val="Paragraphedeliste"/>
+              <w:numPr>
+                <w:ilvl w:val="0"/>
+                <w:numId w:val="21"/>
+              </w:numPr>
+              <w:rPr>
+                <w:rFonts w:ascii="Arial" w:hAnsi="Arial" w:cs="Arial"/>
+                <w:sz w:val="22"/>
+                <w:szCs w:val="22"/>
+              </w:rPr>
+            </w:pPr>
+            <w:r>
+              <w:rPr>
+                <w:rFonts w:ascii="Arial" w:hAnsi="Arial" w:cs="Arial"/>
+                <w:sz w:val="22"/>
+                <w:szCs w:val="22"/>
+              </w:rPr>
+              <w:t>Couche de traitement : scripts Ruby + Nokogiri pour l’extraction et la normalisation ;</w:t>
+            </w:r>
+          </w:p>
+          <w:p>
+            <w:pPr>
+              <w:pStyle w:val="Paragraphedeliste"/>
+              <w:numPr>
+                <w:ilvl w:val="0"/>
+                <w:numId w:val="21"/>
+              </w:numPr>
+              <w:rPr>
+                <w:rFonts w:ascii="Arial" w:hAnsi="Arial" w:cs="Arial"/>
+                <w:sz w:val="22"/>
+                <w:szCs w:val="22"/>
+              </w:rPr>
+            </w:pPr>
+            <w:r>
+              <w:rPr>
+                <w:rFonts w:ascii="Arial" w:hAnsi="Arial" w:cs="Arial"/>
+                <w:sz w:val="22"/>
+                <w:szCs w:val="22"/>
+              </w:rPr>
+              <w:t>Couche IA locale : Ollama utilisé comme API locale pour piloter les LLM servant à la vectorisation et à la génération de résumés thématiques ;</w:t>
+            </w:r>
+          </w:p>
+          <w:p>
+            <w:pPr>
+              <w:pStyle w:val="Paragraphedeliste"/>
+              <w:numPr>
+                <w:ilvl w:val="0"/>
+                <w:numId w:val="21"/>
+              </w:numPr>
+              <w:rPr>
+                <w:rFonts w:ascii="Arial" w:hAnsi="Arial" w:cs="Arial"/>
+                <w:sz w:val="22"/>
+                <w:szCs w:val="22"/>
+              </w:rPr>
+            </w:pPr>
+            <w:r>
+              <w:rPr>
+                <w:rFonts w:ascii="Arial" w:hAnsi="Arial" w:cs="Arial"/>
+                <w:sz w:val="22"/>
+                <w:szCs w:val="22"/>
+              </w:rPr>
+              <w:t>Couche analytique : clustering KMeans + calcul de similarité cosinus ;</w:t>
+            </w:r>
+          </w:p>
+          <w:p>
+            <w:pPr>
+              <w:pStyle w:val="Paragraphedeliste"/>
+              <w:numPr>
+                <w:ilvl w:val="0"/>
+                <w:numId w:val="21"/>
+              </w:numPr>
+              <w:rPr>
+                <w:rFonts w:ascii="Arial" w:hAnsi="Arial" w:cs="Arial"/>
+                <w:sz w:val="22"/>
+                <w:szCs w:val="22"/>
+              </w:rPr>
+            </w:pPr>
+            <w:r>
+              <w:rPr>
+                <w:rFonts w:ascii="Arial" w:hAnsi="Arial" w:cs="Arial"/>
+                <w:sz w:val="22"/>
+                <w:szCs w:val="22"/>
+              </w:rPr>
+              <w:t>Couche de restitution : fichiers de synthèse et rapports exploitables par les équipes.</w:t>
+            </w:r>
+          </w:p>
+          <w:p>
+            <w:pPr>
+              <w:rPr>
+                <w:rFonts w:ascii="Arial" w:hAnsi="Arial" w:cs="Arial"/>
+              </w:rPr>
+            </w:pPr>
+          </w:p>
+          <w:p>
+            <w:pPr>
+              <w:rPr>
+                <w:rFonts w:ascii="Arial" w:hAnsi="Arial" w:cs="Arial"/>
+              </w:rPr>
+            </w:pPr>
+            <w:r>
+              <w:rPr>
+                <w:rFonts w:ascii="Arial" w:hAnsi="Arial" w:cs="Arial"/>
+                <w:b/>
+                <w:bCs/>
+              </w:rPr>
+              <w:t>Modalités de déploiement</w:t>
+            </w:r>
+            <w:r>
+              <w:rPr>
+                <w:rFonts w:ascii="Arial" w:hAnsi="Arial" w:cs="Arial"/>
+              </w:rPr>
+              <w:t xml:space="preserve"> </w:t>
+            </w:r>
+          </w:p>
+          <w:p>
+            <w:pPr>
+              <w:rPr>
+                <w:rFonts w:ascii="Arial" w:hAnsi="Arial" w:cs="Arial"/>
+                <w:sz w:val="22"/>
+                <w:szCs w:val="22"/>
+              </w:rPr>
+            </w:pPr>
+            <w:r>
+              <w:rPr>
+                <w:rFonts w:ascii="Arial" w:hAnsi="Arial" w:cs="Arial"/>
+                <w:sz w:val="22"/>
+                <w:szCs w:val="22"/>
+              </w:rPr>
+              <w:t>La solution est exécutée en environnement local/interne, avec une configuration centralisée (variables d’environnement), des scripts versionnés et des sorties intermédiaires conservées pour audit et comparaison des exécutions.</w:t>
+            </w:r>
+          </w:p>
+          <w:p>
+            <w:pPr>
+              <w:rPr>
+                <w:rFonts w:ascii="Arial" w:hAnsi="Arial" w:cs="Arial"/>
+              </w:rPr>
+            </w:pPr>
+          </w:p>
+          <w:p>
+            <w:pPr>
+              <w:rPr>
+                <w:rFonts w:ascii="Arial" w:hAnsi="Arial" w:cs="Arial"/>
+              </w:rPr>
+            </w:pPr>
+            <w:r>
+              <w:rPr>
+                <w:rFonts w:ascii="Arial" w:hAnsi="Arial" w:cs="Arial"/>
+                <w:b/>
+                <w:bCs/>
+              </w:rPr>
+              <w:t>Productions réalisées</w:t>
+            </w:r>
+            <w:r>
+              <w:rPr>
+                <w:rFonts w:ascii="Arial" w:hAnsi="Arial" w:cs="Arial"/>
+              </w:rPr>
+              <w:t xml:space="preserve"> :</w:t>
+            </w:r>
+          </w:p>
+          <w:p>
+            <w:pPr>
+              <w:pStyle w:val="Paragraphedeliste"/>
+              <w:numPr>
+                <w:ilvl w:val="0"/>
+                <w:numId w:val="24"/>
+              </w:numPr>
+              <w:rPr>
+                <w:rFonts w:ascii="Arial" w:hAnsi="Arial" w:cs="Arial"/>
+                <w:sz w:val="22"/>
+                <w:szCs w:val="22"/>
+              </w:rPr>
+            </w:pPr>
+            <w:r>
+              <w:rPr>
+                <w:rFonts w:ascii="Arial" w:hAnsi="Arial" w:cs="Arial"/>
+                <w:sz w:val="22"/>
+                <w:szCs w:val="22"/>
+              </w:rPr>
+              <w:t>Développement du pipeline complet d’analyse des tickets ;</w:t>
+            </w:r>
+          </w:p>
+          <w:p>
+            <w:pPr>
+              <w:pStyle w:val="Paragraphedeliste"/>
+              <w:numPr>
+                <w:ilvl w:val="0"/>
+                <w:numId w:val="24"/>
+              </w:numPr>
+              <w:rPr>
+                <w:rFonts w:ascii="Arial" w:hAnsi="Arial" w:cs="Arial"/>
+                <w:sz w:val="22"/>
+                <w:szCs w:val="22"/>
+              </w:rPr>
+            </w:pPr>
+            <w:r>
+              <w:rPr>
+                <w:rFonts w:ascii="Arial" w:hAnsi="Arial" w:cs="Arial"/>
+                <w:sz w:val="22"/>
+                <w:szCs w:val="22"/>
+              </w:rPr>
+              <w:t>Structuration et normalisation des données textuelles ;</w:t>
+            </w:r>
+          </w:p>
+          <w:p>
+            <w:pPr>
+              <w:pStyle w:val="Paragraphedeliste"/>
+              <w:numPr>
+                <w:ilvl w:val="0"/>
+                <w:numId w:val="24"/>
+              </w:numPr>
+              <w:rPr>
+                <w:rFonts w:ascii="Arial" w:hAnsi="Arial" w:cs="Arial"/>
+                <w:sz w:val="22"/>
+                <w:szCs w:val="22"/>
+              </w:rPr>
+            </w:pPr>
+            <w:r>
+              <w:rPr>
+                <w:rFonts w:ascii="Arial" w:hAnsi="Arial" w:cs="Arial"/>
+                <w:sz w:val="22"/>
+                <w:szCs w:val="22"/>
+              </w:rPr>
+              <w:t>Mise en place des traitements IA/clusterisation ;</w:t>
+            </w:r>
+          </w:p>
+          <w:p>
+            <w:pPr>
+              <w:pStyle w:val="Paragraphedeliste"/>
+              <w:numPr>
+                <w:ilvl w:val="0"/>
+                <w:numId w:val="24"/>
+              </w:numPr>
+              <w:rPr>
+                <w:rFonts w:ascii="Arial" w:hAnsi="Arial" w:cs="Arial"/>
+                <w:sz w:val="22"/>
+                <w:szCs w:val="22"/>
+              </w:rPr>
+            </w:pPr>
+            <w:r>
+              <w:rPr>
+                <w:rFonts w:ascii="Arial" w:hAnsi="Arial" w:cs="Arial"/>
+                <w:sz w:val="22"/>
+                <w:szCs w:val="22"/>
+              </w:rPr>
+              <w:t>Génération de livrables de synthèse (groupements, statistiques, éléments d’aide à la décision).</w:t>
+            </w:r>
+          </w:p>
+          <w:p>
+            <w:pPr>
+              <w:rPr>
+                <w:rFonts w:ascii="Arial" w:hAnsi="Arial" w:cs="Arial"/>
+              </w:rPr>
+            </w:pPr>
+          </w:p>
+          <w:p>
+            <w:pPr>
+              <w:rPr>
+                <w:rFonts w:ascii="Arial" w:hAnsi="Arial" w:cs="Arial"/>
+              </w:rPr>
+            </w:pPr>
+            <w:r>
+              <w:rPr>
+                <w:rFonts w:ascii="Arial" w:hAnsi="Arial" w:cs="Arial"/>
+                <w:b/>
+                <w:bCs/>
+              </w:rPr>
+              <w:t>Schéma explicatif du flux</w:t>
+            </w:r>
+            <w:r>
+              <w:rPr>
+                <w:rFonts w:ascii="Arial" w:hAnsi="Arial" w:cs="Arial"/>
+              </w:rPr>
+              <w:t xml:space="preserve"> :</w:t>
+            </w:r>
+          </w:p>
+          <w:p>
+            <w:pPr>
+              <w:pStyle w:val="Paragraphedeliste"/>
+              <w:numPr>
+                <w:ilvl w:val="0"/>
+                <w:numId w:val="28"/>
+              </w:numPr>
+              <w:rPr>
+                <w:rFonts w:ascii="Arial" w:hAnsi="Arial" w:cs="Arial"/>
+                <w:sz w:val="22"/>
+                <w:szCs w:val="22"/>
+              </w:rPr>
+            </w:pPr>
+            <w:r>
+              <w:rPr>
+                <w:rFonts w:ascii="Arial" w:hAnsi="Arial" w:cs="Arial"/>
+                <w:sz w:val="22"/>
+                <w:szCs w:val="22"/>
+              </w:rPr>
+              <w:t>Importation des tickets</w:t>
+            </w:r>
+          </w:p>
+          <w:p>
+            <w:pPr>
+              <w:pStyle w:val="Paragraphedeliste"/>
+              <w:numPr>
+                <w:ilvl w:val="0"/>
+                <w:numId w:val="28"/>
+              </w:numPr>
+              <w:rPr>
+                <w:rFonts w:ascii="Arial" w:hAnsi="Arial" w:cs="Arial"/>
+                <w:sz w:val="22"/>
+                <w:szCs w:val="22"/>
+              </w:rPr>
+            </w:pPr>
+            <w:r>
+              <w:rPr>
+                <w:rFonts w:ascii="Arial" w:hAnsi="Arial" w:cs="Arial"/>
+                <w:sz w:val="22"/>
+                <w:szCs w:val="22"/>
+              </w:rPr>
+              <w:t>Extraction des données</w:t>
+            </w:r>
+          </w:p>
+          <w:p>
+            <w:pPr>
+              <w:pStyle w:val="Paragraphedeliste"/>
+              <w:numPr>
+                <w:ilvl w:val="0"/>
+                <w:numId w:val="28"/>
+              </w:numPr>
+              <w:rPr>
+                <w:rFonts w:ascii="Arial" w:hAnsi="Arial" w:cs="Arial"/>
+                <w:sz w:val="22"/>
+                <w:szCs w:val="22"/>
+              </w:rPr>
+            </w:pPr>
+            <w:r>
+              <w:rPr>
+                <w:rFonts w:ascii="Arial" w:hAnsi="Arial" w:cs="Arial"/>
+                <w:sz w:val="22"/>
+                <w:szCs w:val="22"/>
+              </w:rPr>
+              <w:t>Nettoyage / normalisation</w:t>
+            </w:r>
+          </w:p>
+          <w:p>
+            <w:pPr>
+              <w:pStyle w:val="Paragraphedeliste"/>
+              <w:numPr>
+                <w:ilvl w:val="0"/>
+                <w:numId w:val="28"/>
+              </w:numPr>
+              <w:rPr>
+                <w:rFonts w:ascii="Arial" w:hAnsi="Arial" w:cs="Arial"/>
+                <w:sz w:val="22"/>
+                <w:szCs w:val="22"/>
+              </w:rPr>
+            </w:pPr>
+            <w:r>
+              <w:rPr>
+                <w:rFonts w:ascii="Arial" w:hAnsi="Arial" w:cs="Arial"/>
+                <w:sz w:val="22"/>
+                <w:szCs w:val="22"/>
+              </w:rPr>
+              <w:t>Vectorisation</w:t>
+            </w:r>
+          </w:p>
+          <w:p>
+            <w:pPr>
+              <w:pStyle w:val="Paragraphedeliste"/>
+              <w:numPr>
+                <w:ilvl w:val="0"/>
+                <w:numId w:val="28"/>
+              </w:numPr>
+              <w:rPr>
+                <w:rFonts w:ascii="Arial" w:hAnsi="Arial" w:cs="Arial"/>
+                <w:sz w:val="22"/>
+                <w:szCs w:val="22"/>
+              </w:rPr>
+            </w:pPr>
+            <w:r>
+              <w:rPr>
+                <w:rFonts w:ascii="Arial" w:hAnsi="Arial" w:cs="Arial"/>
+                <w:sz w:val="22"/>
+                <w:szCs w:val="22"/>
+              </w:rPr>
+              <w:t>Clustering et similarité</w:t>
+            </w:r>
+          </w:p>
+          <w:p>
+            <w:pPr>
+              <w:pStyle w:val="Paragraphedeliste"/>
+              <w:numPr>
+                <w:ilvl w:val="0"/>
+                <w:numId w:val="28"/>
+              </w:numPr>
+            </w:pPr>
+            <w:r>
+              <w:rPr>
+                <w:rFonts w:ascii="Arial" w:hAnsi="Arial" w:cs="Arial"/>
+                <w:sz w:val="22"/>
+                <w:szCs w:val="22"/>
+              </w:rPr>
+              <w:t>6. Résumés thématiques et restitution des résultats</w:t>
             </w:r>
           </w:p>
         </w:tc>
@@ -2745,342 +3271,461 @@
       </w:r>
     </w:p>
   </w:footnote>
-  <w:footnote w:id="2">
-    <w:p>
-      <w:pPr>
-        <w:pStyle w:val="Notedebasdepage"/>
-        <w:rPr>
-          <w:rFonts w:ascii="Arial" w:hAnsi="Arial" w:cs="Arial"/>
-          <w:sz w:val="16"/>
-          <w:szCs w:val="16"/>
-        </w:rPr>
-      </w:pPr>
-      <w:r>
-        <w:rPr>
-          <w:rStyle w:val="Appelnotedebasdep"/>
-        </w:rPr>
-        <w:footnoteRef/>
-      </w:r>
-      <w:r>
-        <w:rPr>
-          <w:rFonts w:ascii="Arial" w:hAnsi="Arial" w:cs="Arial"/>
-          <w:sz w:val="16"/>
-          <w:szCs w:val="16"/>
-        </w:rPr>
-        <w:t xml:space="preserve"> </w:t>
-      </w:r>
-      <w:r>
-        <w:rPr>
-          <w:rFonts w:ascii="Arial" w:hAnsi="Arial" w:cs="Arial"/>
-          <w:sz w:val="16"/>
-          <w:szCs w:val="16"/>
-        </w:rPr>
-        <w:t>Les réalisations professionnelles sont</w:t>
-      </w:r>
-      <w:r>
-        <w:rPr>
-          <w:rFonts w:ascii="Arial" w:hAnsi="Arial" w:cs="Arial"/>
-          <w:sz w:val="16"/>
-          <w:szCs w:val="16"/>
-        </w:rPr>
-        <w:t xml:space="preserve"> élaborées dans un environnement technologique conforme à l’annexe II.E</w:t>
-      </w:r>
-      <w:r>
-        <w:rPr>
-          <w:rFonts w:ascii="Arial" w:hAnsi="Arial" w:cs="Arial"/>
-          <w:sz w:val="16"/>
-          <w:szCs w:val="16"/>
-        </w:rPr>
-        <w:t xml:space="preserve"> du </w:t>
-      </w:r>
-      <w:r>
-        <w:rPr>
-          <w:rFonts w:ascii="Arial" w:hAnsi="Arial"/>
-          <w:sz w:val="16"/>
-          <w:szCs w:val="22"/>
-        </w:rPr>
-        <w:t>référentiel du BTS SIO</w:t>
-      </w:r>
-      <w:r>
-        <w:rPr>
-          <w:rFonts w:ascii="Arial" w:hAnsi="Arial"/>
-          <w:sz w:val="16"/>
-          <w:szCs w:val="22"/>
-        </w:rPr>
-        <w:t>.</w:t>
-      </w:r>
-    </w:p>
-  </w:footnote>
-  <w:footnote w:id="3">
-    <w:p>
-      <w:pPr>
-        <w:suppressAutoHyphens w:val="0"/>
-        <w:autoSpaceDE w:val="0"/>
-        <w:autoSpaceDN w:val="0"/>
-        <w:adjustRightInd w:val="0"/>
-        <w:jc w:val="both"/>
-        <w:rPr>
-          <w:rFonts w:ascii="Arial" w:hAnsi="Arial"/>
-          <w:sz w:val="18"/>
-          <w:szCs w:val="22"/>
-        </w:rPr>
-      </w:pPr>
-      <w:r>
-        <w:rPr>
-          <w:rStyle w:val="Appelnotedebasdep"/>
-          <w:rFonts w:ascii="Arial" w:hAnsi="Arial"/>
-          <w:sz w:val="18"/>
-        </w:rPr>
-        <w:footnoteRef/>
-      </w:r>
-      <w:r>
-        <w:rPr>
-          <w:rFonts w:ascii="Arial" w:hAnsi="Arial"/>
-          <w:sz w:val="18"/>
-        </w:rPr>
-        <w:t xml:space="preserve"> </w:t>
-      </w:r>
-      <w:r>
-        <w:rPr>
-          <w:rFonts w:ascii="Arial" w:hAnsi="Arial"/>
-          <w:sz w:val="16"/>
-          <w:szCs w:val="22"/>
-        </w:rPr>
-        <w:t>Conformément au référentiel du BTS SIO « </w:t>
-      </w:r>
-      <w:r>
-        <w:rPr>
-          <w:rFonts w:ascii="Arial" w:hAnsi="Arial"/>
-          <w:i/>
-          <w:iCs/>
-          <w:sz w:val="16"/>
-          <w:szCs w:val="22"/>
-        </w:rPr>
-        <w:t>Dans tous les cas, les candidats doivent se munir des outils et ressources techniques nécessaires au déroulement de l’épreuve. Ils sont seuls responsables de la disponibilité et de la mise en œuvre de ces outils et ressources. La circulaire nationale d’organisation précise les conditions matérielles de déroulement des interrogations et les pénalités à appliquer aux candidats qui ne se seraient pas munis des éléments nécessaires au déroulement de l’épreuve.</w:t>
-      </w:r>
-      <w:r>
-        <w:rPr>
-          <w:rFonts w:ascii="Arial" w:hAnsi="Arial"/>
-          <w:sz w:val="16"/>
-          <w:szCs w:val="22"/>
-        </w:rPr>
-        <w:t xml:space="preserve"> ». Les éléments peuvent être un </w:t>
-      </w:r>
-      <w:r>
-        <w:rPr>
-          <w:rFonts w:ascii="Arial" w:hAnsi="Arial"/>
-          <w:sz w:val="16"/>
-          <w:szCs w:val="22"/>
-        </w:rPr>
-        <w:t xml:space="preserve">identifiant, </w:t>
-      </w:r>
-      <w:r>
-        <w:rPr>
-          <w:rFonts w:ascii="Arial" w:hAnsi="Arial"/>
-          <w:sz w:val="16"/>
-          <w:szCs w:val="22"/>
-        </w:rPr>
-        <w:t xml:space="preserve">un </w:t>
-      </w:r>
-      <w:r>
-        <w:rPr>
-          <w:rFonts w:ascii="Arial" w:hAnsi="Arial"/>
-          <w:sz w:val="16"/>
-          <w:szCs w:val="22"/>
-        </w:rPr>
-        <w:t xml:space="preserve">mot de passe, </w:t>
-      </w:r>
-      <w:r>
-        <w:rPr>
-          <w:rFonts w:ascii="Arial" w:hAnsi="Arial"/>
-          <w:sz w:val="16"/>
-          <w:szCs w:val="22"/>
-        </w:rPr>
-        <w:t xml:space="preserve">une </w:t>
-      </w:r>
-      <w:r>
-        <w:rPr>
-          <w:rFonts w:ascii="Arial" w:hAnsi="Arial"/>
-          <w:sz w:val="16"/>
-          <w:szCs w:val="22"/>
-        </w:rPr>
-        <w:t>adresse réticulaire (URL) d’un espace de stockage et de la présentation de l’organisation du stockage.</w:t>
-      </w:r>
-    </w:p>
-  </w:footnote>
-  <w:footnote w:id="4">
-    <w:p>
-      <w:pPr>
-        <w:suppressAutoHyphens w:val="0"/>
-        <w:autoSpaceDE w:val="0"/>
-        <w:autoSpaceDN w:val="0"/>
-        <w:adjustRightInd w:val="0"/>
-        <w:jc w:val="both"/>
-        <w:rPr>
-          <w:rFonts w:ascii="Arial" w:hAnsi="Arial"/>
-          <w:sz w:val="18"/>
-          <w:szCs w:val="22"/>
-        </w:rPr>
-      </w:pPr>
-      <w:r>
-        <w:rPr>
-          <w:rStyle w:val="Appelnotedebasdep"/>
-          <w:rFonts w:ascii="Arial" w:hAnsi="Arial"/>
-          <w:sz w:val="18"/>
-        </w:rPr>
-        <w:footnoteRef/>
-      </w:r>
-      <w:r>
-        <w:rPr>
-          <w:rFonts w:ascii="Arial" w:hAnsi="Arial"/>
-          <w:sz w:val="18"/>
-        </w:rPr>
-        <w:t xml:space="preserve"> </w:t>
-      </w:r>
-      <w:r>
-        <w:rPr>
-          <w:rFonts w:ascii="Arial" w:hAnsi="Arial"/>
-          <w:sz w:val="16"/>
-          <w:szCs w:val="22"/>
-        </w:rPr>
-        <w:t xml:space="preserve">Lien vers </w:t>
-      </w:r>
-      <w:r>
-        <w:rPr>
-          <w:rFonts w:ascii="Arial" w:hAnsi="Arial"/>
-          <w:sz w:val="16"/>
-          <w:szCs w:val="22"/>
-        </w:rPr>
-        <w:t>la documentation</w:t>
-      </w:r>
-      <w:r>
-        <w:rPr>
-          <w:rFonts w:ascii="Arial" w:hAnsi="Arial"/>
-          <w:sz w:val="16"/>
-          <w:szCs w:val="22"/>
-        </w:rPr>
-        <w:t xml:space="preserve"> </w:t>
-      </w:r>
-      <w:r>
-        <w:rPr>
-          <w:rFonts w:ascii="Arial" w:hAnsi="Arial"/>
-          <w:sz w:val="16"/>
-          <w:szCs w:val="22"/>
-        </w:rPr>
-        <w:t xml:space="preserve">complète, précisant et </w:t>
-      </w:r>
-      <w:r>
-        <w:rPr>
-          <w:rFonts w:ascii="Arial" w:hAnsi="Arial"/>
-          <w:sz w:val="16"/>
-          <w:szCs w:val="22"/>
-        </w:rPr>
-        <w:t>décrivant</w:t>
-      </w:r>
-      <w:r>
-        <w:rPr>
-          <w:rFonts w:ascii="Arial" w:hAnsi="Arial"/>
-          <w:sz w:val="16"/>
-          <w:szCs w:val="22"/>
-        </w:rPr>
-        <w:t>, si cela n’a été fait au verso de la fiche,</w:t>
-      </w:r>
-      <w:r>
-        <w:rPr>
-          <w:rFonts w:ascii="Arial" w:hAnsi="Arial"/>
-          <w:sz w:val="16"/>
-          <w:szCs w:val="22"/>
-        </w:rPr>
-        <w:t xml:space="preserve"> la </w:t>
-      </w:r>
-      <w:r>
-        <w:rPr>
-          <w:rFonts w:ascii="Arial" w:hAnsi="Arial"/>
-          <w:sz w:val="16"/>
-          <w:szCs w:val="22"/>
-        </w:rPr>
-        <w:t>réalisation</w:t>
-      </w:r>
-      <w:r>
-        <w:rPr>
-          <w:rFonts w:ascii="Arial" w:hAnsi="Arial"/>
-          <w:sz w:val="16"/>
-          <w:szCs w:val="22"/>
-        </w:rPr>
-        <w:t xml:space="preserve"> professionnelle, </w:t>
-      </w:r>
-      <w:r>
-        <w:rPr>
-          <w:rFonts w:ascii="Arial" w:hAnsi="Arial"/>
-          <w:sz w:val="16"/>
-          <w:szCs w:val="22"/>
-        </w:rPr>
-        <w:t>par exemple</w:t>
-      </w:r>
-      <w:r>
-        <w:rPr>
-          <w:rFonts w:ascii="Arial" w:hAnsi="Arial"/>
-          <w:sz w:val="16"/>
-          <w:szCs w:val="22"/>
-        </w:rPr>
-        <w:t>s</w:t>
-      </w:r>
-      <w:r>
-        <w:rPr>
-          <w:rFonts w:ascii="Arial" w:hAnsi="Arial"/>
-          <w:sz w:val="16"/>
-          <w:szCs w:val="22"/>
-        </w:rPr>
-        <w:t xml:space="preserve"> service fourni par la </w:t>
-      </w:r>
-      <w:r>
-        <w:rPr>
-          <w:rFonts w:ascii="Arial" w:hAnsi="Arial"/>
-          <w:sz w:val="16"/>
-          <w:szCs w:val="22"/>
-        </w:rPr>
-        <w:t>réalisation</w:t>
-      </w:r>
-      <w:r>
-        <w:rPr>
-          <w:rFonts w:ascii="Arial" w:hAnsi="Arial"/>
-          <w:sz w:val="16"/>
-          <w:szCs w:val="22"/>
-        </w:rPr>
-        <w:t>, interfaces utilisateurs, description des classes</w:t>
-      </w:r>
-      <w:r>
-        <w:rPr>
-          <w:rFonts w:ascii="Arial" w:hAnsi="Arial"/>
-          <w:sz w:val="16"/>
-          <w:szCs w:val="22"/>
-        </w:rPr>
-        <w:t xml:space="preserve"> ou</w:t>
-      </w:r>
-      <w:r>
-        <w:rPr>
-          <w:rFonts w:ascii="Arial" w:hAnsi="Arial"/>
-          <w:sz w:val="16"/>
-          <w:szCs w:val="22"/>
-        </w:rPr>
-        <w:t xml:space="preserve"> de la base de données</w:t>
-      </w:r>
-      <w:r>
-        <w:rPr>
-          <w:rFonts w:ascii="Arial" w:hAnsi="Arial"/>
-          <w:sz w:val="16"/>
-          <w:szCs w:val="22"/>
-        </w:rPr>
-        <w:t>.</w:t>
-      </w:r>
-    </w:p>
-  </w:footnote>
 </w:footnotes>
 </file>
 
 <file path=word/numbering.xml><?xml version="1.0" encoding="utf-8"?>
 <w:numbering xmlns:wpc="http://schemas.microsoft.com/office/word/2010/wordprocessingCanvas" xmlns:cx="http://schemas.microsoft.com/office/drawing/2014/chartex" xmlns:cx1="http://schemas.microsoft.com/office/drawing/2015/9/8/chartex" xmlns:cx2="http://schemas.microsoft.com/office/drawing/2015/10/21/chartex" xmlns:cx3="http://schemas.microsoft.com/office/drawing/2016/5/9/chartex" xmlns:cx4="http://schemas.microsoft.com/office/drawing/2016/5/10/chartex" xmlns:cx5="http://schemas.microsoft.com/office/drawing/2016/5/11/chartex" xmlns:cx6="http://schemas.microsoft.com/office/drawing/2016/5/12/chartex" xmlns:cx7="http://schemas.microsoft.com/office/drawing/2016/5/13/chartex" xmlns:cx8="http://schemas.microsoft.com/office/drawing/2016/5/14/chartex" xmlns:mc="http://schemas.openxmlformats.org/markup-compatibility/2006" xmlns:aink="http://schemas.microsoft.com/office/drawing/2016/ink" xmlns:am3d="http://schemas.microsoft.com/office/drawing/2017/model3d" xmlns:o="urn:schemas-microsoft-com:office:office" xmlns:oel="http://schemas.microsoft.com/office/2019/extlst" xmlns:r="http://schemas.openxmlformats.org/officeDocument/2006/relationships" xmlns:m="http://schemas.openxmlformats.org/officeDocument/2006/math" xmlns:v="urn:schemas-microsoft-com:vml" xmlns:wp14="http://schemas.microsoft.com/office/word/2010/wordprocessingDrawing" xmlns:wp="http://schemas.openxmlformats.org/drawingml/2006/wordprocessingDrawing" xmlns:w10="urn:schemas-microsoft-com:office:word" xmlns:w="http://schemas.openxmlformats.org/wordprocessingml/2006/main" xmlns:w14="http://schemas.microsoft.com/office/word/2010/wordml" xmlns:w15="http://schemas.microsoft.com/office/word/2012/wordml" xmlns:w16cex="http://schemas.microsoft.com/office/word/2018/wordml/cex" xmlns:w16cid="http://schemas.microsoft.com/office/word/2016/wordml/cid" xmlns:w16="http://schemas.microsoft.com/office/word/2018/wordml" xmlns:w16du="http://schemas.microsoft.com/office/word/2023/wordml/word16du" xmlns:w16sdtdh="http://schemas.microsoft.com/office/word/2020/wordml/sdtdatahash" xmlns:w16sdtfl="http://schemas.microsoft.com/office/word/2024/wordml/sdtformatlock" xmlns:w16se="http://schemas.microsoft.com/office/word/2015/wordml/symex" xmlns:wpg="http://schemas.microsoft.com/office/word/2010/wordprocessingGroup" xmlns:wpi="http://schemas.microsoft.com/office/word/2010/wordprocessingInk" xmlns:wne="http://schemas.microsoft.com/office/word/2006/wordml" xmlns:wps="http://schemas.microsoft.com/office/word/2010/wordprocessingShape" mc:Ignorable="w14 w15 w16se w16cid w16 w16cex w16sdtdh w16sdtfl w16du wp14">
   <w:abstractNum w:abstractNumId="0" w15:restartNumberingAfterBreak="0">
+    <w:nsid w:val="002940A4"/>
+    <w:multiLevelType w:val="hybridMultilevel"/>
+    <w:tmpl w:val="336ADEB4"/>
+    <w:lvl w:ilvl="0" w:tplc="040C0001">
+      <w:start w:val="1"/>
+      <w:numFmt w:val="bullet"/>
+      <w:lvlText w:val=""/>
+      <w:lvlJc w:val="left"/>
+      <w:pPr>
+        <w:ind w:left="720" w:hanging="360"/>
+      </w:pPr>
+      <w:rPr>
+        <w:rFonts w:ascii="Symbol" w:hAnsi="Symbol" w:hint="default"/>
+      </w:rPr>
+    </w:lvl>
+    <w:lvl w:ilvl="1" w:tplc="040C0003" w:tentative="1">
+      <w:start w:val="1"/>
+      <w:numFmt w:val="bullet"/>
+      <w:lvlText w:val="o"/>
+      <w:lvlJc w:val="left"/>
+      <w:pPr>
+        <w:ind w:left="1440" w:hanging="360"/>
+      </w:pPr>
+      <w:rPr>
+        <w:rFonts w:ascii="Courier New" w:hAnsi="Courier New" w:cs="Courier New" w:hint="default"/>
+      </w:rPr>
+    </w:lvl>
+    <w:lvl w:ilvl="2" w:tplc="040C0005" w:tentative="1">
+      <w:start w:val="1"/>
+      <w:numFmt w:val="bullet"/>
+      <w:lvlText w:val=""/>
+      <w:lvlJc w:val="left"/>
+      <w:pPr>
+        <w:ind w:left="2160" w:hanging="360"/>
+      </w:pPr>
+      <w:rPr>
+        <w:rFonts w:ascii="Wingdings" w:hAnsi="Wingdings" w:hint="default"/>
+      </w:rPr>
+    </w:lvl>
+    <w:lvl w:ilvl="3" w:tplc="040C0001" w:tentative="1">
+      <w:start w:val="1"/>
+      <w:numFmt w:val="bullet"/>
+      <w:lvlText w:val=""/>
+      <w:lvlJc w:val="left"/>
+      <w:pPr>
+        <w:ind w:left="2880" w:hanging="360"/>
+      </w:pPr>
+      <w:rPr>
+        <w:rFonts w:ascii="Symbol" w:hAnsi="Symbol" w:hint="default"/>
+      </w:rPr>
+    </w:lvl>
+    <w:lvl w:ilvl="4" w:tplc="040C0003" w:tentative="1">
+      <w:start w:val="1"/>
+      <w:numFmt w:val="bullet"/>
+      <w:lvlText w:val="o"/>
+      <w:lvlJc w:val="left"/>
+      <w:pPr>
+        <w:ind w:left="3600" w:hanging="360"/>
+      </w:pPr>
+      <w:rPr>
+        <w:rFonts w:ascii="Courier New" w:hAnsi="Courier New" w:cs="Courier New" w:hint="default"/>
+      </w:rPr>
+    </w:lvl>
+    <w:lvl w:ilvl="5" w:tplc="040C0005" w:tentative="1">
+      <w:start w:val="1"/>
+      <w:numFmt w:val="bullet"/>
+      <w:lvlText w:val=""/>
+      <w:lvlJc w:val="left"/>
+      <w:pPr>
+        <w:ind w:left="4320" w:hanging="360"/>
+      </w:pPr>
+      <w:rPr>
+        <w:rFonts w:ascii="Wingdings" w:hAnsi="Wingdings" w:hint="default"/>
+      </w:rPr>
+    </w:lvl>
+    <w:lvl w:ilvl="6" w:tplc="040C0001" w:tentative="1">
+      <w:start w:val="1"/>
+      <w:numFmt w:val="bullet"/>
+      <w:lvlText w:val=""/>
+      <w:lvlJc w:val="left"/>
+      <w:pPr>
+        <w:ind w:left="5040" w:hanging="360"/>
+      </w:pPr>
+      <w:rPr>
+        <w:rFonts w:ascii="Symbol" w:hAnsi="Symbol" w:hint="default"/>
+      </w:rPr>
+    </w:lvl>
+    <w:lvl w:ilvl="7" w:tplc="040C0003" w:tentative="1">
+      <w:start w:val="1"/>
+      <w:numFmt w:val="bullet"/>
+      <w:lvlText w:val="o"/>
+      <w:lvlJc w:val="left"/>
+      <w:pPr>
+        <w:ind w:left="5760" w:hanging="360"/>
+      </w:pPr>
+      <w:rPr>
+        <w:rFonts w:ascii="Courier New" w:hAnsi="Courier New" w:cs="Courier New" w:hint="default"/>
+      </w:rPr>
+    </w:lvl>
+    <w:lvl w:ilvl="8" w:tplc="040C0005" w:tentative="1">
+      <w:start w:val="1"/>
+      <w:numFmt w:val="bullet"/>
+      <w:lvlText w:val=""/>
+      <w:lvlJc w:val="left"/>
+      <w:pPr>
+        <w:ind w:left="6480" w:hanging="360"/>
+      </w:pPr>
+      <w:rPr>
+        <w:rFonts w:ascii="Wingdings" w:hAnsi="Wingdings" w:hint="default"/>
+      </w:rPr>
+    </w:lvl>
+  </w:abstractNum>
+  <w:abstractNum w:abstractNumId="1" w15:restartNumberingAfterBreak="0">
+    <w:nsid w:val="01681C37"/>
+    <w:multiLevelType w:val="hybridMultilevel"/>
+    <w:tmpl w:val="DCF668A0"/>
+    <w:lvl w:ilvl="0" w:tplc="B05AF544">
+      <w:numFmt w:val="bullet"/>
+      <w:lvlText w:val="-"/>
+      <w:lvlJc w:val="left"/>
+      <w:pPr>
+        <w:ind w:left="720" w:hanging="360"/>
+      </w:pPr>
+      <w:rPr>
+        <w:rFonts w:ascii="Times" w:eastAsia="Times" w:hAnsi="Times" w:cs="Times" w:hint="default"/>
+      </w:rPr>
+    </w:lvl>
+    <w:lvl w:ilvl="1" w:tplc="040C0003" w:tentative="1">
+      <w:start w:val="1"/>
+      <w:numFmt w:val="bullet"/>
+      <w:lvlText w:val="o"/>
+      <w:lvlJc w:val="left"/>
+      <w:pPr>
+        <w:ind w:left="1440" w:hanging="360"/>
+      </w:pPr>
+      <w:rPr>
+        <w:rFonts w:ascii="Courier New" w:hAnsi="Courier New" w:cs="Courier New" w:hint="default"/>
+      </w:rPr>
+    </w:lvl>
+    <w:lvl w:ilvl="2" w:tplc="040C0005" w:tentative="1">
+      <w:start w:val="1"/>
+      <w:numFmt w:val="bullet"/>
+      <w:lvlText w:val=""/>
+      <w:lvlJc w:val="left"/>
+      <w:pPr>
+        <w:ind w:left="2160" w:hanging="360"/>
+      </w:pPr>
+      <w:rPr>
+        <w:rFonts w:ascii="Wingdings" w:hAnsi="Wingdings" w:hint="default"/>
+      </w:rPr>
+    </w:lvl>
+    <w:lvl w:ilvl="3" w:tplc="040C0001" w:tentative="1">
+      <w:start w:val="1"/>
+      <w:numFmt w:val="bullet"/>
+      <w:lvlText w:val=""/>
+      <w:lvlJc w:val="left"/>
+      <w:pPr>
+        <w:ind w:left="2880" w:hanging="360"/>
+      </w:pPr>
+      <w:rPr>
+        <w:rFonts w:ascii="Symbol" w:hAnsi="Symbol" w:hint="default"/>
+      </w:rPr>
+    </w:lvl>
+    <w:lvl w:ilvl="4" w:tplc="040C0003" w:tentative="1">
+      <w:start w:val="1"/>
+      <w:numFmt w:val="bullet"/>
+      <w:lvlText w:val="o"/>
+      <w:lvlJc w:val="left"/>
+      <w:pPr>
+        <w:ind w:left="3600" w:hanging="360"/>
+      </w:pPr>
+      <w:rPr>
+        <w:rFonts w:ascii="Courier New" w:hAnsi="Courier New" w:cs="Courier New" w:hint="default"/>
+      </w:rPr>
+    </w:lvl>
+    <w:lvl w:ilvl="5" w:tplc="040C0005" w:tentative="1">
+      <w:start w:val="1"/>
+      <w:numFmt w:val="bullet"/>
+      <w:lvlText w:val=""/>
+      <w:lvlJc w:val="left"/>
+      <w:pPr>
+        <w:ind w:left="4320" w:hanging="360"/>
+      </w:pPr>
+      <w:rPr>
+        <w:rFonts w:ascii="Wingdings" w:hAnsi="Wingdings" w:hint="default"/>
+      </w:rPr>
+    </w:lvl>
+    <w:lvl w:ilvl="6" w:tplc="040C0001" w:tentative="1">
+      <w:start w:val="1"/>
+      <w:numFmt w:val="bullet"/>
+      <w:lvlText w:val=""/>
+      <w:lvlJc w:val="left"/>
+      <w:pPr>
+        <w:ind w:left="5040" w:hanging="360"/>
+      </w:pPr>
+      <w:rPr>
+        <w:rFonts w:ascii="Symbol" w:hAnsi="Symbol" w:hint="default"/>
+      </w:rPr>
+    </w:lvl>
+    <w:lvl w:ilvl="7" w:tplc="040C0003" w:tentative="1">
+      <w:start w:val="1"/>
+      <w:numFmt w:val="bullet"/>
+      <w:lvlText w:val="o"/>
+      <w:lvlJc w:val="left"/>
+      <w:pPr>
+        <w:ind w:left="5760" w:hanging="360"/>
+      </w:pPr>
+      <w:rPr>
+        <w:rFonts w:ascii="Courier New" w:hAnsi="Courier New" w:cs="Courier New" w:hint="default"/>
+      </w:rPr>
+    </w:lvl>
+    <w:lvl w:ilvl="8" w:tplc="040C0005" w:tentative="1">
+      <w:start w:val="1"/>
+      <w:numFmt w:val="bullet"/>
+      <w:lvlText w:val=""/>
+      <w:lvlJc w:val="left"/>
+      <w:pPr>
+        <w:ind w:left="6480" w:hanging="360"/>
+      </w:pPr>
+      <w:rPr>
+        <w:rFonts w:ascii="Wingdings" w:hAnsi="Wingdings" w:hint="default"/>
+      </w:rPr>
+    </w:lvl>
+  </w:abstractNum>
+  <w:abstractNum w:abstractNumId="2" w15:restartNumberingAfterBreak="0">
+    <w:nsid w:val="03700803"/>
+    <w:multiLevelType w:val="hybridMultilevel"/>
+    <w:tmpl w:val="2D2C41A0"/>
+    <w:lvl w:ilvl="0" w:tplc="B05AF544">
+      <w:numFmt w:val="bullet"/>
+      <w:lvlText w:val="-"/>
+      <w:lvlJc w:val="left"/>
+      <w:pPr>
+        <w:ind w:left="720" w:hanging="360"/>
+      </w:pPr>
+      <w:rPr>
+        <w:rFonts w:ascii="Times" w:eastAsia="Times" w:hAnsi="Times" w:cs="Times" w:hint="default"/>
+      </w:rPr>
+    </w:lvl>
+    <w:lvl w:ilvl="1" w:tplc="040C0003" w:tentative="1">
+      <w:start w:val="1"/>
+      <w:numFmt w:val="bullet"/>
+      <w:lvlText w:val="o"/>
+      <w:lvlJc w:val="left"/>
+      <w:pPr>
+        <w:ind w:left="1440" w:hanging="360"/>
+      </w:pPr>
+      <w:rPr>
+        <w:rFonts w:ascii="Courier New" w:hAnsi="Courier New" w:cs="Courier New" w:hint="default"/>
+      </w:rPr>
+    </w:lvl>
+    <w:lvl w:ilvl="2" w:tplc="040C0005" w:tentative="1">
+      <w:start w:val="1"/>
+      <w:numFmt w:val="bullet"/>
+      <w:lvlText w:val=""/>
+      <w:lvlJc w:val="left"/>
+      <w:pPr>
+        <w:ind w:left="2160" w:hanging="360"/>
+      </w:pPr>
+      <w:rPr>
+        <w:rFonts w:ascii="Wingdings" w:hAnsi="Wingdings" w:hint="default"/>
+      </w:rPr>
+    </w:lvl>
+    <w:lvl w:ilvl="3" w:tplc="040C0001" w:tentative="1">
+      <w:start w:val="1"/>
+      <w:numFmt w:val="bullet"/>
+      <w:lvlText w:val=""/>
+      <w:lvlJc w:val="left"/>
+      <w:pPr>
+        <w:ind w:left="2880" w:hanging="360"/>
+      </w:pPr>
+      <w:rPr>
+        <w:rFonts w:ascii="Symbol" w:hAnsi="Symbol" w:hint="default"/>
+      </w:rPr>
+    </w:lvl>
+    <w:lvl w:ilvl="4" w:tplc="040C0003" w:tentative="1">
+      <w:start w:val="1"/>
+      <w:numFmt w:val="bullet"/>
+      <w:lvlText w:val="o"/>
+      <w:lvlJc w:val="left"/>
+      <w:pPr>
+        <w:ind w:left="3600" w:hanging="360"/>
+      </w:pPr>
+      <w:rPr>
+        <w:rFonts w:ascii="Courier New" w:hAnsi="Courier New" w:cs="Courier New" w:hint="default"/>
+      </w:rPr>
+    </w:lvl>
+    <w:lvl w:ilvl="5" w:tplc="040C0005" w:tentative="1">
+      <w:start w:val="1"/>
+      <w:numFmt w:val="bullet"/>
+      <w:lvlText w:val=""/>
+      <w:lvlJc w:val="left"/>
+      <w:pPr>
+        <w:ind w:left="4320" w:hanging="360"/>
+      </w:pPr>
+      <w:rPr>
+        <w:rFonts w:ascii="Wingdings" w:hAnsi="Wingdings" w:hint="default"/>
+      </w:rPr>
+    </w:lvl>
+    <w:lvl w:ilvl="6" w:tplc="040C0001" w:tentative="1">
+      <w:start w:val="1"/>
+      <w:numFmt w:val="bullet"/>
+      <w:lvlText w:val=""/>
+      <w:lvlJc w:val="left"/>
+      <w:pPr>
+        <w:ind w:left="5040" w:hanging="360"/>
+      </w:pPr>
+      <w:rPr>
+        <w:rFonts w:ascii="Symbol" w:hAnsi="Symbol" w:hint="default"/>
+      </w:rPr>
+    </w:lvl>
+    <w:lvl w:ilvl="7" w:tplc="040C0003" w:tentative="1">
+      <w:start w:val="1"/>
+      <w:numFmt w:val="bullet"/>
+      <w:lvlText w:val="o"/>
+      <w:lvlJc w:val="left"/>
+      <w:pPr>
+        <w:ind w:left="5760" w:hanging="360"/>
+      </w:pPr>
+      <w:rPr>
+        <w:rFonts w:ascii="Courier New" w:hAnsi="Courier New" w:cs="Courier New" w:hint="default"/>
+      </w:rPr>
+    </w:lvl>
+    <w:lvl w:ilvl="8" w:tplc="040C0005" w:tentative="1">
+      <w:start w:val="1"/>
+      <w:numFmt w:val="bullet"/>
+      <w:lvlText w:val=""/>
+      <w:lvlJc w:val="left"/>
+      <w:pPr>
+        <w:ind w:left="6480" w:hanging="360"/>
+      </w:pPr>
+      <w:rPr>
+        <w:rFonts w:ascii="Wingdings" w:hAnsi="Wingdings" w:hint="default"/>
+      </w:rPr>
+    </w:lvl>
+  </w:abstractNum>
+  <w:abstractNum w:abstractNumId="3" w15:restartNumberingAfterBreak="0">
+    <w:nsid w:val="040446A3"/>
+    <w:multiLevelType w:val="hybridMultilevel"/>
+    <w:tmpl w:val="2794C512"/>
+    <w:lvl w:ilvl="0" w:tplc="B05AF544">
+      <w:numFmt w:val="bullet"/>
+      <w:lvlText w:val="-"/>
+      <w:lvlJc w:val="left"/>
+      <w:pPr>
+        <w:ind w:left="720" w:hanging="360"/>
+      </w:pPr>
+      <w:rPr>
+        <w:rFonts w:ascii="Times" w:eastAsia="Times" w:hAnsi="Times" w:cs="Times" w:hint="default"/>
+      </w:rPr>
+    </w:lvl>
+    <w:lvl w:ilvl="1" w:tplc="040C0003" w:tentative="1">
+      <w:start w:val="1"/>
+      <w:numFmt w:val="bullet"/>
+      <w:lvlText w:val="o"/>
+      <w:lvlJc w:val="left"/>
+      <w:pPr>
+        <w:ind w:left="1440" w:hanging="360"/>
+      </w:pPr>
+      <w:rPr>
+        <w:rFonts w:ascii="Courier New" w:hAnsi="Courier New" w:cs="Courier New" w:hint="default"/>
+      </w:rPr>
+    </w:lvl>
+    <w:lvl w:ilvl="2" w:tplc="040C0005" w:tentative="1">
+      <w:start w:val="1"/>
+      <w:numFmt w:val="bullet"/>
+      <w:lvlText w:val=""/>
+      <w:lvlJc w:val="left"/>
+      <w:pPr>
+        <w:ind w:left="2160" w:hanging="360"/>
+      </w:pPr>
+      <w:rPr>
+        <w:rFonts w:ascii="Wingdings" w:hAnsi="Wingdings" w:hint="default"/>
+      </w:rPr>
+    </w:lvl>
+    <w:lvl w:ilvl="3" w:tplc="040C0001" w:tentative="1">
+      <w:start w:val="1"/>
+      <w:numFmt w:val="bullet"/>
+      <w:lvlText w:val=""/>
+      <w:lvlJc w:val="left"/>
+      <w:pPr>
+        <w:ind w:left="2880" w:hanging="360"/>
+      </w:pPr>
+      <w:rPr>
+        <w:rFonts w:ascii="Symbol" w:hAnsi="Symbol" w:hint="default"/>
+      </w:rPr>
+    </w:lvl>
+    <w:lvl w:ilvl="4" w:tplc="040C0003" w:tentative="1">
+      <w:start w:val="1"/>
+      <w:numFmt w:val="bullet"/>
+      <w:lvlText w:val="o"/>
+      <w:lvlJc w:val="left"/>
+      <w:pPr>
+        <w:ind w:left="3600" w:hanging="360"/>
+      </w:pPr>
+      <w:rPr>
+        <w:rFonts w:ascii="Courier New" w:hAnsi="Courier New" w:cs="Courier New" w:hint="default"/>
+      </w:rPr>
+    </w:lvl>
+    <w:lvl w:ilvl="5" w:tplc="040C0005" w:tentative="1">
+      <w:start w:val="1"/>
+      <w:numFmt w:val="bullet"/>
+      <w:lvlText w:val=""/>
+      <w:lvlJc w:val="left"/>
+      <w:pPr>
+        <w:ind w:left="4320" w:hanging="360"/>
+      </w:pPr>
+      <w:rPr>
+        <w:rFonts w:ascii="Wingdings" w:hAnsi="Wingdings" w:hint="default"/>
+      </w:rPr>
+    </w:lvl>
+    <w:lvl w:ilvl="6" w:tplc="040C0001" w:tentative="1">
+      <w:start w:val="1"/>
+      <w:numFmt w:val="bullet"/>
+      <w:lvlText w:val=""/>
+      <w:lvlJc w:val="left"/>
+      <w:pPr>
+        <w:ind w:left="5040" w:hanging="360"/>
+      </w:pPr>
+      <w:rPr>
+        <w:rFonts w:ascii="Symbol" w:hAnsi="Symbol" w:hint="default"/>
+      </w:rPr>
+    </w:lvl>
+    <w:lvl w:ilvl="7" w:tplc="040C0003" w:tentative="1">
+      <w:start w:val="1"/>
+      <w:numFmt w:val="bullet"/>
+      <w:lvlText w:val="o"/>
+      <w:lvlJc w:val="left"/>
+      <w:pPr>
+        <w:ind w:left="5760" w:hanging="360"/>
+      </w:pPr>
+      <w:rPr>
+        <w:rFonts w:ascii="Courier New" w:hAnsi="Courier New" w:cs="Courier New" w:hint="default"/>
+      </w:rPr>
+    </w:lvl>
+    <w:lvl w:ilvl="8" w:tplc="040C0005" w:tentative="1">
+      <w:start w:val="1"/>
+      <w:numFmt w:val="bullet"/>
+      <w:lvlText w:val=""/>
+      <w:lvlJc w:val="left"/>
+      <w:pPr>
+        <w:ind w:left="6480" w:hanging="360"/>
+      </w:pPr>
+      <w:rPr>
+        <w:rFonts w:ascii="Wingdings" w:hAnsi="Wingdings" w:hint="default"/>
+      </w:rPr>
+    </w:lvl>
+  </w:abstractNum>
+  <w:abstractNum w:abstractNumId="4" w15:restartNumberingAfterBreak="0">
     <w:nsid w:val="05857FAD"/>
     <w:multiLevelType w:val="hybridMultilevel"/>
     <w:tmpl w:val="AE8E0AC0"/>
@@ -3193,7 +3838,119 @@
       </w:rPr>
     </w:lvl>
   </w:abstractNum>
-  <w:abstractNum w:abstractNumId="1" w15:restartNumberingAfterBreak="0">
+  <w:abstractNum w:abstractNumId="5" w15:restartNumberingAfterBreak="0">
+    <w:nsid w:val="0D7B6A49"/>
+    <w:multiLevelType w:val="hybridMultilevel"/>
+    <w:tmpl w:val="6BB6AF6E"/>
+    <w:lvl w:ilvl="0" w:tplc="B05AF544">
+      <w:numFmt w:val="bullet"/>
+      <w:lvlText w:val="-"/>
+      <w:lvlJc w:val="left"/>
+      <w:pPr>
+        <w:ind w:left="720" w:hanging="360"/>
+      </w:pPr>
+      <w:rPr>
+        <w:rFonts w:ascii="Times" w:eastAsia="Times" w:hAnsi="Times" w:cs="Times" w:hint="default"/>
+      </w:rPr>
+    </w:lvl>
+    <w:lvl w:ilvl="1" w:tplc="040C0003" w:tentative="1">
+      <w:start w:val="1"/>
+      <w:numFmt w:val="bullet"/>
+      <w:lvlText w:val="o"/>
+      <w:lvlJc w:val="left"/>
+      <w:pPr>
+        <w:ind w:left="1440" w:hanging="360"/>
+      </w:pPr>
+      <w:rPr>
+        <w:rFonts w:ascii="Courier New" w:hAnsi="Courier New" w:cs="Courier New" w:hint="default"/>
+      </w:rPr>
+    </w:lvl>
+    <w:lvl w:ilvl="2" w:tplc="040C0005" w:tentative="1">
+      <w:start w:val="1"/>
+      <w:numFmt w:val="bullet"/>
+      <w:lvlText w:val=""/>
+      <w:lvlJc w:val="left"/>
+      <w:pPr>
+        <w:ind w:left="2160" w:hanging="360"/>
+      </w:pPr>
+      <w:rPr>
+        <w:rFonts w:ascii="Wingdings" w:hAnsi="Wingdings" w:hint="default"/>
+      </w:rPr>
+    </w:lvl>
+    <w:lvl w:ilvl="3" w:tplc="040C0001" w:tentative="1">
+      <w:start w:val="1"/>
+      <w:numFmt w:val="bullet"/>
+      <w:lvlText w:val=""/>
+      <w:lvlJc w:val="left"/>
+      <w:pPr>
+        <w:ind w:left="2880" w:hanging="360"/>
+      </w:pPr>
+      <w:rPr>
+        <w:rFonts w:ascii="Symbol" w:hAnsi="Symbol" w:hint="default"/>
+      </w:rPr>
+    </w:lvl>
+    <w:lvl w:ilvl="4" w:tplc="040C0003" w:tentative="1">
+      <w:start w:val="1"/>
+      <w:numFmt w:val="bullet"/>
+      <w:lvlText w:val="o"/>
+      <w:lvlJc w:val="left"/>
+      <w:pPr>
+        <w:ind w:left="3600" w:hanging="360"/>
+      </w:pPr>
+      <w:rPr>
+        <w:rFonts w:ascii="Courier New" w:hAnsi="Courier New" w:cs="Courier New" w:hint="default"/>
+      </w:rPr>
+    </w:lvl>
+    <w:lvl w:ilvl="5" w:tplc="040C0005" w:tentative="1">
+      <w:start w:val="1"/>
+      <w:numFmt w:val="bullet"/>
+      <w:lvlText w:val=""/>
+      <w:lvlJc w:val="left"/>
+      <w:pPr>
+        <w:ind w:left="4320" w:hanging="360"/>
+      </w:pPr>
+      <w:rPr>
+        <w:rFonts w:ascii="Wingdings" w:hAnsi="Wingdings" w:hint="default"/>
+      </w:rPr>
+    </w:lvl>
+    <w:lvl w:ilvl="6" w:tplc="040C0001" w:tentative="1">
+      <w:start w:val="1"/>
+      <w:numFmt w:val="bullet"/>
+      <w:lvlText w:val=""/>
+      <w:lvlJc w:val="left"/>
+      <w:pPr>
+        <w:ind w:left="5040" w:hanging="360"/>
+      </w:pPr>
+      <w:rPr>
+        <w:rFonts w:ascii="Symbol" w:hAnsi="Symbol" w:hint="default"/>
+      </w:rPr>
+    </w:lvl>
+    <w:lvl w:ilvl="7" w:tplc="040C0003" w:tentative="1">
+      <w:start w:val="1"/>
+      <w:numFmt w:val="bullet"/>
+      <w:lvlText w:val="o"/>
+      <w:lvlJc w:val="left"/>
+      <w:pPr>
+        <w:ind w:left="5760" w:hanging="360"/>
+      </w:pPr>
+      <w:rPr>
+        <w:rFonts w:ascii="Courier New" w:hAnsi="Courier New" w:cs="Courier New" w:hint="default"/>
+      </w:rPr>
+    </w:lvl>
+    <w:lvl w:ilvl="8" w:tplc="040C0005" w:tentative="1">
+      <w:start w:val="1"/>
+      <w:numFmt w:val="bullet"/>
+      <w:lvlText w:val=""/>
+      <w:lvlJc w:val="left"/>
+      <w:pPr>
+        <w:ind w:left="6480" w:hanging="360"/>
+      </w:pPr>
+      <w:rPr>
+        <w:rFonts w:ascii="Wingdings" w:hAnsi="Wingdings" w:hint="default"/>
+      </w:rPr>
+    </w:lvl>
+  </w:abstractNum>
+  <w:abstractNum w:abstractNumId="6" w15:restartNumberingAfterBreak="0">
     <w:nsid w:val="0FC76C3C"/>
     <w:multiLevelType w:val="hybridMultilevel"/>
     <w:tmpl w:val="C204AAE4"/>
@@ -3332,7 +4089,208 @@
       </w:rPr>
     </w:lvl>
   </w:abstractNum>
-  <w:abstractNum w:abstractNumId="2" w15:restartNumberingAfterBreak="0">
+  <w:abstractNum w:abstractNumId="7" w15:restartNumberingAfterBreak="0">
+    <w:nsid w:val="128B2045"/>
+    <w:multiLevelType w:val="hybridMultilevel"/>
+    <w:tmpl w:val="38CA10D0"/>
+    <w:lvl w:ilvl="0" w:tplc="040C000F">
+      <w:start w:val="1"/>
+      <w:numFmt w:val="decimal"/>
+      <w:lvlText w:val="%1."/>
+      <w:lvlJc w:val="left"/>
+      <w:pPr>
+        <w:ind w:left="720" w:hanging="360"/>
+      </w:pPr>
+      <w:rPr>
+        <w:rFonts w:hint="default"/>
+      </w:rPr>
+    </w:lvl>
+    <w:lvl w:ilvl="1" w:tplc="040C0019" w:tentative="1">
+      <w:start w:val="1"/>
+      <w:numFmt w:val="lowerLetter"/>
+      <w:lvlText w:val="%2."/>
+      <w:lvlJc w:val="left"/>
+      <w:pPr>
+        <w:ind w:left="1440" w:hanging="360"/>
+      </w:pPr>
+    </w:lvl>
+    <w:lvl w:ilvl="2" w:tplc="040C001B" w:tentative="1">
+      <w:start w:val="1"/>
+      <w:numFmt w:val="lowerRoman"/>
+      <w:lvlText w:val="%3."/>
+      <w:lvlJc w:val="right"/>
+      <w:pPr>
+        <w:ind w:left="2160" w:hanging="180"/>
+      </w:pPr>
+    </w:lvl>
+    <w:lvl w:ilvl="3" w:tplc="040C000F" w:tentative="1">
+      <w:start w:val="1"/>
+      <w:numFmt w:val="decimal"/>
+      <w:lvlText w:val="%4."/>
+      <w:lvlJc w:val="left"/>
+      <w:pPr>
+        <w:ind w:left="2880" w:hanging="360"/>
+      </w:pPr>
+    </w:lvl>
+    <w:lvl w:ilvl="4" w:tplc="040C0019" w:tentative="1">
+      <w:start w:val="1"/>
+      <w:numFmt w:val="lowerLetter"/>
+      <w:lvlText w:val="%5."/>
+      <w:lvlJc w:val="left"/>
+      <w:pPr>
+        <w:ind w:left="3600" w:hanging="360"/>
+      </w:pPr>
+    </w:lvl>
+    <w:lvl w:ilvl="5" w:tplc="040C001B" w:tentative="1">
+      <w:start w:val="1"/>
+      <w:numFmt w:val="lowerRoman"/>
+      <w:lvlText w:val="%6."/>
+      <w:lvlJc w:val="right"/>
+      <w:pPr>
+        <w:ind w:left="4320" w:hanging="180"/>
+      </w:pPr>
+    </w:lvl>
+    <w:lvl w:ilvl="6" w:tplc="040C000F" w:tentative="1">
+      <w:start w:val="1"/>
+      <w:numFmt w:val="decimal"/>
+      <w:lvlText w:val="%7."/>
+      <w:lvlJc w:val="left"/>
+      <w:pPr>
+        <w:ind w:left="5040" w:hanging="360"/>
+      </w:pPr>
+    </w:lvl>
+    <w:lvl w:ilvl="7" w:tplc="040C0019" w:tentative="1">
+      <w:start w:val="1"/>
+      <w:numFmt w:val="lowerLetter"/>
+      <w:lvlText w:val="%8."/>
+      <w:lvlJc w:val="left"/>
+      <w:pPr>
+        <w:ind w:left="5760" w:hanging="360"/>
+      </w:pPr>
+    </w:lvl>
+    <w:lvl w:ilvl="8" w:tplc="040C001B" w:tentative="1">
+      <w:start w:val="1"/>
+      <w:numFmt w:val="lowerRoman"/>
+      <w:lvlText w:val="%9."/>
+      <w:lvlJc w:val="right"/>
+      <w:pPr>
+        <w:ind w:left="6480" w:hanging="180"/>
+      </w:pPr>
+    </w:lvl>
+  </w:abstractNum>
+  <w:abstractNum w:abstractNumId="8" w15:restartNumberingAfterBreak="0">
+    <w:nsid w:val="12AD332C"/>
+    <w:multiLevelType w:val="hybridMultilevel"/>
+    <w:tmpl w:val="DA8EF50E"/>
+    <w:lvl w:ilvl="0" w:tplc="B05AF544">
+      <w:numFmt w:val="bullet"/>
+      <w:lvlText w:val="-"/>
+      <w:lvlJc w:val="left"/>
+      <w:pPr>
+        <w:ind w:left="720" w:hanging="360"/>
+      </w:pPr>
+      <w:rPr>
+        <w:rFonts w:ascii="Times" w:eastAsia="Times" w:hAnsi="Times" w:cs="Times" w:hint="default"/>
+      </w:rPr>
+    </w:lvl>
+    <w:lvl w:ilvl="1" w:tplc="040C0003" w:tentative="1">
+      <w:start w:val="1"/>
+      <w:numFmt w:val="bullet"/>
+      <w:lvlText w:val="o"/>
+      <w:lvlJc w:val="left"/>
+      <w:pPr>
+        <w:ind w:left="1440" w:hanging="360"/>
+      </w:pPr>
+      <w:rPr>
+        <w:rFonts w:ascii="Courier New" w:hAnsi="Courier New" w:cs="Courier New" w:hint="default"/>
+      </w:rPr>
+    </w:lvl>
+    <w:lvl w:ilvl="2" w:tplc="040C0005" w:tentative="1">
+      <w:start w:val="1"/>
+      <w:numFmt w:val="bullet"/>
+      <w:lvlText w:val=""/>
+      <w:lvlJc w:val="left"/>
+      <w:pPr>
+        <w:ind w:left="2160" w:hanging="360"/>
+      </w:pPr>
+      <w:rPr>
+        <w:rFonts w:ascii="Wingdings" w:hAnsi="Wingdings" w:hint="default"/>
+      </w:rPr>
+    </w:lvl>
+    <w:lvl w:ilvl="3" w:tplc="040C0001" w:tentative="1">
+      <w:start w:val="1"/>
+      <w:numFmt w:val="bullet"/>
+      <w:lvlText w:val=""/>
+      <w:lvlJc w:val="left"/>
+      <w:pPr>
+        <w:ind w:left="2880" w:hanging="360"/>
+      </w:pPr>
+      <w:rPr>
+        <w:rFonts w:ascii="Symbol" w:hAnsi="Symbol" w:hint="default"/>
+      </w:rPr>
+    </w:lvl>
+    <w:lvl w:ilvl="4" w:tplc="040C0003" w:tentative="1">
+      <w:start w:val="1"/>
+      <w:numFmt w:val="bullet"/>
+      <w:lvlText w:val="o"/>
+      <w:lvlJc w:val="left"/>
+      <w:pPr>
+        <w:ind w:left="3600" w:hanging="360"/>
+      </w:pPr>
+      <w:rPr>
+        <w:rFonts w:ascii="Courier New" w:hAnsi="Courier New" w:cs="Courier New" w:hint="default"/>
+      </w:rPr>
+    </w:lvl>
+    <w:lvl w:ilvl="5" w:tplc="040C0005" w:tentative="1">
+      <w:start w:val="1"/>
+      <w:numFmt w:val="bullet"/>
+      <w:lvlText w:val=""/>
+      <w:lvlJc w:val="left"/>
+      <w:pPr>
+        <w:ind w:left="4320" w:hanging="360"/>
+      </w:pPr>
+      <w:rPr>
+        <w:rFonts w:ascii="Wingdings" w:hAnsi="Wingdings" w:hint="default"/>
+      </w:rPr>
+    </w:lvl>
+    <w:lvl w:ilvl="6" w:tplc="040C0001" w:tentative="1">
+      <w:start w:val="1"/>
+      <w:numFmt w:val="bullet"/>
+      <w:lvlText w:val=""/>
+      <w:lvlJc w:val="left"/>
+      <w:pPr>
+        <w:ind w:left="5040" w:hanging="360"/>
+      </w:pPr>
+      <w:rPr>
+        <w:rFonts w:ascii="Symbol" w:hAnsi="Symbol" w:hint="default"/>
+      </w:rPr>
+    </w:lvl>
+    <w:lvl w:ilvl="7" w:tplc="040C0003" w:tentative="1">
+      <w:start w:val="1"/>
+      <w:numFmt w:val="bullet"/>
+      <w:lvlText w:val="o"/>
+      <w:lvlJc w:val="left"/>
+      <w:pPr>
+        <w:ind w:left="5760" w:hanging="360"/>
+      </w:pPr>
+      <w:rPr>
+        <w:rFonts w:ascii="Courier New" w:hAnsi="Courier New" w:cs="Courier New" w:hint="default"/>
+      </w:rPr>
+    </w:lvl>
+    <w:lvl w:ilvl="8" w:tplc="040C0005" w:tentative="1">
+      <w:start w:val="1"/>
+      <w:numFmt w:val="bullet"/>
+      <w:lvlText w:val=""/>
+      <w:lvlJc w:val="left"/>
+      <w:pPr>
+        <w:ind w:left="6480" w:hanging="360"/>
+      </w:pPr>
+      <w:rPr>
+        <w:rFonts w:ascii="Wingdings" w:hAnsi="Wingdings" w:hint="default"/>
+      </w:rPr>
+    </w:lvl>
+  </w:abstractNum>
+  <w:abstractNum w:abstractNumId="9" w15:restartNumberingAfterBreak="0">
     <w:nsid w:val="1C3E3E99"/>
     <w:multiLevelType w:val="hybridMultilevel"/>
     <w:tmpl w:val="5A74A390"/>
@@ -3445,7 +4403,120 @@
       </w:rPr>
     </w:lvl>
   </w:abstractNum>
-  <w:abstractNum w:abstractNumId="3" w15:restartNumberingAfterBreak="0">
+  <w:abstractNum w:abstractNumId="10" w15:restartNumberingAfterBreak="0">
+    <w:nsid w:val="28952276"/>
+    <w:multiLevelType w:val="hybridMultilevel"/>
+    <w:tmpl w:val="63BC8190"/>
+    <w:lvl w:ilvl="0" w:tplc="040C000F">
+      <w:start w:val="1"/>
+      <w:numFmt w:val="decimal"/>
+      <w:lvlText w:val="%1."/>
+      <w:lvlJc w:val="left"/>
+      <w:pPr>
+        <w:ind w:left="720" w:hanging="360"/>
+      </w:pPr>
+      <w:rPr>
+        <w:rFonts w:hint="default"/>
+      </w:rPr>
+    </w:lvl>
+    <w:lvl w:ilvl="1" w:tplc="FFFFFFFF" w:tentative="1">
+      <w:start w:val="1"/>
+      <w:numFmt w:val="bullet"/>
+      <w:lvlText w:val="o"/>
+      <w:lvlJc w:val="left"/>
+      <w:pPr>
+        <w:ind w:left="1440" w:hanging="360"/>
+      </w:pPr>
+      <w:rPr>
+        <w:rFonts w:ascii="Courier New" w:hAnsi="Courier New" w:cs="Courier New" w:hint="default"/>
+      </w:rPr>
+    </w:lvl>
+    <w:lvl w:ilvl="2" w:tplc="FFFFFFFF" w:tentative="1">
+      <w:start w:val="1"/>
+      <w:numFmt w:val="bullet"/>
+      <w:lvlText w:val=""/>
+      <w:lvlJc w:val="left"/>
+      <w:pPr>
+        <w:ind w:left="2160" w:hanging="360"/>
+      </w:pPr>
+      <w:rPr>
+        <w:rFonts w:ascii="Wingdings" w:hAnsi="Wingdings" w:hint="default"/>
+      </w:rPr>
+    </w:lvl>
+    <w:lvl w:ilvl="3" w:tplc="FFFFFFFF" w:tentative="1">
+      <w:start w:val="1"/>
+      <w:numFmt w:val="bullet"/>
+      <w:lvlText w:val=""/>
+      <w:lvlJc w:val="left"/>
+      <w:pPr>
+        <w:ind w:left="2880" w:hanging="360"/>
+      </w:pPr>
+      <w:rPr>
+        <w:rFonts w:ascii="Symbol" w:hAnsi="Symbol" w:hint="default"/>
+      </w:rPr>
+    </w:lvl>
+    <w:lvl w:ilvl="4" w:tplc="FFFFFFFF" w:tentative="1">
+      <w:start w:val="1"/>
+      <w:numFmt w:val="bullet"/>
+      <w:lvlText w:val="o"/>
+      <w:lvlJc w:val="left"/>
+      <w:pPr>
+        <w:ind w:left="3600" w:hanging="360"/>
+      </w:pPr>
+      <w:rPr>
+        <w:rFonts w:ascii="Courier New" w:hAnsi="Courier New" w:cs="Courier New" w:hint="default"/>
+      </w:rPr>
+    </w:lvl>
+    <w:lvl w:ilvl="5" w:tplc="FFFFFFFF" w:tentative="1">
+      <w:start w:val="1"/>
+      <w:numFmt w:val="bullet"/>
+      <w:lvlText w:val=""/>
+      <w:lvlJc w:val="left"/>
+      <w:pPr>
+        <w:ind w:left="4320" w:hanging="360"/>
+      </w:pPr>
+      <w:rPr>
+        <w:rFonts w:ascii="Wingdings" w:hAnsi="Wingdings" w:hint="default"/>
+      </w:rPr>
+    </w:lvl>
+    <w:lvl w:ilvl="6" w:tplc="FFFFFFFF" w:tentative="1">
+      <w:start w:val="1"/>
+      <w:numFmt w:val="bullet"/>
+      <w:lvlText w:val=""/>
+      <w:lvlJc w:val="left"/>
+      <w:pPr>
+        <w:ind w:left="5040" w:hanging="360"/>
+      </w:pPr>
+      <w:rPr>
+        <w:rFonts w:ascii="Symbol" w:hAnsi="Symbol" w:hint="default"/>
+      </w:rPr>
+    </w:lvl>
+    <w:lvl w:ilvl="7" w:tplc="FFFFFFFF" w:tentative="1">
+      <w:start w:val="1"/>
+      <w:numFmt w:val="bullet"/>
+      <w:lvlText w:val="o"/>
+      <w:lvlJc w:val="left"/>
+      <w:pPr>
+        <w:ind w:left="5760" w:hanging="360"/>
+      </w:pPr>
+      <w:rPr>
+        <w:rFonts w:ascii="Courier New" w:hAnsi="Courier New" w:cs="Courier New" w:hint="default"/>
+      </w:rPr>
+    </w:lvl>
+    <w:lvl w:ilvl="8" w:tplc="FFFFFFFF" w:tentative="1">
+      <w:start w:val="1"/>
+      <w:numFmt w:val="bullet"/>
+      <w:lvlText w:val=""/>
+      <w:lvlJc w:val="left"/>
+      <w:pPr>
+        <w:ind w:left="6480" w:hanging="360"/>
+      </w:pPr>
+      <w:rPr>
+        <w:rFonts w:ascii="Wingdings" w:hAnsi="Wingdings" w:hint="default"/>
+      </w:rPr>
+    </w:lvl>
+  </w:abstractNum>
+  <w:abstractNum w:abstractNumId="11" w15:restartNumberingAfterBreak="0">
     <w:nsid w:val="2EF826F8"/>
     <w:multiLevelType w:val="hybridMultilevel"/>
     <w:tmpl w:val="6FF81428"/>
@@ -3558,7 +4629,7 @@
       </w:rPr>
     </w:lvl>
   </w:abstractNum>
-  <w:abstractNum w:abstractNumId="4" w15:restartNumberingAfterBreak="0">
+  <w:abstractNum w:abstractNumId="12" w15:restartNumberingAfterBreak="0">
     <w:nsid w:val="3141555D"/>
     <w:multiLevelType w:val="multilevel"/>
     <w:tmpl w:val="216A2E8E"/>
@@ -3689,7 +4760,232 @@
       </w:rPr>
     </w:lvl>
   </w:abstractNum>
-  <w:abstractNum w:abstractNumId="5" w15:restartNumberingAfterBreak="0">
+  <w:abstractNum w:abstractNumId="13" w15:restartNumberingAfterBreak="0">
+    <w:nsid w:val="408A2D13"/>
+    <w:multiLevelType w:val="hybridMultilevel"/>
+    <w:tmpl w:val="CCEE8458"/>
+    <w:lvl w:ilvl="0" w:tplc="B05AF544">
+      <w:numFmt w:val="bullet"/>
+      <w:lvlText w:val="-"/>
+      <w:lvlJc w:val="left"/>
+      <w:pPr>
+        <w:ind w:left="720" w:hanging="360"/>
+      </w:pPr>
+      <w:rPr>
+        <w:rFonts w:ascii="Times" w:eastAsia="Times" w:hAnsi="Times" w:cs="Times" w:hint="default"/>
+      </w:rPr>
+    </w:lvl>
+    <w:lvl w:ilvl="1" w:tplc="040C0003" w:tentative="1">
+      <w:start w:val="1"/>
+      <w:numFmt w:val="bullet"/>
+      <w:lvlText w:val="o"/>
+      <w:lvlJc w:val="left"/>
+      <w:pPr>
+        <w:ind w:left="1440" w:hanging="360"/>
+      </w:pPr>
+      <w:rPr>
+        <w:rFonts w:ascii="Courier New" w:hAnsi="Courier New" w:cs="Courier New" w:hint="default"/>
+      </w:rPr>
+    </w:lvl>
+    <w:lvl w:ilvl="2" w:tplc="040C0005" w:tentative="1">
+      <w:start w:val="1"/>
+      <w:numFmt w:val="bullet"/>
+      <w:lvlText w:val=""/>
+      <w:lvlJc w:val="left"/>
+      <w:pPr>
+        <w:ind w:left="2160" w:hanging="360"/>
+      </w:pPr>
+      <w:rPr>
+        <w:rFonts w:ascii="Wingdings" w:hAnsi="Wingdings" w:hint="default"/>
+      </w:rPr>
+    </w:lvl>
+    <w:lvl w:ilvl="3" w:tplc="040C0001" w:tentative="1">
+      <w:start w:val="1"/>
+      <w:numFmt w:val="bullet"/>
+      <w:lvlText w:val=""/>
+      <w:lvlJc w:val="left"/>
+      <w:pPr>
+        <w:ind w:left="2880" w:hanging="360"/>
+      </w:pPr>
+      <w:rPr>
+        <w:rFonts w:ascii="Symbol" w:hAnsi="Symbol" w:hint="default"/>
+      </w:rPr>
+    </w:lvl>
+    <w:lvl w:ilvl="4" w:tplc="040C0003" w:tentative="1">
+      <w:start w:val="1"/>
+      <w:numFmt w:val="bullet"/>
+      <w:lvlText w:val="o"/>
+      <w:lvlJc w:val="left"/>
+      <w:pPr>
+        <w:ind w:left="3600" w:hanging="360"/>
+      </w:pPr>
+      <w:rPr>
+        <w:rFonts w:ascii="Courier New" w:hAnsi="Courier New" w:cs="Courier New" w:hint="default"/>
+      </w:rPr>
+    </w:lvl>
+    <w:lvl w:ilvl="5" w:tplc="040C0005" w:tentative="1">
+      <w:start w:val="1"/>
+      <w:numFmt w:val="bullet"/>
+      <w:lvlText w:val=""/>
+      <w:lvlJc w:val="left"/>
+      <w:pPr>
+        <w:ind w:left="4320" w:hanging="360"/>
+      </w:pPr>
+      <w:rPr>
+        <w:rFonts w:ascii="Wingdings" w:hAnsi="Wingdings" w:hint="default"/>
+      </w:rPr>
+    </w:lvl>
+    <w:lvl w:ilvl="6" w:tplc="040C0001" w:tentative="1">
+      <w:start w:val="1"/>
+      <w:numFmt w:val="bullet"/>
+      <w:lvlText w:val=""/>
+      <w:lvlJc w:val="left"/>
+      <w:pPr>
+        <w:ind w:left="5040" w:hanging="360"/>
+      </w:pPr>
+      <w:rPr>
+        <w:rFonts w:ascii="Symbol" w:hAnsi="Symbol" w:hint="default"/>
+      </w:rPr>
+    </w:lvl>
+    <w:lvl w:ilvl="7" w:tplc="040C0003" w:tentative="1">
+      <w:start w:val="1"/>
+      <w:numFmt w:val="bullet"/>
+      <w:lvlText w:val="o"/>
+      <w:lvlJc w:val="left"/>
+      <w:pPr>
+        <w:ind w:left="5760" w:hanging="360"/>
+      </w:pPr>
+      <w:rPr>
+        <w:rFonts w:ascii="Courier New" w:hAnsi="Courier New" w:cs="Courier New" w:hint="default"/>
+      </w:rPr>
+    </w:lvl>
+    <w:lvl w:ilvl="8" w:tplc="040C0005" w:tentative="1">
+      <w:start w:val="1"/>
+      <w:numFmt w:val="bullet"/>
+      <w:lvlText w:val=""/>
+      <w:lvlJc w:val="left"/>
+      <w:pPr>
+        <w:ind w:left="6480" w:hanging="360"/>
+      </w:pPr>
+      <w:rPr>
+        <w:rFonts w:ascii="Wingdings" w:hAnsi="Wingdings" w:hint="default"/>
+      </w:rPr>
+    </w:lvl>
+  </w:abstractNum>
+  <w:abstractNum w:abstractNumId="14" w15:restartNumberingAfterBreak="0">
+    <w:nsid w:val="443B4850"/>
+    <w:multiLevelType w:val="hybridMultilevel"/>
+    <w:tmpl w:val="B094D2E0"/>
+    <w:lvl w:ilvl="0" w:tplc="040C0001">
+      <w:start w:val="1"/>
+      <w:numFmt w:val="bullet"/>
+      <w:lvlText w:val=""/>
+      <w:lvlJc w:val="left"/>
+      <w:pPr>
+        <w:ind w:left="720" w:hanging="360"/>
+      </w:pPr>
+      <w:rPr>
+        <w:rFonts w:ascii="Symbol" w:hAnsi="Symbol" w:hint="default"/>
+      </w:rPr>
+    </w:lvl>
+    <w:lvl w:ilvl="1" w:tplc="040C0003" w:tentative="1">
+      <w:start w:val="1"/>
+      <w:numFmt w:val="bullet"/>
+      <w:lvlText w:val="o"/>
+      <w:lvlJc w:val="left"/>
+      <w:pPr>
+        <w:ind w:left="1440" w:hanging="360"/>
+      </w:pPr>
+      <w:rPr>
+        <w:rFonts w:ascii="Courier New" w:hAnsi="Courier New" w:cs="Courier New" w:hint="default"/>
+      </w:rPr>
+    </w:lvl>
+    <w:lvl w:ilvl="2" w:tplc="040C0005" w:tentative="1">
+      <w:start w:val="1"/>
+      <w:numFmt w:val="bullet"/>
+      <w:lvlText w:val=""/>
+      <w:lvlJc w:val="left"/>
+      <w:pPr>
+        <w:ind w:left="2160" w:hanging="360"/>
+      </w:pPr>
+      <w:rPr>
+        <w:rFonts w:ascii="Wingdings" w:hAnsi="Wingdings" w:hint="default"/>
+      </w:rPr>
+    </w:lvl>
+    <w:lvl w:ilvl="3" w:tplc="040C0001" w:tentative="1">
+      <w:start w:val="1"/>
+      <w:numFmt w:val="bullet"/>
+      <w:lvlText w:val=""/>
+      <w:lvlJc w:val="left"/>
+      <w:pPr>
+        <w:ind w:left="2880" w:hanging="360"/>
+      </w:pPr>
+      <w:rPr>
+        <w:rFonts w:ascii="Symbol" w:hAnsi="Symbol" w:hint="default"/>
+      </w:rPr>
+    </w:lvl>
+    <w:lvl w:ilvl="4" w:tplc="040C0003" w:tentative="1">
+      <w:start w:val="1"/>
+      <w:numFmt w:val="bullet"/>
+      <w:lvlText w:val="o"/>
+      <w:lvlJc w:val="left"/>
+      <w:pPr>
+        <w:ind w:left="3600" w:hanging="360"/>
+      </w:pPr>
+      <w:rPr>
+        <w:rFonts w:ascii="Courier New" w:hAnsi="Courier New" w:cs="Courier New" w:hint="default"/>
+      </w:rPr>
+    </w:lvl>
+    <w:lvl w:ilvl="5" w:tplc="040C0005" w:tentative="1">
+      <w:start w:val="1"/>
+      <w:numFmt w:val="bullet"/>
+      <w:lvlText w:val=""/>
+      <w:lvlJc w:val="left"/>
+      <w:pPr>
+        <w:ind w:left="4320" w:hanging="360"/>
+      </w:pPr>
+      <w:rPr>
+        <w:rFonts w:ascii="Wingdings" w:hAnsi="Wingdings" w:hint="default"/>
+      </w:rPr>
+    </w:lvl>
+    <w:lvl w:ilvl="6" w:tplc="040C0001" w:tentative="1">
+      <w:start w:val="1"/>
+      <w:numFmt w:val="bullet"/>
+      <w:lvlText w:val=""/>
+      <w:lvlJc w:val="left"/>
+      <w:pPr>
+        <w:ind w:left="5040" w:hanging="360"/>
+      </w:pPr>
+      <w:rPr>
+        <w:rFonts w:ascii="Symbol" w:hAnsi="Symbol" w:hint="default"/>
+      </w:rPr>
+    </w:lvl>
+    <w:lvl w:ilvl="7" w:tplc="040C0003" w:tentative="1">
+      <w:start w:val="1"/>
+      <w:numFmt w:val="bullet"/>
+      <w:lvlText w:val="o"/>
+      <w:lvlJc w:val="left"/>
+      <w:pPr>
+        <w:ind w:left="5760" w:hanging="360"/>
+      </w:pPr>
+      <w:rPr>
+        <w:rFonts w:ascii="Courier New" w:hAnsi="Courier New" w:cs="Courier New" w:hint="default"/>
+      </w:rPr>
+    </w:lvl>
+    <w:lvl w:ilvl="8" w:tplc="040C0005" w:tentative="1">
+      <w:start w:val="1"/>
+      <w:numFmt w:val="bullet"/>
+      <w:lvlText w:val=""/>
+      <w:lvlJc w:val="left"/>
+      <w:pPr>
+        <w:ind w:left="6480" w:hanging="360"/>
+      </w:pPr>
+      <w:rPr>
+        <w:rFonts w:ascii="Wingdings" w:hAnsi="Wingdings" w:hint="default"/>
+      </w:rPr>
+    </w:lvl>
+  </w:abstractNum>
+  <w:abstractNum w:abstractNumId="15" w15:restartNumberingAfterBreak="0">
     <w:nsid w:val="45D542C5"/>
     <w:multiLevelType w:val="multilevel"/>
     <w:tmpl w:val="6284FBDE"/>
@@ -3820,7 +5116,7 @@
       </w:rPr>
     </w:lvl>
   </w:abstractNum>
-  <w:abstractNum w:abstractNumId="6" w15:restartNumberingAfterBreak="0">
+  <w:abstractNum w:abstractNumId="16" w15:restartNumberingAfterBreak="0">
     <w:nsid w:val="48F23D79"/>
     <w:multiLevelType w:val="multilevel"/>
     <w:tmpl w:val="049298B6"/>
@@ -3951,7 +5247,7 @@
       </w:rPr>
     </w:lvl>
   </w:abstractNum>
-  <w:abstractNum w:abstractNumId="7" w15:restartNumberingAfterBreak="0">
+  <w:abstractNum w:abstractNumId="17" w15:restartNumberingAfterBreak="0">
     <w:nsid w:val="4B385CB8"/>
     <w:multiLevelType w:val="multilevel"/>
     <w:tmpl w:val="A93031D2"/>
@@ -4064,7 +5360,119 @@
       </w:rPr>
     </w:lvl>
   </w:abstractNum>
-  <w:abstractNum w:abstractNumId="8" w15:restartNumberingAfterBreak="0">
+  <w:abstractNum w:abstractNumId="18" w15:restartNumberingAfterBreak="0">
+    <w:nsid w:val="4B8979BA"/>
+    <w:multiLevelType w:val="hybridMultilevel"/>
+    <w:tmpl w:val="3F586E40"/>
+    <w:lvl w:ilvl="0" w:tplc="B05AF544">
+      <w:numFmt w:val="bullet"/>
+      <w:lvlText w:val="-"/>
+      <w:lvlJc w:val="left"/>
+      <w:pPr>
+        <w:ind w:left="360" w:hanging="360"/>
+      </w:pPr>
+      <w:rPr>
+        <w:rFonts w:ascii="Times" w:eastAsia="Times" w:hAnsi="Times" w:cs="Times" w:hint="default"/>
+      </w:rPr>
+    </w:lvl>
+    <w:lvl w:ilvl="1" w:tplc="040C0003" w:tentative="1">
+      <w:start w:val="1"/>
+      <w:numFmt w:val="bullet"/>
+      <w:lvlText w:val="o"/>
+      <w:lvlJc w:val="left"/>
+      <w:pPr>
+        <w:ind w:left="1080" w:hanging="360"/>
+      </w:pPr>
+      <w:rPr>
+        <w:rFonts w:ascii="Courier New" w:hAnsi="Courier New" w:cs="Courier New" w:hint="default"/>
+      </w:rPr>
+    </w:lvl>
+    <w:lvl w:ilvl="2" w:tplc="040C0005" w:tentative="1">
+      <w:start w:val="1"/>
+      <w:numFmt w:val="bullet"/>
+      <w:lvlText w:val=""/>
+      <w:lvlJc w:val="left"/>
+      <w:pPr>
+        <w:ind w:left="1800" w:hanging="360"/>
+      </w:pPr>
+      <w:rPr>
+        <w:rFonts w:ascii="Wingdings" w:hAnsi="Wingdings" w:hint="default"/>
+      </w:rPr>
+    </w:lvl>
+    <w:lvl w:ilvl="3" w:tplc="040C0001" w:tentative="1">
+      <w:start w:val="1"/>
+      <w:numFmt w:val="bullet"/>
+      <w:lvlText w:val=""/>
+      <w:lvlJc w:val="left"/>
+      <w:pPr>
+        <w:ind w:left="2520" w:hanging="360"/>
+      </w:pPr>
+      <w:rPr>
+        <w:rFonts w:ascii="Symbol" w:hAnsi="Symbol" w:hint="default"/>
+      </w:rPr>
+    </w:lvl>
+    <w:lvl w:ilvl="4" w:tplc="040C0003" w:tentative="1">
+      <w:start w:val="1"/>
+      <w:numFmt w:val="bullet"/>
+      <w:lvlText w:val="o"/>
+      <w:lvlJc w:val="left"/>
+      <w:pPr>
+        <w:ind w:left="3240" w:hanging="360"/>
+      </w:pPr>
+      <w:rPr>
+        <w:rFonts w:ascii="Courier New" w:hAnsi="Courier New" w:cs="Courier New" w:hint="default"/>
+      </w:rPr>
+    </w:lvl>
+    <w:lvl w:ilvl="5" w:tplc="040C0005" w:tentative="1">
+      <w:start w:val="1"/>
+      <w:numFmt w:val="bullet"/>
+      <w:lvlText w:val=""/>
+      <w:lvlJc w:val="left"/>
+      <w:pPr>
+        <w:ind w:left="3960" w:hanging="360"/>
+      </w:pPr>
+      <w:rPr>
+        <w:rFonts w:ascii="Wingdings" w:hAnsi="Wingdings" w:hint="default"/>
+      </w:rPr>
+    </w:lvl>
+    <w:lvl w:ilvl="6" w:tplc="040C0001" w:tentative="1">
+      <w:start w:val="1"/>
+      <w:numFmt w:val="bullet"/>
+      <w:lvlText w:val=""/>
+      <w:lvlJc w:val="left"/>
+      <w:pPr>
+        <w:ind w:left="4680" w:hanging="360"/>
+      </w:pPr>
+      <w:rPr>
+        <w:rFonts w:ascii="Symbol" w:hAnsi="Symbol" w:hint="default"/>
+      </w:rPr>
+    </w:lvl>
+    <w:lvl w:ilvl="7" w:tplc="040C0003" w:tentative="1">
+      <w:start w:val="1"/>
+      <w:numFmt w:val="bullet"/>
+      <w:lvlText w:val="o"/>
+      <w:lvlJc w:val="left"/>
+      <w:pPr>
+        <w:ind w:left="5400" w:hanging="360"/>
+      </w:pPr>
+      <w:rPr>
+        <w:rFonts w:ascii="Courier New" w:hAnsi="Courier New" w:cs="Courier New" w:hint="default"/>
+      </w:rPr>
+    </w:lvl>
+    <w:lvl w:ilvl="8" w:tplc="040C0005" w:tentative="1">
+      <w:start w:val="1"/>
+      <w:numFmt w:val="bullet"/>
+      <w:lvlText w:val=""/>
+      <w:lvlJc w:val="left"/>
+      <w:pPr>
+        <w:ind w:left="6120" w:hanging="360"/>
+      </w:pPr>
+      <w:rPr>
+        <w:rFonts w:ascii="Wingdings" w:hAnsi="Wingdings" w:hint="default"/>
+      </w:rPr>
+    </w:lvl>
+  </w:abstractNum>
+  <w:abstractNum w:abstractNumId="19" w15:restartNumberingAfterBreak="0">
     <w:nsid w:val="546203E4"/>
     <w:multiLevelType w:val="hybridMultilevel"/>
     <w:tmpl w:val="5C4E7B72"/>
@@ -4178,7 +5586,7 @@
       </w:rPr>
     </w:lvl>
   </w:abstractNum>
-  <w:abstractNum w:abstractNumId="9" w15:restartNumberingAfterBreak="0">
+  <w:abstractNum w:abstractNumId="20" w15:restartNumberingAfterBreak="0">
     <w:nsid w:val="562F10E4"/>
     <w:multiLevelType w:val="hybridMultilevel"/>
     <w:tmpl w:val="6F240FFC"/>
@@ -4292,7 +5700,7 @@
       </w:rPr>
     </w:lvl>
   </w:abstractNum>
-  <w:abstractNum w:abstractNumId="10" w15:restartNumberingAfterBreak="0">
+  <w:abstractNum w:abstractNumId="21" w15:restartNumberingAfterBreak="0">
     <w:nsid w:val="57367469"/>
     <w:multiLevelType w:val="hybridMultilevel"/>
     <w:tmpl w:val="50B0E548"/>
@@ -4431,7 +5839,7 @@
       </w:rPr>
     </w:lvl>
   </w:abstractNum>
-  <w:abstractNum w:abstractNumId="11" w15:restartNumberingAfterBreak="0">
+  <w:abstractNum w:abstractNumId="22" w15:restartNumberingAfterBreak="0">
     <w:nsid w:val="58DF35B5"/>
     <w:multiLevelType w:val="hybridMultilevel"/>
     <w:tmpl w:val="42C874F8"/>
@@ -4544,7 +5952,456 @@
       </w:rPr>
     </w:lvl>
   </w:abstractNum>
-  <w:abstractNum w:abstractNumId="12" w15:restartNumberingAfterBreak="0">
+  <w:abstractNum w:abstractNumId="23" w15:restartNumberingAfterBreak="0">
+    <w:nsid w:val="5D1B2635"/>
+    <w:multiLevelType w:val="hybridMultilevel"/>
+    <w:tmpl w:val="173218A6"/>
+    <w:lvl w:ilvl="0" w:tplc="040C0001">
+      <w:start w:val="1"/>
+      <w:numFmt w:val="bullet"/>
+      <w:lvlText w:val=""/>
+      <w:lvlJc w:val="left"/>
+      <w:pPr>
+        <w:ind w:left="720" w:hanging="360"/>
+      </w:pPr>
+      <w:rPr>
+        <w:rFonts w:ascii="Symbol" w:hAnsi="Symbol" w:hint="default"/>
+      </w:rPr>
+    </w:lvl>
+    <w:lvl w:ilvl="1" w:tplc="040C0003" w:tentative="1">
+      <w:start w:val="1"/>
+      <w:numFmt w:val="bullet"/>
+      <w:lvlText w:val="o"/>
+      <w:lvlJc w:val="left"/>
+      <w:pPr>
+        <w:ind w:left="1440" w:hanging="360"/>
+      </w:pPr>
+      <w:rPr>
+        <w:rFonts w:ascii="Courier New" w:hAnsi="Courier New" w:cs="Courier New" w:hint="default"/>
+      </w:rPr>
+    </w:lvl>
+    <w:lvl w:ilvl="2" w:tplc="040C0005" w:tentative="1">
+      <w:start w:val="1"/>
+      <w:numFmt w:val="bullet"/>
+      <w:lvlText w:val=""/>
+      <w:lvlJc w:val="left"/>
+      <w:pPr>
+        <w:ind w:left="2160" w:hanging="360"/>
+      </w:pPr>
+      <w:rPr>
+        <w:rFonts w:ascii="Wingdings" w:hAnsi="Wingdings" w:hint="default"/>
+      </w:rPr>
+    </w:lvl>
+    <w:lvl w:ilvl="3" w:tplc="040C0001" w:tentative="1">
+      <w:start w:val="1"/>
+      <w:numFmt w:val="bullet"/>
+      <w:lvlText w:val=""/>
+      <w:lvlJc w:val="left"/>
+      <w:pPr>
+        <w:ind w:left="2880" w:hanging="360"/>
+      </w:pPr>
+      <w:rPr>
+        <w:rFonts w:ascii="Symbol" w:hAnsi="Symbol" w:hint="default"/>
+      </w:rPr>
+    </w:lvl>
+    <w:lvl w:ilvl="4" w:tplc="040C0003" w:tentative="1">
+      <w:start w:val="1"/>
+      <w:numFmt w:val="bullet"/>
+      <w:lvlText w:val="o"/>
+      <w:lvlJc w:val="left"/>
+      <w:pPr>
+        <w:ind w:left="3600" w:hanging="360"/>
+      </w:pPr>
+      <w:rPr>
+        <w:rFonts w:ascii="Courier New" w:hAnsi="Courier New" w:cs="Courier New" w:hint="default"/>
+      </w:rPr>
+    </w:lvl>
+    <w:lvl w:ilvl="5" w:tplc="040C0005" w:tentative="1">
+      <w:start w:val="1"/>
+      <w:numFmt w:val="bullet"/>
+      <w:lvlText w:val=""/>
+      <w:lvlJc w:val="left"/>
+      <w:pPr>
+        <w:ind w:left="4320" w:hanging="360"/>
+      </w:pPr>
+      <w:rPr>
+        <w:rFonts w:ascii="Wingdings" w:hAnsi="Wingdings" w:hint="default"/>
+      </w:rPr>
+    </w:lvl>
+    <w:lvl w:ilvl="6" w:tplc="040C0001" w:tentative="1">
+      <w:start w:val="1"/>
+      <w:numFmt w:val="bullet"/>
+      <w:lvlText w:val=""/>
+      <w:lvlJc w:val="left"/>
+      <w:pPr>
+        <w:ind w:left="5040" w:hanging="360"/>
+      </w:pPr>
+      <w:rPr>
+        <w:rFonts w:ascii="Symbol" w:hAnsi="Symbol" w:hint="default"/>
+      </w:rPr>
+    </w:lvl>
+    <w:lvl w:ilvl="7" w:tplc="040C0003" w:tentative="1">
+      <w:start w:val="1"/>
+      <w:numFmt w:val="bullet"/>
+      <w:lvlText w:val="o"/>
+      <w:lvlJc w:val="left"/>
+      <w:pPr>
+        <w:ind w:left="5760" w:hanging="360"/>
+      </w:pPr>
+      <w:rPr>
+        <w:rFonts w:ascii="Courier New" w:hAnsi="Courier New" w:cs="Courier New" w:hint="default"/>
+      </w:rPr>
+    </w:lvl>
+    <w:lvl w:ilvl="8" w:tplc="040C0005" w:tentative="1">
+      <w:start w:val="1"/>
+      <w:numFmt w:val="bullet"/>
+      <w:lvlText w:val=""/>
+      <w:lvlJc w:val="left"/>
+      <w:pPr>
+        <w:ind w:left="6480" w:hanging="360"/>
+      </w:pPr>
+      <w:rPr>
+        <w:rFonts w:ascii="Wingdings" w:hAnsi="Wingdings" w:hint="default"/>
+      </w:rPr>
+    </w:lvl>
+  </w:abstractNum>
+  <w:abstractNum w:abstractNumId="24" w15:restartNumberingAfterBreak="0">
+    <w:nsid w:val="699D0C7F"/>
+    <w:multiLevelType w:val="hybridMultilevel"/>
+    <w:tmpl w:val="1200ED04"/>
+    <w:lvl w:ilvl="0" w:tplc="B05AF544">
+      <w:numFmt w:val="bullet"/>
+      <w:lvlText w:val="-"/>
+      <w:lvlJc w:val="left"/>
+      <w:pPr>
+        <w:ind w:left="360" w:hanging="360"/>
+      </w:pPr>
+      <w:rPr>
+        <w:rFonts w:ascii="Times" w:eastAsia="Times" w:hAnsi="Times" w:cs="Times" w:hint="default"/>
+      </w:rPr>
+    </w:lvl>
+    <w:lvl w:ilvl="1" w:tplc="040C0003" w:tentative="1">
+      <w:start w:val="1"/>
+      <w:numFmt w:val="bullet"/>
+      <w:lvlText w:val="o"/>
+      <w:lvlJc w:val="left"/>
+      <w:pPr>
+        <w:ind w:left="1080" w:hanging="360"/>
+      </w:pPr>
+      <w:rPr>
+        <w:rFonts w:ascii="Courier New" w:hAnsi="Courier New" w:cs="Courier New" w:hint="default"/>
+      </w:rPr>
+    </w:lvl>
+    <w:lvl w:ilvl="2" w:tplc="040C0005" w:tentative="1">
+      <w:start w:val="1"/>
+      <w:numFmt w:val="bullet"/>
+      <w:lvlText w:val=""/>
+      <w:lvlJc w:val="left"/>
+      <w:pPr>
+        <w:ind w:left="1800" w:hanging="360"/>
+      </w:pPr>
+      <w:rPr>
+        <w:rFonts w:ascii="Wingdings" w:hAnsi="Wingdings" w:hint="default"/>
+      </w:rPr>
+    </w:lvl>
+    <w:lvl w:ilvl="3" w:tplc="040C0001" w:tentative="1">
+      <w:start w:val="1"/>
+      <w:numFmt w:val="bullet"/>
+      <w:lvlText w:val=""/>
+      <w:lvlJc w:val="left"/>
+      <w:pPr>
+        <w:ind w:left="2520" w:hanging="360"/>
+      </w:pPr>
+      <w:rPr>
+        <w:rFonts w:ascii="Symbol" w:hAnsi="Symbol" w:hint="default"/>
+      </w:rPr>
+    </w:lvl>
+    <w:lvl w:ilvl="4" w:tplc="040C0003" w:tentative="1">
+      <w:start w:val="1"/>
+      <w:numFmt w:val="bullet"/>
+      <w:lvlText w:val="o"/>
+      <w:lvlJc w:val="left"/>
+      <w:pPr>
+        <w:ind w:left="3240" w:hanging="360"/>
+      </w:pPr>
+      <w:rPr>
+        <w:rFonts w:ascii="Courier New" w:hAnsi="Courier New" w:cs="Courier New" w:hint="default"/>
+      </w:rPr>
+    </w:lvl>
+    <w:lvl w:ilvl="5" w:tplc="040C0005" w:tentative="1">
+      <w:start w:val="1"/>
+      <w:numFmt w:val="bullet"/>
+      <w:lvlText w:val=""/>
+      <w:lvlJc w:val="left"/>
+      <w:pPr>
+        <w:ind w:left="3960" w:hanging="360"/>
+      </w:pPr>
+      <w:rPr>
+        <w:rFonts w:ascii="Wingdings" w:hAnsi="Wingdings" w:hint="default"/>
+      </w:rPr>
+    </w:lvl>
+    <w:lvl w:ilvl="6" w:tplc="040C0001" w:tentative="1">
+      <w:start w:val="1"/>
+      <w:numFmt w:val="bullet"/>
+      <w:lvlText w:val=""/>
+      <w:lvlJc w:val="left"/>
+      <w:pPr>
+        <w:ind w:left="4680" w:hanging="360"/>
+      </w:pPr>
+      <w:rPr>
+        <w:rFonts w:ascii="Symbol" w:hAnsi="Symbol" w:hint="default"/>
+      </w:rPr>
+    </w:lvl>
+    <w:lvl w:ilvl="7" w:tplc="040C0003" w:tentative="1">
+      <w:start w:val="1"/>
+      <w:numFmt w:val="bullet"/>
+      <w:lvlText w:val="o"/>
+      <w:lvlJc w:val="left"/>
+      <w:pPr>
+        <w:ind w:left="5400" w:hanging="360"/>
+      </w:pPr>
+      <w:rPr>
+        <w:rFonts w:ascii="Courier New" w:hAnsi="Courier New" w:cs="Courier New" w:hint="default"/>
+      </w:rPr>
+    </w:lvl>
+    <w:lvl w:ilvl="8" w:tplc="040C0005" w:tentative="1">
+      <w:start w:val="1"/>
+      <w:numFmt w:val="bullet"/>
+      <w:lvlText w:val=""/>
+      <w:lvlJc w:val="left"/>
+      <w:pPr>
+        <w:ind w:left="6120" w:hanging="360"/>
+      </w:pPr>
+      <w:rPr>
+        <w:rFonts w:ascii="Wingdings" w:hAnsi="Wingdings" w:hint="default"/>
+      </w:rPr>
+    </w:lvl>
+  </w:abstractNum>
+  <w:abstractNum w:abstractNumId="25" w15:restartNumberingAfterBreak="0">
+    <w:nsid w:val="6F073640"/>
+    <w:multiLevelType w:val="hybridMultilevel"/>
+    <w:tmpl w:val="088E8C00"/>
+    <w:lvl w:ilvl="0" w:tplc="B05AF544">
+      <w:numFmt w:val="bullet"/>
+      <w:lvlText w:val="-"/>
+      <w:lvlJc w:val="left"/>
+      <w:pPr>
+        <w:ind w:left="720" w:hanging="360"/>
+      </w:pPr>
+      <w:rPr>
+        <w:rFonts w:ascii="Times" w:eastAsia="Times" w:hAnsi="Times" w:cs="Times" w:hint="default"/>
+      </w:rPr>
+    </w:lvl>
+    <w:lvl w:ilvl="1" w:tplc="040C0003" w:tentative="1">
+      <w:start w:val="1"/>
+      <w:numFmt w:val="bullet"/>
+      <w:lvlText w:val="o"/>
+      <w:lvlJc w:val="left"/>
+      <w:pPr>
+        <w:ind w:left="1440" w:hanging="360"/>
+      </w:pPr>
+      <w:rPr>
+        <w:rFonts w:ascii="Courier New" w:hAnsi="Courier New" w:cs="Courier New" w:hint="default"/>
+      </w:rPr>
+    </w:lvl>
+    <w:lvl w:ilvl="2" w:tplc="040C0005" w:tentative="1">
+      <w:start w:val="1"/>
+      <w:numFmt w:val="bullet"/>
+      <w:lvlText w:val=""/>
+      <w:lvlJc w:val="left"/>
+      <w:pPr>
+        <w:ind w:left="2160" w:hanging="360"/>
+      </w:pPr>
+      <w:rPr>
+        <w:rFonts w:ascii="Wingdings" w:hAnsi="Wingdings" w:hint="default"/>
+      </w:rPr>
+    </w:lvl>
+    <w:lvl w:ilvl="3" w:tplc="040C0001" w:tentative="1">
+      <w:start w:val="1"/>
+      <w:numFmt w:val="bullet"/>
+      <w:lvlText w:val=""/>
+      <w:lvlJc w:val="left"/>
+      <w:pPr>
+        <w:ind w:left="2880" w:hanging="360"/>
+      </w:pPr>
+      <w:rPr>
+        <w:rFonts w:ascii="Symbol" w:hAnsi="Symbol" w:hint="default"/>
+      </w:rPr>
+    </w:lvl>
+    <w:lvl w:ilvl="4" w:tplc="040C0003" w:tentative="1">
+      <w:start w:val="1"/>
+      <w:numFmt w:val="bullet"/>
+      <w:lvlText w:val="o"/>
+      <w:lvlJc w:val="left"/>
+      <w:pPr>
+        <w:ind w:left="3600" w:hanging="360"/>
+      </w:pPr>
+      <w:rPr>
+        <w:rFonts w:ascii="Courier New" w:hAnsi="Courier New" w:cs="Courier New" w:hint="default"/>
+      </w:rPr>
+    </w:lvl>
+    <w:lvl w:ilvl="5" w:tplc="040C0005" w:tentative="1">
+      <w:start w:val="1"/>
+      <w:numFmt w:val="bullet"/>
+      <w:lvlText w:val=""/>
+      <w:lvlJc w:val="left"/>
+      <w:pPr>
+        <w:ind w:left="4320" w:hanging="360"/>
+      </w:pPr>
+      <w:rPr>
+        <w:rFonts w:ascii="Wingdings" w:hAnsi="Wingdings" w:hint="default"/>
+      </w:rPr>
+    </w:lvl>
+    <w:lvl w:ilvl="6" w:tplc="040C0001" w:tentative="1">
+      <w:start w:val="1"/>
+      <w:numFmt w:val="bullet"/>
+      <w:lvlText w:val=""/>
+      <w:lvlJc w:val="left"/>
+      <w:pPr>
+        <w:ind w:left="5040" w:hanging="360"/>
+      </w:pPr>
+      <w:rPr>
+        <w:rFonts w:ascii="Symbol" w:hAnsi="Symbol" w:hint="default"/>
+      </w:rPr>
+    </w:lvl>
+    <w:lvl w:ilvl="7" w:tplc="040C0003" w:tentative="1">
+      <w:start w:val="1"/>
+      <w:numFmt w:val="bullet"/>
+      <w:lvlText w:val="o"/>
+      <w:lvlJc w:val="left"/>
+      <w:pPr>
+        <w:ind w:left="5760" w:hanging="360"/>
+      </w:pPr>
+      <w:rPr>
+        <w:rFonts w:ascii="Courier New" w:hAnsi="Courier New" w:cs="Courier New" w:hint="default"/>
+      </w:rPr>
+    </w:lvl>
+    <w:lvl w:ilvl="8" w:tplc="040C0005" w:tentative="1">
+      <w:start w:val="1"/>
+      <w:numFmt w:val="bullet"/>
+      <w:lvlText w:val=""/>
+      <w:lvlJc w:val="left"/>
+      <w:pPr>
+        <w:ind w:left="6480" w:hanging="360"/>
+      </w:pPr>
+      <w:rPr>
+        <w:rFonts w:ascii="Wingdings" w:hAnsi="Wingdings" w:hint="default"/>
+      </w:rPr>
+    </w:lvl>
+  </w:abstractNum>
+  <w:abstractNum w:abstractNumId="26" w15:restartNumberingAfterBreak="0">
+    <w:nsid w:val="7244725F"/>
+    <w:multiLevelType w:val="hybridMultilevel"/>
+    <w:tmpl w:val="FE98AA24"/>
+    <w:lvl w:ilvl="0" w:tplc="B05AF544">
+      <w:numFmt w:val="bullet"/>
+      <w:lvlText w:val="-"/>
+      <w:lvlJc w:val="left"/>
+      <w:pPr>
+        <w:ind w:left="720" w:hanging="360"/>
+      </w:pPr>
+      <w:rPr>
+        <w:rFonts w:ascii="Times" w:eastAsia="Times" w:hAnsi="Times" w:cs="Times" w:hint="default"/>
+      </w:rPr>
+    </w:lvl>
+    <w:lvl w:ilvl="1" w:tplc="040C0003" w:tentative="1">
+      <w:start w:val="1"/>
+      <w:numFmt w:val="bullet"/>
+      <w:lvlText w:val="o"/>
+      <w:lvlJc w:val="left"/>
+      <w:pPr>
+        <w:ind w:left="1440" w:hanging="360"/>
+      </w:pPr>
+      <w:rPr>
+        <w:rFonts w:ascii="Courier New" w:hAnsi="Courier New" w:cs="Courier New" w:hint="default"/>
+      </w:rPr>
+    </w:lvl>
+    <w:lvl w:ilvl="2" w:tplc="040C0005" w:tentative="1">
+      <w:start w:val="1"/>
+      <w:numFmt w:val="bullet"/>
+      <w:lvlText w:val=""/>
+      <w:lvlJc w:val="left"/>
+      <w:pPr>
+        <w:ind w:left="2160" w:hanging="360"/>
+      </w:pPr>
+      <w:rPr>
+        <w:rFonts w:ascii="Wingdings" w:hAnsi="Wingdings" w:hint="default"/>
+      </w:rPr>
+    </w:lvl>
+    <w:lvl w:ilvl="3" w:tplc="040C0001" w:tentative="1">
+      <w:start w:val="1"/>
+      <w:numFmt w:val="bullet"/>
+      <w:lvlText w:val=""/>
+      <w:lvlJc w:val="left"/>
+      <w:pPr>
+        <w:ind w:left="2880" w:hanging="360"/>
+      </w:pPr>
+      <w:rPr>
+        <w:rFonts w:ascii="Symbol" w:hAnsi="Symbol" w:hint="default"/>
+      </w:rPr>
+    </w:lvl>
+    <w:lvl w:ilvl="4" w:tplc="040C0003" w:tentative="1">
+      <w:start w:val="1"/>
+      <w:numFmt w:val="bullet"/>
+      <w:lvlText w:val="o"/>
+      <w:lvlJc w:val="left"/>
+      <w:pPr>
+        <w:ind w:left="3600" w:hanging="360"/>
+      </w:pPr>
+      <w:rPr>
+        <w:rFonts w:ascii="Courier New" w:hAnsi="Courier New" w:cs="Courier New" w:hint="default"/>
+      </w:rPr>
+    </w:lvl>
+    <w:lvl w:ilvl="5" w:tplc="040C0005" w:tentative="1">
+      <w:start w:val="1"/>
+      <w:numFmt w:val="bullet"/>
+      <w:lvlText w:val=""/>
+      <w:lvlJc w:val="left"/>
+      <w:pPr>
+        <w:ind w:left="4320" w:hanging="360"/>
+      </w:pPr>
+      <w:rPr>
+        <w:rFonts w:ascii="Wingdings" w:hAnsi="Wingdings" w:hint="default"/>
+      </w:rPr>
+    </w:lvl>
+    <w:lvl w:ilvl="6" w:tplc="040C0001" w:tentative="1">
+      <w:start w:val="1"/>
+      <w:numFmt w:val="bullet"/>
+      <w:lvlText w:val=""/>
+      <w:lvlJc w:val="left"/>
+      <w:pPr>
+        <w:ind w:left="5040" w:hanging="360"/>
+      </w:pPr>
+      <w:rPr>
+        <w:rFonts w:ascii="Symbol" w:hAnsi="Symbol" w:hint="default"/>
+      </w:rPr>
+    </w:lvl>
+    <w:lvl w:ilvl="7" w:tplc="040C0003" w:tentative="1">
+      <w:start w:val="1"/>
+      <w:numFmt w:val="bullet"/>
+      <w:lvlText w:val="o"/>
+      <w:lvlJc w:val="left"/>
+      <w:pPr>
+        <w:ind w:left="5760" w:hanging="360"/>
+      </w:pPr>
+      <w:rPr>
+        <w:rFonts w:ascii="Courier New" w:hAnsi="Courier New" w:cs="Courier New" w:hint="default"/>
+      </w:rPr>
+    </w:lvl>
+    <w:lvl w:ilvl="8" w:tplc="040C0005" w:tentative="1">
+      <w:start w:val="1"/>
+      <w:numFmt w:val="bullet"/>
+      <w:lvlText w:val=""/>
+      <w:lvlJc w:val="left"/>
+      <w:pPr>
+        <w:ind w:left="6480" w:hanging="360"/>
+      </w:pPr>
+      <w:rPr>
+        <w:rFonts w:ascii="Wingdings" w:hAnsi="Wingdings" w:hint="default"/>
+      </w:rPr>
+    </w:lvl>
+  </w:abstractNum>
+  <w:abstractNum w:abstractNumId="27" w15:restartNumberingAfterBreak="0">
     <w:nsid w:val="763B099B"/>
     <w:multiLevelType w:val="multilevel"/>
     <w:tmpl w:val="7772F092"/>
@@ -4658,43 +6515,88 @@
     </w:lvl>
   </w:abstractNum>
   <w:num w:numId="1" w16cid:durableId="825589060">
+    <w:abstractNumId w:val="15"/>
+  </w:num>
+  <w:num w:numId="2" w16cid:durableId="102041419">
+    <w:abstractNumId w:val="12"/>
+  </w:num>
+  <w:num w:numId="3" w16cid:durableId="896815832">
+    <w:abstractNumId w:val="16"/>
+  </w:num>
+  <w:num w:numId="4" w16cid:durableId="548497077">
+    <w:abstractNumId w:val="19"/>
+  </w:num>
+  <w:num w:numId="5" w16cid:durableId="1110012414">
+    <w:abstractNumId w:val="9"/>
+  </w:num>
+  <w:num w:numId="6" w16cid:durableId="1145708365">
+    <w:abstractNumId w:val="20"/>
+  </w:num>
+  <w:num w:numId="7" w16cid:durableId="1248153105">
+    <w:abstractNumId w:val="4"/>
+  </w:num>
+  <w:num w:numId="8" w16cid:durableId="1448348936">
+    <w:abstractNumId w:val="22"/>
+  </w:num>
+  <w:num w:numId="9" w16cid:durableId="638343289">
+    <w:abstractNumId w:val="11"/>
+  </w:num>
+  <w:num w:numId="10" w16cid:durableId="1740133904">
+    <w:abstractNumId w:val="27"/>
+  </w:num>
+  <w:num w:numId="11" w16cid:durableId="1617784306">
+    <w:abstractNumId w:val="6"/>
+  </w:num>
+  <w:num w:numId="12" w16cid:durableId="576520348">
+    <w:abstractNumId w:val="21"/>
+  </w:num>
+  <w:num w:numId="13" w16cid:durableId="792141758">
+    <w:abstractNumId w:val="17"/>
+  </w:num>
+  <w:num w:numId="14" w16cid:durableId="1763185633">
+    <w:abstractNumId w:val="14"/>
+  </w:num>
+  <w:num w:numId="15" w16cid:durableId="1844474115">
+    <w:abstractNumId w:val="23"/>
+  </w:num>
+  <w:num w:numId="16" w16cid:durableId="1914780008">
+    <w:abstractNumId w:val="0"/>
+  </w:num>
+  <w:num w:numId="17" w16cid:durableId="1369796460">
+    <w:abstractNumId w:val="1"/>
+  </w:num>
+  <w:num w:numId="18" w16cid:durableId="945773110">
+    <w:abstractNumId w:val="3"/>
+  </w:num>
+  <w:num w:numId="19" w16cid:durableId="358170270">
+    <w:abstractNumId w:val="26"/>
+  </w:num>
+  <w:num w:numId="20" w16cid:durableId="209419095">
     <w:abstractNumId w:val="5"/>
   </w:num>
-  <w:num w:numId="2" w16cid:durableId="102041419">
-    <w:abstractNumId w:val="4"/>
+  <w:num w:numId="21" w16cid:durableId="2082556023">
+    <w:abstractNumId w:val="18"/>
   </w:num>
-  <w:num w:numId="3" w16cid:durableId="896815832">
-    <w:abstractNumId w:val="6"/>
+  <w:num w:numId="22" w16cid:durableId="1556551397">
+    <w:abstractNumId w:val="2"/>
   </w:num>
-  <w:num w:numId="4" w16cid:durableId="548497077">
+  <w:num w:numId="23" w16cid:durableId="1968049736">
     <w:abstractNumId w:val="8"/>
   </w:num>
-  <w:num w:numId="5" w16cid:durableId="1110012414">
-    <w:abstractNumId w:val="2"/>
+  <w:num w:numId="24" w16cid:durableId="1974407581">
+    <w:abstractNumId w:val="24"/>
   </w:num>
-  <w:num w:numId="6" w16cid:durableId="1145708365">
-    <w:abstractNumId w:val="9"/>
+  <w:num w:numId="25" w16cid:durableId="1572497986">
+    <w:abstractNumId w:val="13"/>
   </w:num>
-  <w:num w:numId="7" w16cid:durableId="1248153105">
-    <w:abstractNumId w:val="0"/>
+  <w:num w:numId="26" w16cid:durableId="1785810991">
+    <w:abstractNumId w:val="25"/>
   </w:num>
-  <w:num w:numId="8" w16cid:durableId="1448348936">
-    <w:abstractNumId w:val="11"/>
+  <w:num w:numId="27" w16cid:durableId="915672351">
+    <w:abstractNumId w:val="7"/>
   </w:num>
-  <w:num w:numId="9" w16cid:durableId="638343289">
-    <w:abstractNumId w:val="3"/>
-  </w:num>
-  <w:num w:numId="10" w16cid:durableId="1740133904">
-    <w:abstractNumId w:val="12"/>
-  </w:num>
-  <w:num w:numId="11" w16cid:durableId="1617784306">
-    <w:abstractNumId w:val="1"/>
-  </w:num>
-  <w:num w:numId="12" w16cid:durableId="576520348">
+  <w:num w:numId="28" w16cid:durableId="961351341">
     <w:abstractNumId w:val="10"/>
-  </w:num>
-  <w:num w:numId="13" w16cid:durableId="792141758">
-    <w:abstractNumId w:val="7"/>
   </w:num>
 </w:numbering>
 </file>
@@ -5166,7 +7068,6 @@
   <w:style w:type="character" w:default="1" w:styleId="Policepardfaut">
     <w:name w:val="Default Paragraph Font"/>
     <w:uiPriority w:val="1"/>
-    <w:semiHidden/>
     <w:unhideWhenUsed/>
   </w:style>
   <w:style w:type="table" w:default="1" w:styleId="TableauNormal">
@@ -5462,6 +7363,20 @@
       <w:lang w:eastAsia="ar-SA"/>
     </w:rPr>
   </w:style>
+  <w:style w:type="paragraph" w:customStyle="1" w:styleId="Standard">
+    <w:name w:val="Standard"/>
+    <w:rsid w:val="00A15F12"/>
+    <w:pPr>
+      <w:suppressAutoHyphens/>
+      <w:autoSpaceDN w:val="0"/>
+      <w:textAlignment w:val="baseline"/>
+    </w:pPr>
+    <w:rPr>
+      <w:rFonts w:ascii="Times" w:eastAsia="Times" w:hAnsi="Times" w:cs="Times"/>
+      <w:kern w:val="3"/>
+      <w:lang w:eastAsia="ar-SA"/>
+    </w:rPr>
+  </w:style>
 </w:styles>
 </file>
 

</xml_diff>

<commit_message>
Harmonize E6 document styling and convert schemas to flow diagrams
</commit_message>
<xml_diff>
--- a/public/Fiche_E6_SPIRINE realisation 1.docx
+++ b/public/Fiche_E6_SPIRINE realisation 1.docx
@@ -2927,141 +2927,159 @@
                 <w:rFonts w:ascii="Arial" w:hAnsi="Arial" w:cs="Arial"/>
                 <w:b/>
                 <w:bCs/>
+                <w:sz w:val="22"/>
               </w:rPr>
               <w:t>Schéma explicatif du flux</w:t>
             </w:r>
             <w:r>
               <w:rPr>
                 <w:rFonts w:ascii="Arial" w:hAnsi="Arial" w:cs="Arial"/>
+                <w:b/>
+                <w:sz w:val="22"/>
               </w:rPr>
               <w:t xml:space="preserve"> :</w:t>
             </w:r>
           </w:p>
           <w:p>
-            <w:pPr>
-              <w:pStyle w:val="Paragraphedeliste"/>
-              <w:numPr>
-                <w:ilvl w:val="0"/>
-                <w:numId w:val="28"/>
-              </w:numPr>
-              <w:rPr>
-                <w:rFonts w:ascii="Arial" w:hAnsi="Arial" w:cs="Arial"/>
-                <w:sz w:val="22"/>
-                <w:szCs w:val="22"/>
-              </w:rPr>
-            </w:pPr>
-            <w:r>
-              <w:rPr>
-                <w:rFonts w:ascii="Arial" w:hAnsi="Arial" w:cs="Arial"/>
-                <w:sz w:val="22"/>
-                <w:szCs w:val="22"/>
-              </w:rPr>
-              <w:t>Importation des tickets</w:t>
-            </w:r>
-          </w:p>
-          <w:p>
-            <w:pPr>
-              <w:pStyle w:val="Paragraphedeliste"/>
-              <w:numPr>
-                <w:ilvl w:val="0"/>
-                <w:numId w:val="28"/>
-              </w:numPr>
-              <w:rPr>
-                <w:rFonts w:ascii="Arial" w:hAnsi="Arial" w:cs="Arial"/>
-                <w:sz w:val="22"/>
-                <w:szCs w:val="22"/>
-              </w:rPr>
-            </w:pPr>
-            <w:r>
-              <w:rPr>
-                <w:rFonts w:ascii="Arial" w:hAnsi="Arial" w:cs="Arial"/>
-                <w:sz w:val="22"/>
-                <w:szCs w:val="22"/>
-              </w:rPr>
-              <w:t>Extraction des données</w:t>
-            </w:r>
-          </w:p>
-          <w:p>
-            <w:pPr>
-              <w:pStyle w:val="Paragraphedeliste"/>
-              <w:numPr>
-                <w:ilvl w:val="0"/>
-                <w:numId w:val="28"/>
-              </w:numPr>
-              <w:rPr>
-                <w:rFonts w:ascii="Arial" w:hAnsi="Arial" w:cs="Arial"/>
-                <w:sz w:val="22"/>
-                <w:szCs w:val="22"/>
-              </w:rPr>
-            </w:pPr>
-            <w:r>
-              <w:rPr>
-                <w:rFonts w:ascii="Arial" w:hAnsi="Arial" w:cs="Arial"/>
-                <w:sz w:val="22"/>
-                <w:szCs w:val="22"/>
-              </w:rPr>
-              <w:t>Nettoyage / normalisation</w:t>
-            </w:r>
-          </w:p>
-          <w:p>
-            <w:pPr>
-              <w:pStyle w:val="Paragraphedeliste"/>
-              <w:numPr>
-                <w:ilvl w:val="0"/>
-                <w:numId w:val="28"/>
-              </w:numPr>
-              <w:rPr>
-                <w:rFonts w:ascii="Arial" w:hAnsi="Arial" w:cs="Arial"/>
-                <w:sz w:val="22"/>
-                <w:szCs w:val="22"/>
-              </w:rPr>
-            </w:pPr>
-            <w:r>
-              <w:rPr>
-                <w:rFonts w:ascii="Arial" w:hAnsi="Arial" w:cs="Arial"/>
-                <w:sz w:val="22"/>
-                <w:szCs w:val="22"/>
-              </w:rPr>
-              <w:t>Vectorisation</w:t>
-            </w:r>
-          </w:p>
-          <w:p>
-            <w:pPr>
-              <w:pStyle w:val="Paragraphedeliste"/>
-              <w:numPr>
-                <w:ilvl w:val="0"/>
-                <w:numId w:val="28"/>
-              </w:numPr>
-              <w:rPr>
-                <w:rFonts w:ascii="Arial" w:hAnsi="Arial" w:cs="Arial"/>
-                <w:sz w:val="22"/>
-                <w:szCs w:val="22"/>
-              </w:rPr>
-            </w:pPr>
-            <w:r>
-              <w:rPr>
-                <w:rFonts w:ascii="Arial" w:hAnsi="Arial" w:cs="Arial"/>
-                <w:sz w:val="22"/>
-                <w:szCs w:val="22"/>
-              </w:rPr>
-              <w:t>Clustering et similarité</w:t>
-            </w:r>
-          </w:p>
-          <w:p>
-            <w:pPr>
-              <w:pStyle w:val="Paragraphedeliste"/>
-              <w:numPr>
-                <w:ilvl w:val="0"/>
-                <w:numId w:val="28"/>
-              </w:numPr>
-            </w:pPr>
-            <w:r>
-              <w:rPr>
-                <w:rFonts w:ascii="Arial" w:hAnsi="Arial" w:cs="Arial"/>
-                <w:sz w:val="22"/>
-                <w:szCs w:val="22"/>
-              </w:rPr>
-              <w:t>6. Résumés thématiques et restitution des résultats</w:t>
+            <w:pPr/>
+            <w:r>
+              <w:rPr>
+                <w:rFonts w:ascii="Arial" w:hAnsi="Arial"/>
+                <w:sz w:val="22"/>
+              </w:rPr>
+              <w:t>[Exports Zendesk XML]</w:t>
+            </w:r>
+          </w:p>
+          <w:p>
+            <w:pPr>
+              <w:jc w:val="center"/>
+            </w:pPr>
+            <w:r>
+              <w:rPr>
+                <w:rFonts w:ascii="Arial" w:hAnsi="Arial"/>
+                <w:sz w:val="22"/>
+              </w:rPr>
+              <w:t>↓</w:t>
+            </w:r>
+          </w:p>
+          <w:p>
+            <w:pPr/>
+            <w:r>
+              <w:rPr>
+                <w:rFonts w:ascii="Arial" w:hAnsi="Arial"/>
+                <w:sz w:val="22"/>
+              </w:rPr>
+              <w:t>[Extraction et parsing (Ruby + Nokogiri)]</w:t>
+            </w:r>
+          </w:p>
+          <w:p>
+            <w:pPr>
+              <w:jc w:val="center"/>
+            </w:pPr>
+            <w:r>
+              <w:rPr>
+                <w:rFonts w:ascii="Arial" w:hAnsi="Arial"/>
+                <w:sz w:val="22"/>
+              </w:rPr>
+              <w:t>↓</w:t>
+            </w:r>
+          </w:p>
+          <w:p>
+            <w:pPr/>
+            <w:r>
+              <w:rPr>
+                <w:rFonts w:ascii="Arial" w:hAnsi="Arial"/>
+                <w:sz w:val="22"/>
+              </w:rPr>
+              <w:t>[Nettoyage / normalisation des tickets]</w:t>
+            </w:r>
+          </w:p>
+          <w:p>
+            <w:pPr>
+              <w:jc w:val="center"/>
+            </w:pPr>
+            <w:r>
+              <w:rPr>
+                <w:rFonts w:ascii="Arial" w:hAnsi="Arial"/>
+                <w:sz w:val="22"/>
+              </w:rPr>
+              <w:t>↓</w:t>
+            </w:r>
+          </w:p>
+          <w:p>
+            <w:pPr/>
+            <w:r>
+              <w:rPr>
+                <w:rFonts w:ascii="Arial" w:hAnsi="Arial"/>
+                <w:sz w:val="22"/>
+              </w:rPr>
+              <w:t>[Vectorisation (embeddings via Ollama)]</w:t>
+            </w:r>
+          </w:p>
+          <w:p>
+            <w:pPr>
+              <w:jc w:val="center"/>
+            </w:pPr>
+            <w:r>
+              <w:rPr>
+                <w:rFonts w:ascii="Arial" w:hAnsi="Arial"/>
+                <w:sz w:val="22"/>
+              </w:rPr>
+              <w:t>↓</w:t>
+            </w:r>
+          </w:p>
+          <w:p>
+            <w:pPr/>
+            <w:r>
+              <w:rPr>
+                <w:rFonts w:ascii="Arial" w:hAnsi="Arial"/>
+                <w:sz w:val="22"/>
+              </w:rPr>
+              <w:t>[Clustering KMeans + similarité cosinus]</w:t>
+            </w:r>
+          </w:p>
+          <w:p>
+            <w:pPr>
+              <w:jc w:val="center"/>
+            </w:pPr>
+            <w:r>
+              <w:rPr>
+                <w:rFonts w:ascii="Arial" w:hAnsi="Arial"/>
+                <w:sz w:val="22"/>
+              </w:rPr>
+              <w:t>↓</w:t>
+            </w:r>
+          </w:p>
+          <w:p>
+            <w:pPr/>
+            <w:r>
+              <w:rPr>
+                <w:rFonts w:ascii="Arial" w:hAnsi="Arial"/>
+                <w:sz w:val="22"/>
+              </w:rPr>
+              <w:t>[Résumés thématiques + reporting]</w:t>
+            </w:r>
+          </w:p>
+          <w:p>
+            <w:pPr>
+              <w:jc w:val="center"/>
+            </w:pPr>
+            <w:r>
+              <w:rPr>
+                <w:rFonts w:ascii="Arial" w:hAnsi="Arial"/>
+                <w:sz w:val="22"/>
+              </w:rPr>
+              <w:t>↓</w:t>
+            </w:r>
+          </w:p>
+          <w:p>
+            <w:pPr/>
+            <w:r>
+              <w:rPr>
+                <w:rFonts w:ascii="Arial" w:hAnsi="Arial"/>
+                <w:sz w:val="22"/>
+              </w:rPr>
+              <w:t>[Restitution pour équipes support / produit]</w:t>
             </w:r>
           </w:p>
         </w:tc>

</xml_diff>

<commit_message>
Update portfolio infographics and documents
</commit_message>
<xml_diff>
--- a/public/Fiche_E6_SPIRINE realisation 1.docx
+++ b/public/Fiche_E6_SPIRINE realisation 1.docx
@@ -426,13 +426,23 @@
               </w:rPr>
               <w:t xml:space="preserve"> </w:t>
             </w:r>
+            <w:proofErr w:type="spellStart"/>
             <w:r>
               <w:rPr>
                 <w:rFonts w:ascii="Arial" w:hAnsi="Arial"/>
                 <w:b/>
                 <w:sz w:val="20"/>
               </w:rPr>
-              <w:t>Spirine Vladimir</w:t>
+              <w:t>Spirine</w:t>
+            </w:r>
+            <w:proofErr w:type="spellEnd"/>
+            <w:r>
+              <w:rPr>
+                <w:rFonts w:ascii="Arial" w:hAnsi="Arial"/>
+                <w:b/>
+                <w:sz w:val="20"/>
+              </w:rPr>
+              <w:t xml:space="preserve"> Vladimir</w:t>
             </w:r>
           </w:p>
         </w:tc>
@@ -1349,7 +1359,13 @@
               <w:rPr>
                 <w:bCs/>
               </w:rPr>
-              <w:t xml:space="preserve"> au format XML, environnement de développement en langage Ruby, accès aux données nécessaires provenant du service support, ainsi que des outils locaux d’analyse et de traitement intégrant un modèle de langage (LLM) pour l’exploitation automatisée des informations.</w:t>
+              <w:t xml:space="preserve"> au format XM</w:t>
+            </w:r>
+            <w:r>
+              <w:rPr>
+                <w:bCs/>
+              </w:rPr>
+              <w:t>L.</w:t>
             </w:r>
           </w:p>
           <w:p>
@@ -1409,82 +1425,129 @@
               <w:right w:val="single" w:sz="4" w:space="0" w:color="auto"/>
             </w:tcBorders>
           </w:tcPr>
-          <w:p>
-            <w:pPr>
-              <w:rPr>
-                <w:rFonts w:ascii="Arial" w:hAnsi="Arial" w:cs="Arial"/>
-                <w:b/>
-                <w:bCs/>
-              </w:rPr>
-            </w:pPr>
-            <w:r>
-              <w:rPr>
-                <w:rFonts w:ascii="Arial" w:hAnsi="Arial" w:cs="Arial"/>
-                <w:b/>
-                <w:bCs/>
-              </w:rPr>
-              <w:lastRenderedPageBreak/>
+          <w:p/>
+          <w:p>
+            <w:r>
+              <w:rPr>
+                <w:rFonts w:ascii="Arial" w:hAnsi="Arial"/>
+                <w:b/>
+                <w:sz w:val="22"/>
+              </w:rPr>
               <w:t>Description des ressources documentaires, matérielles et logicielles utilisées</w:t>
             </w:r>
           </w:p>
           <w:p>
-            <w:pPr>
-              <w:rPr>
-                <w:rFonts w:ascii="Arial" w:hAnsi="Arial" w:cs="Arial"/>
-                <w:b/>
-                <w:bCs/>
-              </w:rPr>
-            </w:pPr>
-            <w:r>
-              <w:rPr>
-                <w:rFonts w:ascii="Arial" w:hAnsi="Arial" w:cs="Arial"/>
-                <w:b/>
-                <w:bCs/>
+            <w:r>
+              <w:rPr>
+                <w:rFonts w:ascii="Arial" w:hAnsi="Arial"/>
+                <w:b/>
+                <w:sz w:val="22"/>
               </w:rPr>
               <w:t>Ressources documentaires :</w:t>
             </w:r>
           </w:p>
           <w:p>
-            <w:pPr>
-              <w:rPr>
-                <w:rFonts w:ascii="Arial" w:hAnsi="Arial" w:cs="Arial"/>
-                <w:sz w:val="22"/>
-                <w:szCs w:val="22"/>
-              </w:rPr>
-            </w:pPr>
-            <w:r>
-              <w:rPr>
-                <w:rFonts w:ascii="Arial" w:hAnsi="Arial" w:cs="Arial"/>
-                <w:sz w:val="22"/>
-                <w:szCs w:val="22"/>
-              </w:rPr>
-              <w:t>Les ressources documentaires mobilisées comprennent la documentation officielle de Ruby, la documentation de la bibliothèque Nokogiri pour le traitement XML/HTML, la documentation de l’API Zendesk pour l’exploitation des tickets, ainsi que la documentation d’Ollama (utilisé comme API locale pour orchestrer les LLM employés pour la vectorisation et la génération de résumés thématiques). La documentation Git a également été utilisée, en complément des échanges avec les utilisateurs et de l’analyse des besoins métier liés au traitement des tickets.</w:t>
-            </w:r>
-          </w:p>
-          <w:p>
-            <w:pPr>
-              <w:rPr>
-                <w:rFonts w:ascii="Arial" w:hAnsi="Arial" w:cs="Arial"/>
-                <w:sz w:val="22"/>
-                <w:szCs w:val="22"/>
-              </w:rPr>
-            </w:pPr>
-          </w:p>
-          <w:p>
-            <w:pPr>
-              <w:rPr>
-                <w:rFonts w:ascii="Arial" w:hAnsi="Arial" w:cs="Arial"/>
-                <w:b/>
-                <w:bCs/>
-              </w:rPr>
-            </w:pPr>
-            <w:r>
-              <w:rPr>
-                <w:rFonts w:ascii="Arial" w:hAnsi="Arial" w:cs="Arial"/>
-                <w:b/>
-                <w:bCs/>
+            <w:r>
+              <w:rPr>
+                <w:rFonts w:ascii="Arial" w:hAnsi="Arial"/>
+                <w:sz w:val="22"/>
+              </w:rPr>
+              <w:t xml:space="preserve">Documentation officielle Ruby ; documentation </w:t>
+            </w:r>
+            <w:proofErr w:type="spellStart"/>
+            <w:r>
+              <w:rPr>
+                <w:rFonts w:ascii="Arial" w:hAnsi="Arial"/>
+                <w:sz w:val="22"/>
+              </w:rPr>
+              <w:t>Nokogiri</w:t>
+            </w:r>
+            <w:proofErr w:type="spellEnd"/>
+            <w:r>
+              <w:rPr>
+                <w:rFonts w:ascii="Arial" w:hAnsi="Arial"/>
+                <w:sz w:val="22"/>
+              </w:rPr>
+              <w:t xml:space="preserve"> (XML/HTML) ; documentation API </w:t>
+            </w:r>
+            <w:proofErr w:type="spellStart"/>
+            <w:r>
+              <w:rPr>
+                <w:rFonts w:ascii="Arial" w:hAnsi="Arial"/>
+                <w:sz w:val="22"/>
+              </w:rPr>
+              <w:t>Zendesk</w:t>
+            </w:r>
+            <w:proofErr w:type="spellEnd"/>
+            <w:r>
+              <w:rPr>
+                <w:rFonts w:ascii="Arial" w:hAnsi="Arial"/>
+                <w:sz w:val="22"/>
+              </w:rPr>
+              <w:t xml:space="preserve"> v2 ; documentation </w:t>
+            </w:r>
+            <w:proofErr w:type="spellStart"/>
+            <w:r>
+              <w:rPr>
+                <w:rFonts w:ascii="Arial" w:hAnsi="Arial"/>
+                <w:sz w:val="22"/>
+              </w:rPr>
+              <w:t>Ollama</w:t>
+            </w:r>
+            <w:proofErr w:type="spellEnd"/>
+            <w:r>
+              <w:rPr>
+                <w:rFonts w:ascii="Arial" w:hAnsi="Arial"/>
+                <w:sz w:val="22"/>
+              </w:rPr>
+              <w:t xml:space="preserve"> (API locale pour LLM) ; documentation Git ; échanges avec les utilisateurs métier.</w:t>
+            </w:r>
+          </w:p>
+          <w:p>
+            <w:r>
+              <w:rPr>
+                <w:rFonts w:ascii="Arial" w:hAnsi="Arial"/>
+                <w:b/>
+                <w:sz w:val="22"/>
               </w:rPr>
               <w:t>Ressources matérielles :</w:t>
+            </w:r>
+          </w:p>
+          <w:p>
+            <w:r>
+              <w:rPr>
+                <w:rFonts w:ascii="Arial" w:hAnsi="Arial"/>
+                <w:sz w:val="22"/>
+              </w:rPr>
+              <w:t>Ordinateur de développement dédié au projet ;</w:t>
+            </w:r>
+          </w:p>
+          <w:p>
+            <w:r>
+              <w:rPr>
+                <w:rFonts w:ascii="Arial" w:hAnsi="Arial"/>
+                <w:sz w:val="22"/>
+              </w:rPr>
+              <w:t>Environnement local de test et d’exécution ;</w:t>
+            </w:r>
+          </w:p>
+          <w:p>
+            <w:r>
+              <w:rPr>
+                <w:rFonts w:ascii="Arial" w:hAnsi="Arial"/>
+                <w:sz w:val="22"/>
+              </w:rPr>
+              <w:t>Poste configuré pour les traitements de données et l’exécution locale des modèles.</w:t>
+            </w:r>
+          </w:p>
+          <w:p>
+            <w:r>
+              <w:rPr>
+                <w:rFonts w:ascii="Arial" w:hAnsi="Arial"/>
+                <w:b/>
+                <w:sz w:val="22"/>
+              </w:rPr>
+              <w:t>Ressources logicielles (versions utilisées) :</w:t>
             </w:r>
           </w:p>
           <w:p>
@@ -1492,21 +1555,15 @@
               <w:pStyle w:val="Paragraphedeliste"/>
               <w:numPr>
                 <w:ilvl w:val="0"/>
-                <w:numId w:val="14"/>
+                <w:numId w:val="34"/>
               </w:numPr>
-              <w:rPr>
-                <w:rFonts w:ascii="Arial" w:hAnsi="Arial" w:cs="Arial"/>
-                <w:sz w:val="22"/>
-                <w:szCs w:val="22"/>
-              </w:rPr>
             </w:pPr>
             <w:r>
               <w:rPr>
-                <w:rFonts w:ascii="Arial" w:hAnsi="Arial" w:cs="Arial"/>
-                <w:sz w:val="22"/>
-                <w:szCs w:val="22"/>
-              </w:rPr>
-              <w:t>Ordinateur de développement dédié au projet ;</w:t>
+                <w:rFonts w:ascii="Arial" w:hAnsi="Arial"/>
+                <w:sz w:val="22"/>
+              </w:rPr>
+              <w:t>Ruby 3.3.10p183 ;</w:t>
             </w:r>
           </w:p>
           <w:p>
@@ -1514,155 +1571,230 @@
               <w:pStyle w:val="Paragraphedeliste"/>
               <w:numPr>
                 <w:ilvl w:val="0"/>
-                <w:numId w:val="14"/>
+                <w:numId w:val="34"/>
               </w:numPr>
               <w:rPr>
-                <w:rFonts w:ascii="Arial" w:hAnsi="Arial" w:cs="Arial"/>
-                <w:sz w:val="22"/>
-                <w:szCs w:val="22"/>
+                <w:lang w:val="en-US"/>
               </w:rPr>
             </w:pPr>
             <w:r>
               <w:rPr>
-                <w:rFonts w:ascii="Arial" w:hAnsi="Arial" w:cs="Arial"/>
-                <w:sz w:val="22"/>
-                <w:szCs w:val="22"/>
-              </w:rPr>
-              <w:t>Environnement local de test et d’exécution ;</w:t>
-            </w:r>
+                <w:rFonts w:ascii="Arial" w:hAnsi="Arial"/>
+                <w:sz w:val="22"/>
+                <w:lang w:val="en-US"/>
+              </w:rPr>
+              <w:t xml:space="preserve">Bundler </w:t>
+            </w:r>
+            <w:proofErr w:type="gramStart"/>
+            <w:r>
+              <w:rPr>
+                <w:rFonts w:ascii="Arial" w:hAnsi="Arial"/>
+                <w:sz w:val="22"/>
+                <w:lang w:val="en-US"/>
+              </w:rPr>
+              <w:t>2.5.23 ;</w:t>
+            </w:r>
+            <w:proofErr w:type="gramEnd"/>
           </w:p>
           <w:p>
             <w:pPr>
               <w:pStyle w:val="Paragraphedeliste"/>
               <w:numPr>
                 <w:ilvl w:val="0"/>
-                <w:numId w:val="14"/>
+                <w:numId w:val="34"/>
               </w:numPr>
               <w:rPr>
-                <w:rFonts w:ascii="Arial" w:hAnsi="Arial" w:cs="Arial"/>
-                <w:sz w:val="22"/>
-                <w:szCs w:val="22"/>
+                <w:lang w:val="en-US"/>
               </w:rPr>
             </w:pPr>
-            <w:r>
-              <w:rPr>
-                <w:rFonts w:ascii="Arial" w:hAnsi="Arial" w:cs="Arial"/>
-                <w:sz w:val="22"/>
-                <w:szCs w:val="22"/>
-              </w:rPr>
-              <w:t>Poste configuré pour les traitements de données et l’exécution locale des modèles.</w:t>
-            </w:r>
-          </w:p>
-          <w:p>
-            <w:pPr>
-              <w:rPr>
-                <w:rFonts w:ascii="Arial" w:hAnsi="Arial" w:cs="Arial"/>
-              </w:rPr>
-            </w:pPr>
-          </w:p>
-          <w:p>
-            <w:pPr>
-              <w:rPr>
-                <w:rFonts w:ascii="Arial" w:hAnsi="Arial" w:cs="Arial"/>
-                <w:b/>
-                <w:bCs/>
-              </w:rPr>
-            </w:pPr>
-            <w:r>
-              <w:rPr>
-                <w:rFonts w:ascii="Arial" w:hAnsi="Arial" w:cs="Arial"/>
-                <w:b/>
-                <w:bCs/>
-              </w:rPr>
-              <w:t>Ressources logicielles :</w:t>
-            </w:r>
+            <w:proofErr w:type="spellStart"/>
+            <w:r>
+              <w:rPr>
+                <w:rFonts w:ascii="Arial" w:hAnsi="Arial"/>
+                <w:sz w:val="22"/>
+                <w:lang w:val="en-US"/>
+              </w:rPr>
+              <w:t>Nokogiri</w:t>
+            </w:r>
+            <w:proofErr w:type="spellEnd"/>
+            <w:r>
+              <w:rPr>
+                <w:rFonts w:ascii="Arial" w:hAnsi="Arial"/>
+                <w:sz w:val="22"/>
+                <w:lang w:val="en-US"/>
+              </w:rPr>
+              <w:t xml:space="preserve"> </w:t>
+            </w:r>
+            <w:proofErr w:type="gramStart"/>
+            <w:r>
+              <w:rPr>
+                <w:rFonts w:ascii="Arial" w:hAnsi="Arial"/>
+                <w:sz w:val="22"/>
+                <w:lang w:val="en-US"/>
+              </w:rPr>
+              <w:t>1.19.1 ;</w:t>
+            </w:r>
+            <w:proofErr w:type="gramEnd"/>
           </w:p>
           <w:p>
             <w:pPr>
               <w:pStyle w:val="Paragraphedeliste"/>
               <w:numPr>
                 <w:ilvl w:val="0"/>
-                <w:numId w:val="15"/>
+                <w:numId w:val="34"/>
               </w:numPr>
               <w:rPr>
-                <w:rFonts w:ascii="Arial" w:hAnsi="Arial" w:cs="Arial"/>
-                <w:sz w:val="22"/>
-                <w:szCs w:val="22"/>
+                <w:lang w:val="en-US"/>
               </w:rPr>
             </w:pPr>
-            <w:r>
-              <w:rPr>
-                <w:rFonts w:ascii="Arial" w:hAnsi="Arial" w:cs="Arial"/>
-                <w:sz w:val="22"/>
-                <w:szCs w:val="22"/>
-              </w:rPr>
-              <w:t>Ruby (version 3.x utilisée sur le projet) ;</w:t>
-            </w:r>
+            <w:proofErr w:type="spellStart"/>
+            <w:r>
+              <w:rPr>
+                <w:rFonts w:ascii="Arial" w:hAnsi="Arial"/>
+                <w:sz w:val="22"/>
+                <w:lang w:val="en-US"/>
+              </w:rPr>
+              <w:t>HTTParty</w:t>
+            </w:r>
+            <w:proofErr w:type="spellEnd"/>
+            <w:r>
+              <w:rPr>
+                <w:rFonts w:ascii="Arial" w:hAnsi="Arial"/>
+                <w:sz w:val="22"/>
+                <w:lang w:val="en-US"/>
+              </w:rPr>
+              <w:t xml:space="preserve"> </w:t>
+            </w:r>
+            <w:proofErr w:type="gramStart"/>
+            <w:r>
+              <w:rPr>
+                <w:rFonts w:ascii="Arial" w:hAnsi="Arial"/>
+                <w:sz w:val="22"/>
+                <w:lang w:val="en-US"/>
+              </w:rPr>
+              <w:t>0.24.2 ;</w:t>
+            </w:r>
+            <w:proofErr w:type="gramEnd"/>
           </w:p>
           <w:p>
             <w:pPr>
               <w:pStyle w:val="Paragraphedeliste"/>
               <w:numPr>
                 <w:ilvl w:val="0"/>
-                <w:numId w:val="15"/>
+                <w:numId w:val="34"/>
               </w:numPr>
               <w:rPr>
-                <w:rFonts w:ascii="Arial" w:hAnsi="Arial" w:cs="Arial"/>
-                <w:sz w:val="22"/>
-                <w:szCs w:val="22"/>
+                <w:lang w:val="en-US"/>
               </w:rPr>
             </w:pPr>
-            <w:r>
-              <w:rPr>
-                <w:rFonts w:ascii="Arial" w:hAnsi="Arial" w:cs="Arial"/>
-                <w:sz w:val="22"/>
-                <w:szCs w:val="22"/>
-              </w:rPr>
-              <w:t>Nokogiri pour le traitement XML/HTML ;</w:t>
-            </w:r>
+            <w:proofErr w:type="spellStart"/>
+            <w:r>
+              <w:rPr>
+                <w:rFonts w:ascii="Arial" w:hAnsi="Arial"/>
+                <w:sz w:val="22"/>
+                <w:lang w:val="en-US"/>
+              </w:rPr>
+              <w:t>dotenv</w:t>
+            </w:r>
+            <w:proofErr w:type="spellEnd"/>
+            <w:r>
+              <w:rPr>
+                <w:rFonts w:ascii="Arial" w:hAnsi="Arial"/>
+                <w:sz w:val="22"/>
+                <w:lang w:val="en-US"/>
+              </w:rPr>
+              <w:t xml:space="preserve"> </w:t>
+            </w:r>
+            <w:proofErr w:type="gramStart"/>
+            <w:r>
+              <w:rPr>
+                <w:rFonts w:ascii="Arial" w:hAnsi="Arial"/>
+                <w:sz w:val="22"/>
+                <w:lang w:val="en-US"/>
+              </w:rPr>
+              <w:t>3.2.0 ;</w:t>
+            </w:r>
+            <w:proofErr w:type="gramEnd"/>
           </w:p>
           <w:p>
             <w:pPr>
               <w:pStyle w:val="Paragraphedeliste"/>
               <w:numPr>
                 <w:ilvl w:val="0"/>
-                <w:numId w:val="15"/>
+                <w:numId w:val="34"/>
               </w:numPr>
               <w:rPr>
-                <w:rFonts w:ascii="Arial" w:hAnsi="Arial" w:cs="Arial"/>
-                <w:sz w:val="22"/>
-                <w:szCs w:val="22"/>
+                <w:lang w:val="en-US"/>
               </w:rPr>
             </w:pPr>
-            <w:r>
-              <w:rPr>
-                <w:rFonts w:ascii="Arial" w:hAnsi="Arial" w:cs="Arial"/>
-                <w:sz w:val="22"/>
-                <w:szCs w:val="22"/>
-              </w:rPr>
-              <w:t>API Zendesk pour la récupération et l’exploitation des tickets ;</w:t>
-            </w:r>
+            <w:proofErr w:type="spellStart"/>
+            <w:r>
+              <w:rPr>
+                <w:rFonts w:ascii="Arial" w:hAnsi="Arial"/>
+                <w:sz w:val="22"/>
+                <w:lang w:val="en-US"/>
+              </w:rPr>
+              <w:t>numo-narray</w:t>
+            </w:r>
+            <w:proofErr w:type="spellEnd"/>
+            <w:r>
+              <w:rPr>
+                <w:rFonts w:ascii="Arial" w:hAnsi="Arial"/>
+                <w:sz w:val="22"/>
+                <w:lang w:val="en-US"/>
+              </w:rPr>
+              <w:t xml:space="preserve"> </w:t>
+            </w:r>
+            <w:proofErr w:type="gramStart"/>
+            <w:r>
+              <w:rPr>
+                <w:rFonts w:ascii="Arial" w:hAnsi="Arial"/>
+                <w:sz w:val="22"/>
+                <w:lang w:val="en-US"/>
+              </w:rPr>
+              <w:t>0.9.2.1 ;</w:t>
+            </w:r>
+            <w:proofErr w:type="gramEnd"/>
           </w:p>
           <w:p>
             <w:pPr>
               <w:pStyle w:val="Paragraphedeliste"/>
               <w:numPr>
                 <w:ilvl w:val="0"/>
-                <w:numId w:val="15"/>
+                <w:numId w:val="34"/>
               </w:numPr>
-              <w:rPr>
-                <w:rFonts w:ascii="Arial" w:hAnsi="Arial" w:cs="Arial"/>
-                <w:sz w:val="22"/>
-                <w:szCs w:val="22"/>
-              </w:rPr>
             </w:pPr>
-            <w:r>
-              <w:rPr>
-                <w:rFonts w:ascii="Arial" w:hAnsi="Arial" w:cs="Arial"/>
-                <w:sz w:val="22"/>
-                <w:szCs w:val="22"/>
-              </w:rPr>
-              <w:t>Ollama comme API locale donnant accès aux LLM utilisés pour la vectorisation et les résumés thématiques ;</w:t>
+            <w:proofErr w:type="spellStart"/>
+            <w:r>
+              <w:rPr>
+                <w:rFonts w:ascii="Arial" w:hAnsi="Arial"/>
+                <w:sz w:val="22"/>
+              </w:rPr>
+              <w:t>Rumale</w:t>
+            </w:r>
+            <w:proofErr w:type="spellEnd"/>
+            <w:r>
+              <w:rPr>
+                <w:rFonts w:ascii="Arial" w:hAnsi="Arial"/>
+                <w:sz w:val="22"/>
+              </w:rPr>
+              <w:t xml:space="preserve"> 2.1.0 (algorithmes de clustering, dont </w:t>
+            </w:r>
+            <w:proofErr w:type="spellStart"/>
+            <w:r>
+              <w:rPr>
+                <w:rFonts w:ascii="Arial" w:hAnsi="Arial"/>
+                <w:sz w:val="22"/>
+              </w:rPr>
+              <w:t>KMeans</w:t>
+            </w:r>
+            <w:proofErr w:type="spellEnd"/>
+            <w:r>
+              <w:rPr>
+                <w:rFonts w:ascii="Arial" w:hAnsi="Arial"/>
+                <w:sz w:val="22"/>
+              </w:rPr>
+              <w:t>) ;</w:t>
             </w:r>
           </w:p>
           <w:p>
@@ -1670,21 +1802,24 @@
               <w:pStyle w:val="Paragraphedeliste"/>
               <w:numPr>
                 <w:ilvl w:val="0"/>
-                <w:numId w:val="15"/>
+                <w:numId w:val="34"/>
               </w:numPr>
-              <w:rPr>
-                <w:rFonts w:ascii="Arial" w:hAnsi="Arial" w:cs="Arial"/>
-                <w:sz w:val="22"/>
-                <w:szCs w:val="22"/>
-              </w:rPr>
             </w:pPr>
-            <w:r>
-              <w:rPr>
-                <w:rFonts w:ascii="Arial" w:hAnsi="Arial" w:cs="Arial"/>
-                <w:sz w:val="22"/>
-                <w:szCs w:val="22"/>
-              </w:rPr>
-              <w:t>Git pour le versionnement ;</w:t>
+            <w:proofErr w:type="spellStart"/>
+            <w:r>
+              <w:rPr>
+                <w:rFonts w:ascii="Arial" w:hAnsi="Arial"/>
+                <w:sz w:val="22"/>
+              </w:rPr>
+              <w:t>Ollama</w:t>
+            </w:r>
+            <w:proofErr w:type="spellEnd"/>
+            <w:r>
+              <w:rPr>
+                <w:rFonts w:ascii="Arial" w:hAnsi="Arial"/>
+                <w:sz w:val="22"/>
+              </w:rPr>
+              <w:t xml:space="preserve"> (client 0.18.0) comme API locale pour piloter les LLM ;</w:t>
             </w:r>
           </w:p>
           <w:p>
@@ -1692,41 +1827,93 @@
               <w:pStyle w:val="Paragraphedeliste"/>
               <w:numPr>
                 <w:ilvl w:val="0"/>
-                <w:numId w:val="15"/>
+                <w:numId w:val="34"/>
               </w:numPr>
               <w:rPr>
-                <w:rFonts w:ascii="Arial" w:hAnsi="Arial" w:cs="Arial"/>
-                <w:sz w:val="22"/>
-                <w:szCs w:val="22"/>
+                <w:lang w:val="en-US"/>
               </w:rPr>
             </w:pPr>
             <w:r>
               <w:rPr>
-                <w:rFonts w:ascii="Arial" w:hAnsi="Arial" w:cs="Arial"/>
-                <w:sz w:val="22"/>
-                <w:szCs w:val="22"/>
-              </w:rPr>
-              <w:t>Visual Studio Code comme environnement de développement ;</w:t>
-            </w:r>
+                <w:rFonts w:ascii="Arial" w:hAnsi="Arial"/>
+                <w:sz w:val="22"/>
+                <w:lang w:val="en-US"/>
+              </w:rPr>
+              <w:t>API Zendesk v</w:t>
+            </w:r>
+            <w:proofErr w:type="gramStart"/>
+            <w:r>
+              <w:rPr>
+                <w:rFonts w:ascii="Arial" w:hAnsi="Arial"/>
+                <w:sz w:val="22"/>
+                <w:lang w:val="en-US"/>
+              </w:rPr>
+              <w:t>2 ;</w:t>
+            </w:r>
+            <w:proofErr w:type="gramEnd"/>
           </w:p>
           <w:p>
             <w:pPr>
               <w:pStyle w:val="Paragraphedeliste"/>
               <w:numPr>
                 <w:ilvl w:val="0"/>
-                <w:numId w:val="15"/>
+                <w:numId w:val="34"/>
               </w:numPr>
               <w:rPr>
-                <w:rFonts w:ascii="Arial" w:hAnsi="Arial" w:cs="Arial"/>
+                <w:lang w:val="en-US"/>
               </w:rPr>
             </w:pPr>
             <w:r>
               <w:rPr>
-                <w:rFonts w:ascii="Arial" w:hAnsi="Arial" w:cs="Arial"/>
-                <w:sz w:val="22"/>
-                <w:szCs w:val="22"/>
-              </w:rPr>
-              <w:t>Outils d’analyse de données (scripts Ruby, clustering KMeans, similarité cosinus, génération de rapports).</w:t>
+                <w:rFonts w:ascii="Arial" w:hAnsi="Arial"/>
+                <w:sz w:val="22"/>
+                <w:lang w:val="en-US"/>
+              </w:rPr>
+              <w:t>Git 2.49.</w:t>
+            </w:r>
+            <w:proofErr w:type="gramStart"/>
+            <w:r>
+              <w:rPr>
+                <w:rFonts w:ascii="Arial" w:hAnsi="Arial"/>
+                <w:sz w:val="22"/>
+                <w:lang w:val="en-US"/>
+              </w:rPr>
+              <w:t>0.windows</w:t>
+            </w:r>
+            <w:proofErr w:type="gramEnd"/>
+            <w:r>
+              <w:rPr>
+                <w:rFonts w:ascii="Arial" w:hAnsi="Arial"/>
+                <w:sz w:val="22"/>
+                <w:lang w:val="en-US"/>
+              </w:rPr>
+              <w:t>.</w:t>
+            </w:r>
+            <w:proofErr w:type="gramStart"/>
+            <w:r>
+              <w:rPr>
+                <w:rFonts w:ascii="Arial" w:hAnsi="Arial"/>
+                <w:sz w:val="22"/>
+                <w:lang w:val="en-US"/>
+              </w:rPr>
+              <w:t>1 ;</w:t>
+            </w:r>
+            <w:proofErr w:type="gramEnd"/>
+          </w:p>
+          <w:p>
+            <w:pPr>
+              <w:pStyle w:val="Paragraphedeliste"/>
+              <w:numPr>
+                <w:ilvl w:val="0"/>
+                <w:numId w:val="34"/>
+              </w:numPr>
+            </w:pPr>
+            <w:r>
+              <w:rPr>
+                <w:rFonts w:ascii="Arial" w:hAnsi="Arial"/>
+                <w:sz w:val="22"/>
+              </w:rPr>
+              <w:t>Visual Studio Code 1.115.0.</w:t>
             </w:r>
           </w:p>
         </w:tc>
@@ -1747,44 +1934,83 @@
               <w:right w:val="single" w:sz="4" w:space="0" w:color="auto"/>
             </w:tcBorders>
           </w:tcPr>
-          <w:p>
-            <w:pPr>
-              <w:rPr>
-                <w:rFonts w:ascii="Arial" w:hAnsi="Arial" w:cs="Arial"/>
-                <w:b/>
-                <w:bCs/>
-              </w:rPr>
-            </w:pPr>
-            <w:r>
-              <w:rPr>
-                <w:rFonts w:ascii="Arial" w:hAnsi="Arial" w:cs="Arial"/>
-                <w:b/>
-                <w:bCs/>
+          <w:p/>
+          <w:p>
+            <w:r>
+              <w:rPr>
+                <w:rFonts w:ascii="Arial" w:hAnsi="Arial"/>
+                <w:b/>
+                <w:sz w:val="22"/>
               </w:rPr>
               <w:t>Modalités d’accès aux productions et à leur documentation</w:t>
             </w:r>
           </w:p>
           <w:p>
-            <w:pPr>
-              <w:rPr>
-                <w:rFonts w:ascii="Arial" w:hAnsi="Arial" w:cs="Arial"/>
-              </w:rPr>
-            </w:pPr>
-            <w:r>
-              <w:rPr>
-                <w:rFonts w:ascii="Arial" w:hAnsi="Arial" w:cs="Arial"/>
-                <w:b/>
-                <w:bCs/>
-                <w:i/>
-                <w:iCs/>
-              </w:rPr>
-              <w:t>Code source</w:t>
-            </w:r>
-            <w:r>
-              <w:rPr>
-                <w:rFonts w:ascii="Arial" w:hAnsi="Arial" w:cs="Arial"/>
-              </w:rPr>
-              <w:t xml:space="preserve"> :</w:t>
+            <w:r>
+              <w:rPr>
+                <w:rFonts w:ascii="Arial" w:hAnsi="Arial"/>
+                <w:b/>
+                <w:sz w:val="22"/>
+              </w:rPr>
+              <w:t>Code source :</w:t>
+            </w:r>
+          </w:p>
+          <w:p>
+            <w:r>
+              <w:rPr>
+                <w:rFonts w:ascii="Arial" w:hAnsi="Arial"/>
+                <w:sz w:val="22"/>
+              </w:rPr>
+              <w:t xml:space="preserve">Dépôt GitHub du projet : </w:t>
+            </w:r>
+            <w:hyperlink r:id="rId8" w:history="1">
+              <w:r>
+                <w:rPr>
+                  <w:rStyle w:val="Lienhypertexte"/>
+                  <w:rFonts w:ascii="Arial" w:hAnsi="Arial"/>
+                  <w:sz w:val="22"/>
+                </w:rPr>
+                <w:t>https://github.com/Farounaga/rb_tkts</w:t>
+              </w:r>
+            </w:hyperlink>
+          </w:p>
+          <w:p>
+            <w:r>
+              <w:rPr>
+                <w:rFonts w:ascii="Arial" w:hAnsi="Arial"/>
+                <w:b/>
+                <w:sz w:val="22"/>
+              </w:rPr>
+              <w:t>Documentation du projet :</w:t>
+            </w:r>
+          </w:p>
+          <w:p>
+            <w:r>
+              <w:rPr>
+                <w:rFonts w:ascii="Arial" w:hAnsi="Arial"/>
+                <w:sz w:val="22"/>
+              </w:rPr>
+              <w:t xml:space="preserve">Dossier documentaire partagé : </w:t>
+            </w:r>
+            <w:hyperlink r:id="rId9" w:history="1">
+              <w:r>
+                <w:rPr>
+                  <w:rStyle w:val="Lienhypertexte"/>
+                  <w:rFonts w:ascii="Arial" w:hAnsi="Arial"/>
+                  <w:sz w:val="22"/>
+                </w:rPr>
+                <w:t>https://drive.google.com/drive/folders/1ZjLn7umvwE_GNQ66TI6o1gSbzg24q19d?usp=drive_link</w:t>
+              </w:r>
+            </w:hyperlink>
+          </w:p>
+          <w:p>
+            <w:r>
+              <w:rPr>
+                <w:rFonts w:ascii="Arial" w:hAnsi="Arial"/>
+                <w:b/>
+                <w:sz w:val="22"/>
+              </w:rPr>
+              <w:t>Documents disponibles :</w:t>
             </w:r>
           </w:p>
           <w:p>
@@ -1792,38 +2018,15 @@
               <w:pStyle w:val="Paragraphedeliste"/>
               <w:numPr>
                 <w:ilvl w:val="0"/>
-                <w:numId w:val="19"/>
+                <w:numId w:val="33"/>
               </w:numPr>
-              <w:rPr>
-                <w:rFonts w:ascii="Arial" w:hAnsi="Arial" w:cs="Arial"/>
-                <w:sz w:val="22"/>
-                <w:szCs w:val="22"/>
-              </w:rPr>
             </w:pPr>
             <w:r>
               <w:rPr>
-                <w:rFonts w:ascii="Arial" w:hAnsi="Arial" w:cs="Arial"/>
-                <w:sz w:val="22"/>
-                <w:szCs w:val="22"/>
-              </w:rPr>
-              <w:t>Dépôt GitHub du projet : https://github.com/Farounaga/rb_tkts</w:t>
-            </w:r>
-          </w:p>
-          <w:p>
-            <w:pPr>
-              <w:rPr>
-                <w:rFonts w:ascii="Arial" w:hAnsi="Arial" w:cs="Arial"/>
-                <w:b/>
-                <w:bCs/>
-              </w:rPr>
-            </w:pPr>
-            <w:r>
-              <w:rPr>
-                <w:rFonts w:ascii="Arial" w:hAnsi="Arial" w:cs="Arial"/>
-                <w:b/>
-                <w:bCs/>
-              </w:rPr>
-              <w:t>Documentation du projet :</w:t>
+                <w:rFonts w:ascii="Arial" w:hAnsi="Arial"/>
+                <w:sz w:val="22"/>
+              </w:rPr>
+              <w:t>Schéma de base de données</w:t>
             </w:r>
           </w:p>
           <w:p>
@@ -1831,38 +2034,15 @@
               <w:pStyle w:val="Paragraphedeliste"/>
               <w:numPr>
                 <w:ilvl w:val="0"/>
-                <w:numId w:val="18"/>
+                <w:numId w:val="33"/>
               </w:numPr>
-              <w:rPr>
-                <w:rFonts w:ascii="Arial" w:hAnsi="Arial" w:cs="Arial"/>
-                <w:sz w:val="22"/>
-                <w:szCs w:val="22"/>
-              </w:rPr>
             </w:pPr>
             <w:r>
               <w:rPr>
-                <w:rFonts w:ascii="Arial" w:hAnsi="Arial" w:cs="Arial"/>
-                <w:sz w:val="22"/>
-                <w:szCs w:val="22"/>
-              </w:rPr>
-              <w:t>Dossier documentaire partagé (Drive / interne) : lien à compléter</w:t>
-            </w:r>
-          </w:p>
-          <w:p>
-            <w:pPr>
-              <w:rPr>
-                <w:rFonts w:ascii="Arial" w:hAnsi="Arial" w:cs="Arial"/>
-                <w:b/>
-                <w:bCs/>
-              </w:rPr>
-            </w:pPr>
-            <w:r>
-              <w:rPr>
-                <w:rFonts w:ascii="Arial" w:hAnsi="Arial" w:cs="Arial"/>
-                <w:b/>
-                <w:bCs/>
-              </w:rPr>
-              <w:t>Documents disponibles :</w:t>
+                <w:rFonts w:ascii="Arial" w:hAnsi="Arial"/>
+                <w:sz w:val="22"/>
+              </w:rPr>
+              <w:t>Cahier des spécifications / cahier des charges</w:t>
             </w:r>
           </w:p>
           <w:p>
@@ -1870,21 +2050,15 @@
               <w:pStyle w:val="Paragraphedeliste"/>
               <w:numPr>
                 <w:ilvl w:val="0"/>
-                <w:numId w:val="17"/>
+                <w:numId w:val="33"/>
               </w:numPr>
-              <w:rPr>
-                <w:rFonts w:ascii="Arial" w:hAnsi="Arial" w:cs="Arial"/>
-                <w:sz w:val="22"/>
-                <w:szCs w:val="22"/>
-              </w:rPr>
             </w:pPr>
             <w:r>
               <w:rPr>
-                <w:rFonts w:ascii="Arial" w:hAnsi="Arial" w:cs="Arial"/>
-                <w:sz w:val="22"/>
-                <w:szCs w:val="22"/>
-              </w:rPr>
-              <w:t>Schéma de la base de données (BDD)</w:t>
+                <w:rFonts w:ascii="Arial" w:hAnsi="Arial"/>
+                <w:sz w:val="22"/>
+              </w:rPr>
+              <w:t>Cahier de tests</w:t>
             </w:r>
           </w:p>
           <w:p>
@@ -1892,21 +2066,15 @@
               <w:pStyle w:val="Paragraphedeliste"/>
               <w:numPr>
                 <w:ilvl w:val="0"/>
-                <w:numId w:val="17"/>
+                <w:numId w:val="33"/>
               </w:numPr>
-              <w:rPr>
-                <w:rFonts w:ascii="Arial" w:hAnsi="Arial" w:cs="Arial"/>
-                <w:sz w:val="22"/>
-                <w:szCs w:val="22"/>
-              </w:rPr>
             </w:pPr>
             <w:r>
               <w:rPr>
-                <w:rFonts w:ascii="Arial" w:hAnsi="Arial" w:cs="Arial"/>
-                <w:sz w:val="22"/>
-                <w:szCs w:val="22"/>
-              </w:rPr>
-              <w:t>Cahier des spécifications / cahier des charges</w:t>
+                <w:rFonts w:ascii="Arial" w:hAnsi="Arial"/>
+                <w:sz w:val="22"/>
+              </w:rPr>
+              <w:t>Documentation technique</w:t>
             </w:r>
           </w:p>
           <w:p>
@@ -1914,21 +2082,15 @@
               <w:pStyle w:val="Paragraphedeliste"/>
               <w:numPr>
                 <w:ilvl w:val="0"/>
-                <w:numId w:val="17"/>
+                <w:numId w:val="33"/>
               </w:numPr>
-              <w:rPr>
-                <w:rFonts w:ascii="Arial" w:hAnsi="Arial" w:cs="Arial"/>
-                <w:sz w:val="22"/>
-                <w:szCs w:val="22"/>
-              </w:rPr>
             </w:pPr>
             <w:r>
               <w:rPr>
-                <w:rFonts w:ascii="Arial" w:hAnsi="Arial" w:cs="Arial"/>
-                <w:sz w:val="22"/>
-                <w:szCs w:val="22"/>
-              </w:rPr>
-              <w:t>Cahier de tests</w:t>
+                <w:rFonts w:ascii="Arial" w:hAnsi="Arial"/>
+                <w:sz w:val="22"/>
+              </w:rPr>
+              <w:t>Documentation utilisateur</w:t>
             </w:r>
           </w:p>
           <w:p>
@@ -1936,61 +2098,13 @@
               <w:pStyle w:val="Paragraphedeliste"/>
               <w:numPr>
                 <w:ilvl w:val="0"/>
-                <w:numId w:val="17"/>
+                <w:numId w:val="33"/>
               </w:numPr>
-              <w:rPr>
-                <w:rFonts w:ascii="Arial" w:hAnsi="Arial" w:cs="Arial"/>
-                <w:sz w:val="22"/>
-                <w:szCs w:val="22"/>
-              </w:rPr>
             </w:pPr>
             <w:r>
               <w:rPr>
-                <w:rFonts w:ascii="Arial" w:hAnsi="Arial" w:cs="Arial"/>
-                <w:sz w:val="22"/>
-                <w:szCs w:val="22"/>
-              </w:rPr>
-              <w:t>Documentation technique</w:t>
-            </w:r>
-          </w:p>
-          <w:p>
-            <w:pPr>
-              <w:pStyle w:val="Paragraphedeliste"/>
-              <w:numPr>
-                <w:ilvl w:val="0"/>
-                <w:numId w:val="17"/>
-              </w:numPr>
-              <w:rPr>
-                <w:rFonts w:ascii="Arial" w:hAnsi="Arial" w:cs="Arial"/>
-                <w:sz w:val="22"/>
-                <w:szCs w:val="22"/>
-              </w:rPr>
-            </w:pPr>
-            <w:r>
-              <w:rPr>
-                <w:rFonts w:ascii="Arial" w:hAnsi="Arial" w:cs="Arial"/>
-                <w:sz w:val="22"/>
-                <w:szCs w:val="22"/>
-              </w:rPr>
-              <w:t>Documentation utilisateur</w:t>
-            </w:r>
-          </w:p>
-          <w:p>
-            <w:pPr>
-              <w:pStyle w:val="Paragraphedeliste"/>
-              <w:numPr>
-                <w:ilvl w:val="0"/>
-                <w:numId w:val="17"/>
-              </w:numPr>
-              <w:rPr>
-                <w:rFonts w:ascii="Arial" w:hAnsi="Arial" w:cs="Arial"/>
-              </w:rPr>
-            </w:pPr>
-            <w:r>
-              <w:rPr>
-                <w:rFonts w:ascii="Arial" w:hAnsi="Arial" w:cs="Arial"/>
-                <w:sz w:val="22"/>
-                <w:szCs w:val="22"/>
+                <w:rFonts w:ascii="Arial" w:hAnsi="Arial"/>
+                <w:sz w:val="22"/>
               </w:rPr>
               <w:t>Guides d’exploitation</w:t>
             </w:r>
@@ -2247,18 +2361,6 @@
         </w:tc>
       </w:tr>
     </w:tbl>
-    <w:p>
-      <w:pPr>
-        <w:outlineLvl w:val="0"/>
-        <w:rPr>
-          <w:rFonts w:ascii="Arial" w:hAnsi="Arial" w:cs="Arial"/>
-          <w:bCs/>
-          <w:sz w:val="11"/>
-          <w:szCs w:val="11"/>
-          <w:u w:val="single"/>
-        </w:rPr>
-      </w:pPr>
-    </w:p>
     <w:tbl>
       <w:tblPr>
         <w:tblW w:w="9923" w:type="dxa"/>
@@ -2304,9 +2406,10 @@
               <w:rPr>
                 <w:rFonts w:ascii="Arial" w:hAnsi="Arial" w:cs="Arial"/>
                 <w:b/>
-                <w:sz w:val="20"/>
+                <w:sz w:val="22"/>
                 <w:szCs w:val="20"/>
               </w:rPr>
+              <w:lastRenderedPageBreak/>
               <w:t>Descriptif de la réalisation professionnelle, y compris les productions réalisées et schémas explicatifs</w:t>
             </w:r>
           </w:p>
@@ -2323,6 +2426,7 @@
                 <w:rFonts w:ascii="Arial" w:hAnsi="Arial" w:cs="Arial"/>
                 <w:b/>
                 <w:bCs/>
+                <w:sz w:val="22"/>
               </w:rPr>
               <w:t>Contexte</w:t>
             </w:r>
@@ -2421,6 +2525,7 @@
                 <w:rFonts w:ascii="Arial" w:hAnsi="Arial" w:cs="Arial"/>
                 <w:b/>
                 <w:bCs/>
+                <w:sz w:val="22"/>
               </w:rPr>
               <w:t>Objectif de la réalisation</w:t>
             </w:r>
@@ -2445,15 +2550,7 @@
                 <w:sz w:val="22"/>
                 <w:szCs w:val="22"/>
               </w:rPr>
-              <w:t>C</w:t>
-            </w:r>
-            <w:r>
-              <w:rPr>
-                <w:rFonts w:ascii="Arial" w:hAnsi="Arial" w:cs="Arial"/>
-                <w:sz w:val="22"/>
-                <w:szCs w:val="22"/>
-              </w:rPr>
-              <w:t>oncevoir et développer un outil Ruby d’analyse de tickets permettant d’automatiser la chaîne de traitement, depuis l’import des données jusqu’à la restitution d’indicateurs utiles aux équipes support et produit.</w:t>
+              <w:t>Concevoir et développer un outil Ruby d’analyse de tickets permettant d’automatiser la chaîne de traitement, depuis l’import des données jusqu’à la restitution d’indicateurs utiles aux équipes support et produit.</w:t>
             </w:r>
           </w:p>
           <w:p>
@@ -2474,6 +2571,7 @@
                 <w:rFonts w:ascii="Arial" w:hAnsi="Arial" w:cs="Arial"/>
                 <w:b/>
                 <w:bCs/>
+                <w:sz w:val="22"/>
               </w:rPr>
               <w:t>Méthodologie de travail mise en œuvre</w:t>
             </w:r>
@@ -2489,7 +2587,7 @@
               <w:pStyle w:val="Paragraphedeliste"/>
               <w:numPr>
                 <w:ilvl w:val="0"/>
-                <w:numId w:val="21"/>
+                <w:numId w:val="32"/>
               </w:numPr>
               <w:rPr>
                 <w:rFonts w:ascii="Arial" w:hAnsi="Arial" w:cs="Arial"/>
@@ -2511,7 +2609,7 @@
               <w:pStyle w:val="Paragraphedeliste"/>
               <w:numPr>
                 <w:ilvl w:val="0"/>
-                <w:numId w:val="21"/>
+                <w:numId w:val="32"/>
               </w:numPr>
               <w:rPr>
                 <w:rFonts w:ascii="Arial" w:hAnsi="Arial" w:cs="Arial"/>
@@ -2525,7 +2623,43 @@
                 <w:sz w:val="22"/>
                 <w:szCs w:val="22"/>
               </w:rPr>
-              <w:t>Découpage en modules (import, parsing, nettoyage, vectorisation, clustering, similarité, reporting) ;</w:t>
+              <w:t xml:space="preserve">Découpage en modules (import, </w:t>
+            </w:r>
+            <w:proofErr w:type="spellStart"/>
+            <w:r>
+              <w:rPr>
+                <w:rFonts w:ascii="Arial" w:hAnsi="Arial" w:cs="Arial"/>
+                <w:sz w:val="22"/>
+                <w:szCs w:val="22"/>
+              </w:rPr>
+              <w:t>parsing</w:t>
+            </w:r>
+            <w:proofErr w:type="spellEnd"/>
+            <w:r>
+              <w:rPr>
+                <w:rFonts w:ascii="Arial" w:hAnsi="Arial" w:cs="Arial"/>
+                <w:sz w:val="22"/>
+                <w:szCs w:val="22"/>
+              </w:rPr>
+              <w:t xml:space="preserve">, nettoyage, vectorisation, clustering, similarité, </w:t>
+            </w:r>
+            <w:proofErr w:type="spellStart"/>
+            <w:r>
+              <w:rPr>
+                <w:rFonts w:ascii="Arial" w:hAnsi="Arial" w:cs="Arial"/>
+                <w:sz w:val="22"/>
+                <w:szCs w:val="22"/>
+              </w:rPr>
+              <w:t>reporting</w:t>
+            </w:r>
+            <w:proofErr w:type="spellEnd"/>
+            <w:r>
+              <w:rPr>
+                <w:rFonts w:ascii="Arial" w:hAnsi="Arial" w:cs="Arial"/>
+                <w:sz w:val="22"/>
+                <w:szCs w:val="22"/>
+              </w:rPr>
+              <w:t>) ;</w:t>
             </w:r>
           </w:p>
           <w:p>
@@ -2533,7 +2667,7 @@
               <w:pStyle w:val="Paragraphedeliste"/>
               <w:numPr>
                 <w:ilvl w:val="0"/>
-                <w:numId w:val="21"/>
+                <w:numId w:val="32"/>
               </w:numPr>
               <w:rPr>
                 <w:rFonts w:ascii="Arial" w:hAnsi="Arial" w:cs="Arial"/>
@@ -2555,7 +2689,7 @@
               <w:pStyle w:val="Paragraphedeliste"/>
               <w:numPr>
                 <w:ilvl w:val="0"/>
-                <w:numId w:val="21"/>
+                <w:numId w:val="32"/>
               </w:numPr>
               <w:rPr>
                 <w:rFonts w:ascii="Arial" w:hAnsi="Arial" w:cs="Arial"/>
@@ -2593,7 +2727,7 @@
               <w:pStyle w:val="Paragraphedeliste"/>
               <w:numPr>
                 <w:ilvl w:val="0"/>
-                <w:numId w:val="21"/>
+                <w:numId w:val="32"/>
               </w:numPr>
               <w:rPr>
                 <w:rFonts w:ascii="Arial" w:hAnsi="Arial" w:cs="Arial"/>
@@ -2628,6 +2762,7 @@
                 <w:rFonts w:ascii="Arial" w:hAnsi="Arial" w:cs="Arial"/>
                 <w:b/>
                 <w:bCs/>
+                <w:sz w:val="22"/>
               </w:rPr>
               <w:t>Architecture de la solution</w:t>
             </w:r>
@@ -2643,7 +2778,7 @@
               <w:pStyle w:val="Paragraphedeliste"/>
               <w:numPr>
                 <w:ilvl w:val="0"/>
-                <w:numId w:val="21"/>
+                <w:numId w:val="31"/>
               </w:numPr>
               <w:rPr>
                 <w:rFonts w:ascii="Arial" w:hAnsi="Arial" w:cs="Arial"/>
@@ -2657,7 +2792,25 @@
                 <w:sz w:val="22"/>
                 <w:szCs w:val="22"/>
               </w:rPr>
-              <w:t>Source de données : exports de tickets Zendesk (XML) ;</w:t>
+              <w:t xml:space="preserve">Source de données : exports de tickets </w:t>
+            </w:r>
+            <w:proofErr w:type="spellStart"/>
+            <w:r>
+              <w:rPr>
+                <w:rFonts w:ascii="Arial" w:hAnsi="Arial" w:cs="Arial"/>
+                <w:sz w:val="22"/>
+                <w:szCs w:val="22"/>
+              </w:rPr>
+              <w:t>Zendesk</w:t>
+            </w:r>
+            <w:proofErr w:type="spellEnd"/>
+            <w:r>
+              <w:rPr>
+                <w:rFonts w:ascii="Arial" w:hAnsi="Arial" w:cs="Arial"/>
+                <w:sz w:val="22"/>
+                <w:szCs w:val="22"/>
+              </w:rPr>
+              <w:t xml:space="preserve"> (XML) ;</w:t>
             </w:r>
           </w:p>
           <w:p>
@@ -2665,7 +2818,7 @@
               <w:pStyle w:val="Paragraphedeliste"/>
               <w:numPr>
                 <w:ilvl w:val="0"/>
-                <w:numId w:val="21"/>
+                <w:numId w:val="31"/>
               </w:numPr>
               <w:rPr>
                 <w:rFonts w:ascii="Arial" w:hAnsi="Arial" w:cs="Arial"/>
@@ -2679,7 +2832,25 @@
                 <w:sz w:val="22"/>
                 <w:szCs w:val="22"/>
               </w:rPr>
-              <w:t>Couche de traitement : scripts Ruby + Nokogiri pour l’extraction et la normalisation ;</w:t>
+              <w:t xml:space="preserve">Couche de traitement : scripts Ruby + </w:t>
+            </w:r>
+            <w:proofErr w:type="spellStart"/>
+            <w:r>
+              <w:rPr>
+                <w:rFonts w:ascii="Arial" w:hAnsi="Arial" w:cs="Arial"/>
+                <w:sz w:val="22"/>
+                <w:szCs w:val="22"/>
+              </w:rPr>
+              <w:t>Nokogiri</w:t>
+            </w:r>
+            <w:proofErr w:type="spellEnd"/>
+            <w:r>
+              <w:rPr>
+                <w:rFonts w:ascii="Arial" w:hAnsi="Arial" w:cs="Arial"/>
+                <w:sz w:val="22"/>
+                <w:szCs w:val="22"/>
+              </w:rPr>
+              <w:t xml:space="preserve"> pour l’extraction et la normalisation ;</w:t>
             </w:r>
           </w:p>
           <w:p>
@@ -2687,7 +2858,7 @@
               <w:pStyle w:val="Paragraphedeliste"/>
               <w:numPr>
                 <w:ilvl w:val="0"/>
-                <w:numId w:val="21"/>
+                <w:numId w:val="31"/>
               </w:numPr>
               <w:rPr>
                 <w:rFonts w:ascii="Arial" w:hAnsi="Arial" w:cs="Arial"/>
@@ -2701,7 +2872,25 @@
                 <w:sz w:val="22"/>
                 <w:szCs w:val="22"/>
               </w:rPr>
-              <w:t>Couche IA locale : Ollama utilisé comme API locale pour piloter les LLM servant à la vectorisation et à la génération de résumés thématiques ;</w:t>
+              <w:t xml:space="preserve">Couche IA locale : </w:t>
+            </w:r>
+            <w:proofErr w:type="spellStart"/>
+            <w:r>
+              <w:rPr>
+                <w:rFonts w:ascii="Arial" w:hAnsi="Arial" w:cs="Arial"/>
+                <w:sz w:val="22"/>
+                <w:szCs w:val="22"/>
+              </w:rPr>
+              <w:t>Ollama</w:t>
+            </w:r>
+            <w:proofErr w:type="spellEnd"/>
+            <w:r>
+              <w:rPr>
+                <w:rFonts w:ascii="Arial" w:hAnsi="Arial" w:cs="Arial"/>
+                <w:sz w:val="22"/>
+                <w:szCs w:val="22"/>
+              </w:rPr>
+              <w:t xml:space="preserve"> utilisé comme API locale pour piloter les LLM servant à la vectorisation et à la génération de résumés thématiques ;</w:t>
             </w:r>
           </w:p>
           <w:p>
@@ -2709,7 +2898,7 @@
               <w:pStyle w:val="Paragraphedeliste"/>
               <w:numPr>
                 <w:ilvl w:val="0"/>
-                <w:numId w:val="21"/>
+                <w:numId w:val="31"/>
               </w:numPr>
               <w:rPr>
                 <w:rFonts w:ascii="Arial" w:hAnsi="Arial" w:cs="Arial"/>
@@ -2723,7 +2912,25 @@
                 <w:sz w:val="22"/>
                 <w:szCs w:val="22"/>
               </w:rPr>
-              <w:t>Couche analytique : clustering KMeans + calcul de similarité cosinus ;</w:t>
+              <w:t xml:space="preserve">Couche analytique : clustering </w:t>
+            </w:r>
+            <w:proofErr w:type="spellStart"/>
+            <w:r>
+              <w:rPr>
+                <w:rFonts w:ascii="Arial" w:hAnsi="Arial" w:cs="Arial"/>
+                <w:sz w:val="22"/>
+                <w:szCs w:val="22"/>
+              </w:rPr>
+              <w:t>KMeans</w:t>
+            </w:r>
+            <w:proofErr w:type="spellEnd"/>
+            <w:r>
+              <w:rPr>
+                <w:rFonts w:ascii="Arial" w:hAnsi="Arial" w:cs="Arial"/>
+                <w:sz w:val="22"/>
+                <w:szCs w:val="22"/>
+              </w:rPr>
+              <w:t xml:space="preserve"> + calcul de similarité cosinus ;</w:t>
             </w:r>
           </w:p>
           <w:p>
@@ -2731,7 +2938,7 @@
               <w:pStyle w:val="Paragraphedeliste"/>
               <w:numPr>
                 <w:ilvl w:val="0"/>
-                <w:numId w:val="21"/>
+                <w:numId w:val="31"/>
               </w:numPr>
               <w:rPr>
                 <w:rFonts w:ascii="Arial" w:hAnsi="Arial" w:cs="Arial"/>
@@ -2766,6 +2973,7 @@
                 <w:rFonts w:ascii="Arial" w:hAnsi="Arial" w:cs="Arial"/>
                 <w:b/>
                 <w:bCs/>
+                <w:sz w:val="22"/>
               </w:rPr>
               <w:t>Modalités de déploiement</w:t>
             </w:r>
@@ -2801,22 +3009,138 @@
             </w:pPr>
           </w:p>
           <w:p>
+            <w:proofErr w:type="spellStart"/>
+            <w:r>
+              <w:rPr>
+                <w:rFonts w:ascii="Arial" w:hAnsi="Arial"/>
+                <w:b/>
+                <w:sz w:val="22"/>
+              </w:rPr>
+              <w:t>Deploiement</w:t>
+            </w:r>
+            <w:proofErr w:type="spellEnd"/>
+          </w:p>
+          <w:p>
             <w:pPr>
               <w:rPr>
-                <w:rFonts w:ascii="Arial" w:hAnsi="Arial" w:cs="Arial"/>
+                <w:rFonts w:ascii="Arial" w:hAnsi="Arial"/>
+                <w:sz w:val="22"/>
               </w:rPr>
             </w:pPr>
             <w:r>
               <w:rPr>
+                <w:rFonts w:ascii="Arial" w:hAnsi="Arial"/>
+                <w:sz w:val="22"/>
+              </w:rPr>
+              <w:t xml:space="preserve">Exécution en environnement local/interne via scripts Ruby versionnés et </w:t>
+            </w:r>
+            <w:proofErr w:type="gramStart"/>
+            <w:r>
+              <w:rPr>
+                <w:rFonts w:ascii="Arial" w:hAnsi="Arial"/>
+                <w:sz w:val="22"/>
+              </w:rPr>
+              <w:t>configuration .</w:t>
+            </w:r>
+            <w:proofErr w:type="gramEnd"/>
+            <w:r>
+              <w:rPr>
+                <w:rFonts w:ascii="Arial" w:hAnsi="Arial"/>
+                <w:sz w:val="22"/>
+              </w:rPr>
+              <w:t>env.</w:t>
+            </w:r>
+          </w:p>
+          <w:p/>
+          <w:p>
+            <w:proofErr w:type="spellStart"/>
+            <w:r>
+              <w:rPr>
+                <w:rFonts w:ascii="Arial" w:hAnsi="Arial"/>
+                <w:b/>
+                <w:sz w:val="22"/>
+              </w:rPr>
+              <w:t>Securité</w:t>
+            </w:r>
+            <w:proofErr w:type="spellEnd"/>
+          </w:p>
+          <w:p>
+            <w:pPr>
+              <w:rPr>
+                <w:rFonts w:ascii="Arial" w:hAnsi="Arial"/>
+                <w:sz w:val="22"/>
+              </w:rPr>
+            </w:pPr>
+            <w:r>
+              <w:rPr>
+                <w:rFonts w:ascii="Arial" w:hAnsi="Arial"/>
+                <w:sz w:val="22"/>
+              </w:rPr>
+              <w:t>Secrets/API keys hors dépôt Git, accès interne contrôlé, minimisation des données traitées.</w:t>
+            </w:r>
+          </w:p>
+          <w:p/>
+          <w:p>
+            <w:r>
+              <w:rPr>
+                <w:rFonts w:ascii="Arial" w:hAnsi="Arial"/>
+                <w:b/>
+                <w:sz w:val="22"/>
+              </w:rPr>
+              <w:t>Test</w:t>
+            </w:r>
+          </w:p>
+          <w:p>
+            <w:pPr>
+              <w:rPr>
+                <w:rFonts w:ascii="Arial" w:hAnsi="Arial"/>
+                <w:sz w:val="22"/>
+              </w:rPr>
+            </w:pPr>
+            <w:r>
+              <w:rPr>
+                <w:rFonts w:ascii="Arial" w:hAnsi="Arial"/>
+                <w:sz w:val="22"/>
+              </w:rPr>
+              <w:t>Tests automatiques (</w:t>
+            </w:r>
+            <w:proofErr w:type="spellStart"/>
+            <w:r>
+              <w:rPr>
+                <w:rFonts w:ascii="Arial" w:hAnsi="Arial"/>
+                <w:sz w:val="22"/>
+              </w:rPr>
+              <w:t>rspec</w:t>
+            </w:r>
+            <w:proofErr w:type="spellEnd"/>
+            <w:r>
+              <w:rPr>
+                <w:rFonts w:ascii="Arial" w:hAnsi="Arial"/>
+                <w:sz w:val="22"/>
+              </w:rPr>
+              <w:t>) et manuels, validations fonctionnelles sur exports réels, contrôle des clusters/similarités/résumés, validation métier.</w:t>
+            </w:r>
+          </w:p>
+          <w:p/>
+          <w:p>
+            <w:pPr>
+              <w:rPr>
+                <w:rFonts w:ascii="Arial" w:hAnsi="Arial" w:cs="Arial"/>
+              </w:rPr>
+            </w:pPr>
+            <w:r>
+              <w:rPr>
                 <w:rFonts w:ascii="Arial" w:hAnsi="Arial" w:cs="Arial"/>
                 <w:b/>
                 <w:bCs/>
+                <w:sz w:val="22"/>
               </w:rPr>
               <w:t>Productions réalisées</w:t>
             </w:r>
             <w:r>
               <w:rPr>
                 <w:rFonts w:ascii="Arial" w:hAnsi="Arial" w:cs="Arial"/>
+                <w:sz w:val="22"/>
               </w:rPr>
               <w:t xml:space="preserve"> :</w:t>
             </w:r>
@@ -2826,7 +3150,7 @@
               <w:pStyle w:val="Paragraphedeliste"/>
               <w:numPr>
                 <w:ilvl w:val="0"/>
-                <w:numId w:val="24"/>
+                <w:numId w:val="30"/>
               </w:numPr>
               <w:rPr>
                 <w:rFonts w:ascii="Arial" w:hAnsi="Arial" w:cs="Arial"/>
@@ -2848,7 +3172,7 @@
               <w:pStyle w:val="Paragraphedeliste"/>
               <w:numPr>
                 <w:ilvl w:val="0"/>
-                <w:numId w:val="24"/>
+                <w:numId w:val="30"/>
               </w:numPr>
               <w:rPr>
                 <w:rFonts w:ascii="Arial" w:hAnsi="Arial" w:cs="Arial"/>
@@ -2870,7 +3194,7 @@
               <w:pStyle w:val="Paragraphedeliste"/>
               <w:numPr>
                 <w:ilvl w:val="0"/>
-                <w:numId w:val="24"/>
+                <w:numId w:val="30"/>
               </w:numPr>
               <w:rPr>
                 <w:rFonts w:ascii="Arial" w:hAnsi="Arial" w:cs="Arial"/>
@@ -2884,7 +3208,25 @@
                 <w:sz w:val="22"/>
                 <w:szCs w:val="22"/>
               </w:rPr>
-              <w:t>Mise en place des traitements IA/clusterisation ;</w:t>
+              <w:t>Mise en place des traitements IA/</w:t>
+            </w:r>
+            <w:proofErr w:type="spellStart"/>
+            <w:r>
+              <w:rPr>
+                <w:rFonts w:ascii="Arial" w:hAnsi="Arial" w:cs="Arial"/>
+                <w:sz w:val="22"/>
+                <w:szCs w:val="22"/>
+              </w:rPr>
+              <w:t>clusterisation</w:t>
+            </w:r>
+            <w:proofErr w:type="spellEnd"/>
+            <w:r>
+              <w:rPr>
+                <w:rFonts w:ascii="Arial" w:hAnsi="Arial" w:cs="Arial"/>
+                <w:sz w:val="22"/>
+                <w:szCs w:val="22"/>
+              </w:rPr>
+              <w:t xml:space="preserve"> ;</w:t>
             </w:r>
           </w:p>
           <w:p>
@@ -2892,7 +3234,7 @@
               <w:pStyle w:val="Paragraphedeliste"/>
               <w:numPr>
                 <w:ilvl w:val="0"/>
-                <w:numId w:val="24"/>
+                <w:numId w:val="30"/>
               </w:numPr>
               <w:rPr>
                 <w:rFonts w:ascii="Arial" w:hAnsi="Arial" w:cs="Arial"/>
@@ -2917,169 +3259,231 @@
             </w:pPr>
           </w:p>
           <w:p>
+            <w:r>
+              <w:rPr>
+                <w:rFonts w:ascii="Arial" w:hAnsi="Arial"/>
+                <w:b/>
+                <w:sz w:val="22"/>
+              </w:rPr>
+              <w:t>Flux de traitement (étapes) :</w:t>
+            </w:r>
+          </w:p>
+          <w:p>
             <w:pPr>
-              <w:rPr>
-                <w:rFonts w:ascii="Arial" w:hAnsi="Arial" w:cs="Arial"/>
-              </w:rPr>
+              <w:pStyle w:val="Paragraphedeliste"/>
+              <w:numPr>
+                <w:ilvl w:val="0"/>
+                <w:numId w:val="29"/>
+              </w:numPr>
             </w:pPr>
             <w:r>
               <w:rPr>
-                <w:rFonts w:ascii="Arial" w:hAnsi="Arial" w:cs="Arial"/>
-                <w:b/>
-                <w:bCs/>
-                <w:sz w:val="22"/>
-              </w:rPr>
-              <w:t>Schéma explicatif du flux</w:t>
-            </w:r>
-            <w:r>
-              <w:rPr>
-                <w:rFonts w:ascii="Arial" w:hAnsi="Arial" w:cs="Arial"/>
-                <w:b/>
-                <w:sz w:val="22"/>
-              </w:rPr>
-              <w:t xml:space="preserve"> :</w:t>
-            </w:r>
-          </w:p>
-          <w:p>
-            <w:pPr/>
-            <w:r>
-              <w:rPr>
-                <w:rFonts w:ascii="Arial" w:hAnsi="Arial"/>
-                <w:sz w:val="22"/>
-              </w:rPr>
-              <w:t>[Exports Zendesk XML]</w:t>
+                <w:rFonts w:ascii="Arial" w:hAnsi="Arial"/>
+                <w:sz w:val="22"/>
+              </w:rPr>
+              <w:t xml:space="preserve">Import des exports de tickets </w:t>
+            </w:r>
+            <w:proofErr w:type="spellStart"/>
+            <w:r>
+              <w:rPr>
+                <w:rFonts w:ascii="Arial" w:hAnsi="Arial"/>
+                <w:sz w:val="22"/>
+              </w:rPr>
+              <w:t>Zendesk</w:t>
+            </w:r>
+            <w:proofErr w:type="spellEnd"/>
+            <w:r>
+              <w:rPr>
+                <w:rFonts w:ascii="Arial" w:hAnsi="Arial"/>
+                <w:sz w:val="22"/>
+              </w:rPr>
+              <w:t xml:space="preserve"> (XML)</w:t>
             </w:r>
           </w:p>
           <w:p>
             <w:pPr>
-              <w:jc w:val="center"/>
+              <w:pStyle w:val="Paragraphedeliste"/>
+              <w:numPr>
+                <w:ilvl w:val="0"/>
+                <w:numId w:val="29"/>
+              </w:numPr>
             </w:pPr>
             <w:r>
               <w:rPr>
                 <w:rFonts w:ascii="Arial" w:hAnsi="Arial"/>
                 <w:sz w:val="22"/>
               </w:rPr>
-              <w:t>↓</w:t>
-            </w:r>
-          </w:p>
-          <w:p>
-            <w:pPr/>
-            <w:r>
-              <w:rPr>
-                <w:rFonts w:ascii="Arial" w:hAnsi="Arial"/>
-                <w:sz w:val="22"/>
-              </w:rPr>
-              <w:t>[Extraction et parsing (Ruby + Nokogiri)]</w:t>
+              <w:t xml:space="preserve">Extraction et </w:t>
+            </w:r>
+            <w:proofErr w:type="spellStart"/>
+            <w:r>
+              <w:rPr>
+                <w:rFonts w:ascii="Arial" w:hAnsi="Arial"/>
+                <w:sz w:val="22"/>
+              </w:rPr>
+              <w:t>parsing</w:t>
+            </w:r>
+            <w:proofErr w:type="spellEnd"/>
+            <w:r>
+              <w:rPr>
+                <w:rFonts w:ascii="Arial" w:hAnsi="Arial"/>
+                <w:sz w:val="22"/>
+              </w:rPr>
+              <w:t xml:space="preserve"> des données (Ruby + </w:t>
+            </w:r>
+            <w:proofErr w:type="spellStart"/>
+            <w:r>
+              <w:rPr>
+                <w:rFonts w:ascii="Arial" w:hAnsi="Arial"/>
+                <w:sz w:val="22"/>
+              </w:rPr>
+              <w:t>Nokogiri</w:t>
+            </w:r>
+            <w:proofErr w:type="spellEnd"/>
+            <w:r>
+              <w:rPr>
+                <w:rFonts w:ascii="Arial" w:hAnsi="Arial"/>
+                <w:sz w:val="22"/>
+              </w:rPr>
+              <w:t>)</w:t>
             </w:r>
           </w:p>
           <w:p>
             <w:pPr>
-              <w:jc w:val="center"/>
+              <w:pStyle w:val="Paragraphedeliste"/>
+              <w:numPr>
+                <w:ilvl w:val="0"/>
+                <w:numId w:val="29"/>
+              </w:numPr>
             </w:pPr>
             <w:r>
               <w:rPr>
                 <w:rFonts w:ascii="Arial" w:hAnsi="Arial"/>
                 <w:sz w:val="22"/>
               </w:rPr>
-              <w:t>↓</w:t>
-            </w:r>
-          </w:p>
-          <w:p>
-            <w:pPr/>
-            <w:r>
-              <w:rPr>
-                <w:rFonts w:ascii="Arial" w:hAnsi="Arial"/>
-                <w:sz w:val="22"/>
-              </w:rPr>
-              <w:t>[Nettoyage / normalisation des tickets]</w:t>
+              <w:t>Nettoyage et normalisation des tickets</w:t>
             </w:r>
           </w:p>
           <w:p>
             <w:pPr>
-              <w:jc w:val="center"/>
+              <w:pStyle w:val="Paragraphedeliste"/>
+              <w:numPr>
+                <w:ilvl w:val="0"/>
+                <w:numId w:val="29"/>
+              </w:numPr>
             </w:pPr>
             <w:r>
               <w:rPr>
                 <w:rFonts w:ascii="Arial" w:hAnsi="Arial"/>
                 <w:sz w:val="22"/>
               </w:rPr>
-              <w:t>↓</w:t>
-            </w:r>
-          </w:p>
-          <w:p>
-            <w:pPr/>
-            <w:r>
-              <w:rPr>
-                <w:rFonts w:ascii="Arial" w:hAnsi="Arial"/>
-                <w:sz w:val="22"/>
-              </w:rPr>
-              <w:t>[Vectorisation (embeddings via Ollama)]</w:t>
+              <w:lastRenderedPageBreak/>
+              <w:t>Vectorisation des contenus (</w:t>
+            </w:r>
+            <w:proofErr w:type="spellStart"/>
+            <w:r>
+              <w:rPr>
+                <w:rFonts w:ascii="Arial" w:hAnsi="Arial"/>
+                <w:sz w:val="22"/>
+              </w:rPr>
+              <w:t>embeddings</w:t>
+            </w:r>
+            <w:proofErr w:type="spellEnd"/>
+            <w:r>
+              <w:rPr>
+                <w:rFonts w:ascii="Arial" w:hAnsi="Arial"/>
+                <w:sz w:val="22"/>
+              </w:rPr>
+              <w:t xml:space="preserve"> via </w:t>
+            </w:r>
+            <w:proofErr w:type="spellStart"/>
+            <w:r>
+              <w:rPr>
+                <w:rFonts w:ascii="Arial" w:hAnsi="Arial"/>
+                <w:sz w:val="22"/>
+              </w:rPr>
+              <w:t>Ollama</w:t>
+            </w:r>
+            <w:proofErr w:type="spellEnd"/>
+            <w:r>
+              <w:rPr>
+                <w:rFonts w:ascii="Arial" w:hAnsi="Arial"/>
+                <w:sz w:val="22"/>
+              </w:rPr>
+              <w:t>)</w:t>
             </w:r>
           </w:p>
           <w:p>
             <w:pPr>
-              <w:jc w:val="center"/>
+              <w:pStyle w:val="Paragraphedeliste"/>
+              <w:numPr>
+                <w:ilvl w:val="0"/>
+                <w:numId w:val="29"/>
+              </w:numPr>
             </w:pPr>
             <w:r>
               <w:rPr>
                 <w:rFonts w:ascii="Arial" w:hAnsi="Arial"/>
                 <w:sz w:val="22"/>
               </w:rPr>
-              <w:t>↓</w:t>
-            </w:r>
-          </w:p>
-          <w:p>
-            <w:pPr/>
-            <w:r>
-              <w:rPr>
-                <w:rFonts w:ascii="Arial" w:hAnsi="Arial"/>
-                <w:sz w:val="22"/>
-              </w:rPr>
-              <w:t>[Clustering KMeans + similarité cosinus]</w:t>
+              <w:t xml:space="preserve">Clustering </w:t>
+            </w:r>
+            <w:proofErr w:type="spellStart"/>
+            <w:r>
+              <w:rPr>
+                <w:rFonts w:ascii="Arial" w:hAnsi="Arial"/>
+                <w:sz w:val="22"/>
+              </w:rPr>
+              <w:t>KMeans</w:t>
+            </w:r>
+            <w:proofErr w:type="spellEnd"/>
+            <w:r>
+              <w:rPr>
+                <w:rFonts w:ascii="Arial" w:hAnsi="Arial"/>
+                <w:sz w:val="22"/>
+              </w:rPr>
+              <w:t xml:space="preserve"> et calcul de similarité cosinus</w:t>
             </w:r>
           </w:p>
           <w:p>
             <w:pPr>
-              <w:jc w:val="center"/>
+              <w:pStyle w:val="Paragraphedeliste"/>
+              <w:numPr>
+                <w:ilvl w:val="0"/>
+                <w:numId w:val="29"/>
+              </w:numPr>
             </w:pPr>
             <w:r>
               <w:rPr>
                 <w:rFonts w:ascii="Arial" w:hAnsi="Arial"/>
                 <w:sz w:val="22"/>
               </w:rPr>
-              <w:t>↓</w:t>
-            </w:r>
-          </w:p>
-          <w:p>
-            <w:pPr/>
-            <w:r>
-              <w:rPr>
-                <w:rFonts w:ascii="Arial" w:hAnsi="Arial"/>
-                <w:sz w:val="22"/>
-              </w:rPr>
-              <w:t>[Résumés thématiques + reporting]</w:t>
-            </w:r>
+              <w:t xml:space="preserve">Génération de résumés thématiques et </w:t>
+            </w:r>
+            <w:proofErr w:type="spellStart"/>
+            <w:r>
+              <w:rPr>
+                <w:rFonts w:ascii="Arial" w:hAnsi="Arial"/>
+                <w:sz w:val="22"/>
+              </w:rPr>
+              <w:t>reporting</w:t>
+            </w:r>
+            <w:proofErr w:type="spellEnd"/>
           </w:p>
           <w:p>
             <w:pPr>
-              <w:jc w:val="center"/>
+              <w:pStyle w:val="Paragraphedeliste"/>
+              <w:numPr>
+                <w:ilvl w:val="0"/>
+                <w:numId w:val="29"/>
+              </w:numPr>
             </w:pPr>
             <w:r>
               <w:rPr>
                 <w:rFonts w:ascii="Arial" w:hAnsi="Arial"/>
                 <w:sz w:val="22"/>
               </w:rPr>
-              <w:t>↓</w:t>
-            </w:r>
-          </w:p>
-          <w:p>
-            <w:pPr/>
-            <w:r>
-              <w:rPr>
-                <w:rFonts w:ascii="Arial" w:hAnsi="Arial"/>
-                <w:sz w:val="22"/>
-              </w:rPr>
-              <w:t>[Restitution pour équipes support / produit]</w:t>
+              <w:t>Restitution des résultats pour les équipes support et produit</w:t>
             </w:r>
           </w:p>
         </w:tc>
@@ -3098,7 +3502,7 @@
       </w:pPr>
     </w:p>
     <w:sectPr>
-      <w:footerReference w:type="default" r:id="rId8"/>
+      <w:footerReference w:type="default" r:id="rId10"/>
       <w:pgSz w:w="11900" w:h="16840"/>
       <w:pgMar w:top="851" w:right="1134" w:bottom="567" w:left="1134" w:header="709" w:footer="567" w:gutter="0"/>
       <w:cols w:space="708"/>
@@ -4422,6 +4826,119 @@
     </w:lvl>
   </w:abstractNum>
   <w:abstractNum w:abstractNumId="10" w15:restartNumberingAfterBreak="0">
+    <w:nsid w:val="1DEE7632"/>
+    <w:multiLevelType w:val="hybridMultilevel"/>
+    <w:tmpl w:val="7494AB0C"/>
+    <w:lvl w:ilvl="0" w:tplc="04090001">
+      <w:start w:val="1"/>
+      <w:numFmt w:val="bullet"/>
+      <w:lvlText w:val=""/>
+      <w:lvlJc w:val="left"/>
+      <w:pPr>
+        <w:ind w:left="720" w:hanging="360"/>
+      </w:pPr>
+      <w:rPr>
+        <w:rFonts w:ascii="Symbol" w:hAnsi="Symbol" w:hint="default"/>
+      </w:rPr>
+    </w:lvl>
+    <w:lvl w:ilvl="1" w:tplc="04090003" w:tentative="1">
+      <w:start w:val="1"/>
+      <w:numFmt w:val="bullet"/>
+      <w:lvlText w:val="o"/>
+      <w:lvlJc w:val="left"/>
+      <w:pPr>
+        <w:ind w:left="1440" w:hanging="360"/>
+      </w:pPr>
+      <w:rPr>
+        <w:rFonts w:ascii="Courier New" w:hAnsi="Courier New" w:cs="Courier New" w:hint="default"/>
+      </w:rPr>
+    </w:lvl>
+    <w:lvl w:ilvl="2" w:tplc="04090005" w:tentative="1">
+      <w:start w:val="1"/>
+      <w:numFmt w:val="bullet"/>
+      <w:lvlText w:val=""/>
+      <w:lvlJc w:val="left"/>
+      <w:pPr>
+        <w:ind w:left="2160" w:hanging="360"/>
+      </w:pPr>
+      <w:rPr>
+        <w:rFonts w:ascii="Wingdings" w:hAnsi="Wingdings" w:hint="default"/>
+      </w:rPr>
+    </w:lvl>
+    <w:lvl w:ilvl="3" w:tplc="04090001" w:tentative="1">
+      <w:start w:val="1"/>
+      <w:numFmt w:val="bullet"/>
+      <w:lvlText w:val=""/>
+      <w:lvlJc w:val="left"/>
+      <w:pPr>
+        <w:ind w:left="2880" w:hanging="360"/>
+      </w:pPr>
+      <w:rPr>
+        <w:rFonts w:ascii="Symbol" w:hAnsi="Symbol" w:hint="default"/>
+      </w:rPr>
+    </w:lvl>
+    <w:lvl w:ilvl="4" w:tplc="04090003" w:tentative="1">
+      <w:start w:val="1"/>
+      <w:numFmt w:val="bullet"/>
+      <w:lvlText w:val="o"/>
+      <w:lvlJc w:val="left"/>
+      <w:pPr>
+        <w:ind w:left="3600" w:hanging="360"/>
+      </w:pPr>
+      <w:rPr>
+        <w:rFonts w:ascii="Courier New" w:hAnsi="Courier New" w:cs="Courier New" w:hint="default"/>
+      </w:rPr>
+    </w:lvl>
+    <w:lvl w:ilvl="5" w:tplc="04090005" w:tentative="1">
+      <w:start w:val="1"/>
+      <w:numFmt w:val="bullet"/>
+      <w:lvlText w:val=""/>
+      <w:lvlJc w:val="left"/>
+      <w:pPr>
+        <w:ind w:left="4320" w:hanging="360"/>
+      </w:pPr>
+      <w:rPr>
+        <w:rFonts w:ascii="Wingdings" w:hAnsi="Wingdings" w:hint="default"/>
+      </w:rPr>
+    </w:lvl>
+    <w:lvl w:ilvl="6" w:tplc="04090001" w:tentative="1">
+      <w:start w:val="1"/>
+      <w:numFmt w:val="bullet"/>
+      <w:lvlText w:val=""/>
+      <w:lvlJc w:val="left"/>
+      <w:pPr>
+        <w:ind w:left="5040" w:hanging="360"/>
+      </w:pPr>
+      <w:rPr>
+        <w:rFonts w:ascii="Symbol" w:hAnsi="Symbol" w:hint="default"/>
+      </w:rPr>
+    </w:lvl>
+    <w:lvl w:ilvl="7" w:tplc="04090003" w:tentative="1">
+      <w:start w:val="1"/>
+      <w:numFmt w:val="bullet"/>
+      <w:lvlText w:val="o"/>
+      <w:lvlJc w:val="left"/>
+      <w:pPr>
+        <w:ind w:left="5760" w:hanging="360"/>
+      </w:pPr>
+      <w:rPr>
+        <w:rFonts w:ascii="Courier New" w:hAnsi="Courier New" w:cs="Courier New" w:hint="default"/>
+      </w:rPr>
+    </w:lvl>
+    <w:lvl w:ilvl="8" w:tplc="04090005" w:tentative="1">
+      <w:start w:val="1"/>
+      <w:numFmt w:val="bullet"/>
+      <w:lvlText w:val=""/>
+      <w:lvlJc w:val="left"/>
+      <w:pPr>
+        <w:ind w:left="6480" w:hanging="360"/>
+      </w:pPr>
+      <w:rPr>
+        <w:rFonts w:ascii="Wingdings" w:hAnsi="Wingdings" w:hint="default"/>
+      </w:rPr>
+    </w:lvl>
+  </w:abstractNum>
+  <w:abstractNum w:abstractNumId="11" w15:restartNumberingAfterBreak="0">
     <w:nsid w:val="28952276"/>
     <w:multiLevelType w:val="hybridMultilevel"/>
     <w:tmpl w:val="63BC8190"/>
@@ -4534,7 +5051,120 @@
       </w:rPr>
     </w:lvl>
   </w:abstractNum>
-  <w:abstractNum w:abstractNumId="11" w15:restartNumberingAfterBreak="0">
+  <w:abstractNum w:abstractNumId="12" w15:restartNumberingAfterBreak="0">
+    <w:nsid w:val="29E56432"/>
+    <w:multiLevelType w:val="hybridMultilevel"/>
+    <w:tmpl w:val="5CDE4882"/>
+    <w:lvl w:ilvl="0" w:tplc="04090001">
+      <w:start w:val="1"/>
+      <w:numFmt w:val="bullet"/>
+      <w:lvlText w:val=""/>
+      <w:lvlJc w:val="left"/>
+      <w:pPr>
+        <w:ind w:left="720" w:hanging="360"/>
+      </w:pPr>
+      <w:rPr>
+        <w:rFonts w:ascii="Symbol" w:hAnsi="Symbol" w:hint="default"/>
+      </w:rPr>
+    </w:lvl>
+    <w:lvl w:ilvl="1" w:tplc="04090003" w:tentative="1">
+      <w:start w:val="1"/>
+      <w:numFmt w:val="bullet"/>
+      <w:lvlText w:val="o"/>
+      <w:lvlJc w:val="left"/>
+      <w:pPr>
+        <w:ind w:left="1440" w:hanging="360"/>
+      </w:pPr>
+      <w:rPr>
+        <w:rFonts w:ascii="Courier New" w:hAnsi="Courier New" w:cs="Courier New" w:hint="default"/>
+      </w:rPr>
+    </w:lvl>
+    <w:lvl w:ilvl="2" w:tplc="04090005" w:tentative="1">
+      <w:start w:val="1"/>
+      <w:numFmt w:val="bullet"/>
+      <w:lvlText w:val=""/>
+      <w:lvlJc w:val="left"/>
+      <w:pPr>
+        <w:ind w:left="2160" w:hanging="360"/>
+      </w:pPr>
+      <w:rPr>
+        <w:rFonts w:ascii="Wingdings" w:hAnsi="Wingdings" w:hint="default"/>
+      </w:rPr>
+    </w:lvl>
+    <w:lvl w:ilvl="3" w:tplc="04090001" w:tentative="1">
+      <w:start w:val="1"/>
+      <w:numFmt w:val="bullet"/>
+      <w:lvlText w:val=""/>
+      <w:lvlJc w:val="left"/>
+      <w:pPr>
+        <w:ind w:left="2880" w:hanging="360"/>
+      </w:pPr>
+      <w:rPr>
+        <w:rFonts w:ascii="Symbol" w:hAnsi="Symbol" w:hint="default"/>
+      </w:rPr>
+    </w:lvl>
+    <w:lvl w:ilvl="4" w:tplc="04090003" w:tentative="1">
+      <w:start w:val="1"/>
+      <w:numFmt w:val="bullet"/>
+      <w:lvlText w:val="o"/>
+      <w:lvlJc w:val="left"/>
+      <w:pPr>
+        <w:ind w:left="3600" w:hanging="360"/>
+      </w:pPr>
+      <w:rPr>
+        <w:rFonts w:ascii="Courier New" w:hAnsi="Courier New" w:cs="Courier New" w:hint="default"/>
+      </w:rPr>
+    </w:lvl>
+    <w:lvl w:ilvl="5" w:tplc="04090005" w:tentative="1">
+      <w:start w:val="1"/>
+      <w:numFmt w:val="bullet"/>
+      <w:lvlText w:val=""/>
+      <w:lvlJc w:val="left"/>
+      <w:pPr>
+        <w:ind w:left="4320" w:hanging="360"/>
+      </w:pPr>
+      <w:rPr>
+        <w:rFonts w:ascii="Wingdings" w:hAnsi="Wingdings" w:hint="default"/>
+      </w:rPr>
+    </w:lvl>
+    <w:lvl w:ilvl="6" w:tplc="04090001" w:tentative="1">
+      <w:start w:val="1"/>
+      <w:numFmt w:val="bullet"/>
+      <w:lvlText w:val=""/>
+      <w:lvlJc w:val="left"/>
+      <w:pPr>
+        <w:ind w:left="5040" w:hanging="360"/>
+      </w:pPr>
+      <w:rPr>
+        <w:rFonts w:ascii="Symbol" w:hAnsi="Symbol" w:hint="default"/>
+      </w:rPr>
+    </w:lvl>
+    <w:lvl w:ilvl="7" w:tplc="04090003" w:tentative="1">
+      <w:start w:val="1"/>
+      <w:numFmt w:val="bullet"/>
+      <w:lvlText w:val="o"/>
+      <w:lvlJc w:val="left"/>
+      <w:pPr>
+        <w:ind w:left="5760" w:hanging="360"/>
+      </w:pPr>
+      <w:rPr>
+        <w:rFonts w:ascii="Courier New" w:hAnsi="Courier New" w:cs="Courier New" w:hint="default"/>
+      </w:rPr>
+    </w:lvl>
+    <w:lvl w:ilvl="8" w:tplc="04090005" w:tentative="1">
+      <w:start w:val="1"/>
+      <w:numFmt w:val="bullet"/>
+      <w:lvlText w:val=""/>
+      <w:lvlJc w:val="left"/>
+      <w:pPr>
+        <w:ind w:left="6480" w:hanging="360"/>
+      </w:pPr>
+      <w:rPr>
+        <w:rFonts w:ascii="Wingdings" w:hAnsi="Wingdings" w:hint="default"/>
+      </w:rPr>
+    </w:lvl>
+  </w:abstractNum>
+  <w:abstractNum w:abstractNumId="13" w15:restartNumberingAfterBreak="0">
     <w:nsid w:val="2EF826F8"/>
     <w:multiLevelType w:val="hybridMultilevel"/>
     <w:tmpl w:val="6FF81428"/>
@@ -4647,7 +5277,120 @@
       </w:rPr>
     </w:lvl>
   </w:abstractNum>
-  <w:abstractNum w:abstractNumId="12" w15:restartNumberingAfterBreak="0">
+  <w:abstractNum w:abstractNumId="14" w15:restartNumberingAfterBreak="0">
+    <w:nsid w:val="30C2512C"/>
+    <w:multiLevelType w:val="hybridMultilevel"/>
+    <w:tmpl w:val="8452BC42"/>
+    <w:lvl w:ilvl="0" w:tplc="04090001">
+      <w:start w:val="1"/>
+      <w:numFmt w:val="bullet"/>
+      <w:lvlText w:val=""/>
+      <w:lvlJc w:val="left"/>
+      <w:pPr>
+        <w:ind w:left="720" w:hanging="360"/>
+      </w:pPr>
+      <w:rPr>
+        <w:rFonts w:ascii="Symbol" w:hAnsi="Symbol" w:hint="default"/>
+      </w:rPr>
+    </w:lvl>
+    <w:lvl w:ilvl="1" w:tplc="04090003" w:tentative="1">
+      <w:start w:val="1"/>
+      <w:numFmt w:val="bullet"/>
+      <w:lvlText w:val="o"/>
+      <w:lvlJc w:val="left"/>
+      <w:pPr>
+        <w:ind w:left="1440" w:hanging="360"/>
+      </w:pPr>
+      <w:rPr>
+        <w:rFonts w:ascii="Courier New" w:hAnsi="Courier New" w:cs="Courier New" w:hint="default"/>
+      </w:rPr>
+    </w:lvl>
+    <w:lvl w:ilvl="2" w:tplc="04090005" w:tentative="1">
+      <w:start w:val="1"/>
+      <w:numFmt w:val="bullet"/>
+      <w:lvlText w:val=""/>
+      <w:lvlJc w:val="left"/>
+      <w:pPr>
+        <w:ind w:left="2160" w:hanging="360"/>
+      </w:pPr>
+      <w:rPr>
+        <w:rFonts w:ascii="Wingdings" w:hAnsi="Wingdings" w:hint="default"/>
+      </w:rPr>
+    </w:lvl>
+    <w:lvl w:ilvl="3" w:tplc="04090001" w:tentative="1">
+      <w:start w:val="1"/>
+      <w:numFmt w:val="bullet"/>
+      <w:lvlText w:val=""/>
+      <w:lvlJc w:val="left"/>
+      <w:pPr>
+        <w:ind w:left="2880" w:hanging="360"/>
+      </w:pPr>
+      <w:rPr>
+        <w:rFonts w:ascii="Symbol" w:hAnsi="Symbol" w:hint="default"/>
+      </w:rPr>
+    </w:lvl>
+    <w:lvl w:ilvl="4" w:tplc="04090003" w:tentative="1">
+      <w:start w:val="1"/>
+      <w:numFmt w:val="bullet"/>
+      <w:lvlText w:val="o"/>
+      <w:lvlJc w:val="left"/>
+      <w:pPr>
+        <w:ind w:left="3600" w:hanging="360"/>
+      </w:pPr>
+      <w:rPr>
+        <w:rFonts w:ascii="Courier New" w:hAnsi="Courier New" w:cs="Courier New" w:hint="default"/>
+      </w:rPr>
+    </w:lvl>
+    <w:lvl w:ilvl="5" w:tplc="04090005" w:tentative="1">
+      <w:start w:val="1"/>
+      <w:numFmt w:val="bullet"/>
+      <w:lvlText w:val=""/>
+      <w:lvlJc w:val="left"/>
+      <w:pPr>
+        <w:ind w:left="4320" w:hanging="360"/>
+      </w:pPr>
+      <w:rPr>
+        <w:rFonts w:ascii="Wingdings" w:hAnsi="Wingdings" w:hint="default"/>
+      </w:rPr>
+    </w:lvl>
+    <w:lvl w:ilvl="6" w:tplc="04090001" w:tentative="1">
+      <w:start w:val="1"/>
+      <w:numFmt w:val="bullet"/>
+      <w:lvlText w:val=""/>
+      <w:lvlJc w:val="left"/>
+      <w:pPr>
+        <w:ind w:left="5040" w:hanging="360"/>
+      </w:pPr>
+      <w:rPr>
+        <w:rFonts w:ascii="Symbol" w:hAnsi="Symbol" w:hint="default"/>
+      </w:rPr>
+    </w:lvl>
+    <w:lvl w:ilvl="7" w:tplc="04090003" w:tentative="1">
+      <w:start w:val="1"/>
+      <w:numFmt w:val="bullet"/>
+      <w:lvlText w:val="o"/>
+      <w:lvlJc w:val="left"/>
+      <w:pPr>
+        <w:ind w:left="5760" w:hanging="360"/>
+      </w:pPr>
+      <w:rPr>
+        <w:rFonts w:ascii="Courier New" w:hAnsi="Courier New" w:cs="Courier New" w:hint="default"/>
+      </w:rPr>
+    </w:lvl>
+    <w:lvl w:ilvl="8" w:tplc="04090005" w:tentative="1">
+      <w:start w:val="1"/>
+      <w:numFmt w:val="bullet"/>
+      <w:lvlText w:val=""/>
+      <w:lvlJc w:val="left"/>
+      <w:pPr>
+        <w:ind w:left="6480" w:hanging="360"/>
+      </w:pPr>
+      <w:rPr>
+        <w:rFonts w:ascii="Wingdings" w:hAnsi="Wingdings" w:hint="default"/>
+      </w:rPr>
+    </w:lvl>
+  </w:abstractNum>
+  <w:abstractNum w:abstractNumId="15" w15:restartNumberingAfterBreak="0">
     <w:nsid w:val="3141555D"/>
     <w:multiLevelType w:val="multilevel"/>
     <w:tmpl w:val="216A2E8E"/>
@@ -4778,7 +5521,7 @@
       </w:rPr>
     </w:lvl>
   </w:abstractNum>
-  <w:abstractNum w:abstractNumId="13" w15:restartNumberingAfterBreak="0">
+  <w:abstractNum w:abstractNumId="16" w15:restartNumberingAfterBreak="0">
     <w:nsid w:val="408A2D13"/>
     <w:multiLevelType w:val="hybridMultilevel"/>
     <w:tmpl w:val="CCEE8458"/>
@@ -4890,7 +5633,7 @@
       </w:rPr>
     </w:lvl>
   </w:abstractNum>
-  <w:abstractNum w:abstractNumId="14" w15:restartNumberingAfterBreak="0">
+  <w:abstractNum w:abstractNumId="17" w15:restartNumberingAfterBreak="0">
     <w:nsid w:val="443B4850"/>
     <w:multiLevelType w:val="hybridMultilevel"/>
     <w:tmpl w:val="B094D2E0"/>
@@ -5003,7 +5746,7 @@
       </w:rPr>
     </w:lvl>
   </w:abstractNum>
-  <w:abstractNum w:abstractNumId="15" w15:restartNumberingAfterBreak="0">
+  <w:abstractNum w:abstractNumId="18" w15:restartNumberingAfterBreak="0">
     <w:nsid w:val="45D542C5"/>
     <w:multiLevelType w:val="multilevel"/>
     <w:tmpl w:val="6284FBDE"/>
@@ -5134,7 +5877,7 @@
       </w:rPr>
     </w:lvl>
   </w:abstractNum>
-  <w:abstractNum w:abstractNumId="16" w15:restartNumberingAfterBreak="0">
+  <w:abstractNum w:abstractNumId="19" w15:restartNumberingAfterBreak="0">
     <w:nsid w:val="48F23D79"/>
     <w:multiLevelType w:val="multilevel"/>
     <w:tmpl w:val="049298B6"/>
@@ -5265,7 +6008,7 @@
       </w:rPr>
     </w:lvl>
   </w:abstractNum>
-  <w:abstractNum w:abstractNumId="17" w15:restartNumberingAfterBreak="0">
+  <w:abstractNum w:abstractNumId="20" w15:restartNumberingAfterBreak="0">
     <w:nsid w:val="4B385CB8"/>
     <w:multiLevelType w:val="multilevel"/>
     <w:tmpl w:val="A93031D2"/>
@@ -5378,7 +6121,7 @@
       </w:rPr>
     </w:lvl>
   </w:abstractNum>
-  <w:abstractNum w:abstractNumId="18" w15:restartNumberingAfterBreak="0">
+  <w:abstractNum w:abstractNumId="21" w15:restartNumberingAfterBreak="0">
     <w:nsid w:val="4B8979BA"/>
     <w:multiLevelType w:val="hybridMultilevel"/>
     <w:tmpl w:val="3F586E40"/>
@@ -5490,7 +6233,7 @@
       </w:rPr>
     </w:lvl>
   </w:abstractNum>
-  <w:abstractNum w:abstractNumId="19" w15:restartNumberingAfterBreak="0">
+  <w:abstractNum w:abstractNumId="22" w15:restartNumberingAfterBreak="0">
     <w:nsid w:val="546203E4"/>
     <w:multiLevelType w:val="hybridMultilevel"/>
     <w:tmpl w:val="5C4E7B72"/>
@@ -5604,7 +6347,7 @@
       </w:rPr>
     </w:lvl>
   </w:abstractNum>
-  <w:abstractNum w:abstractNumId="20" w15:restartNumberingAfterBreak="0">
+  <w:abstractNum w:abstractNumId="23" w15:restartNumberingAfterBreak="0">
     <w:nsid w:val="562F10E4"/>
     <w:multiLevelType w:val="hybridMultilevel"/>
     <w:tmpl w:val="6F240FFC"/>
@@ -5718,7 +6461,7 @@
       </w:rPr>
     </w:lvl>
   </w:abstractNum>
-  <w:abstractNum w:abstractNumId="21" w15:restartNumberingAfterBreak="0">
+  <w:abstractNum w:abstractNumId="24" w15:restartNumberingAfterBreak="0">
     <w:nsid w:val="57367469"/>
     <w:multiLevelType w:val="hybridMultilevel"/>
     <w:tmpl w:val="50B0E548"/>
@@ -5857,7 +6600,7 @@
       </w:rPr>
     </w:lvl>
   </w:abstractNum>
-  <w:abstractNum w:abstractNumId="22" w15:restartNumberingAfterBreak="0">
+  <w:abstractNum w:abstractNumId="25" w15:restartNumberingAfterBreak="0">
     <w:nsid w:val="58DF35B5"/>
     <w:multiLevelType w:val="hybridMultilevel"/>
     <w:tmpl w:val="42C874F8"/>
@@ -5970,7 +6713,7 @@
       </w:rPr>
     </w:lvl>
   </w:abstractNum>
-  <w:abstractNum w:abstractNumId="23" w15:restartNumberingAfterBreak="0">
+  <w:abstractNum w:abstractNumId="26" w15:restartNumberingAfterBreak="0">
     <w:nsid w:val="5D1B2635"/>
     <w:multiLevelType w:val="hybridMultilevel"/>
     <w:tmpl w:val="173218A6"/>
@@ -6083,7 +6826,233 @@
       </w:rPr>
     </w:lvl>
   </w:abstractNum>
-  <w:abstractNum w:abstractNumId="24" w15:restartNumberingAfterBreak="0">
+  <w:abstractNum w:abstractNumId="27" w15:restartNumberingAfterBreak="0">
+    <w:nsid w:val="5EC0315E"/>
+    <w:multiLevelType w:val="hybridMultilevel"/>
+    <w:tmpl w:val="562069CC"/>
+    <w:lvl w:ilvl="0" w:tplc="04090001">
+      <w:start w:val="1"/>
+      <w:numFmt w:val="bullet"/>
+      <w:lvlText w:val=""/>
+      <w:lvlJc w:val="left"/>
+      <w:pPr>
+        <w:ind w:left="720" w:hanging="360"/>
+      </w:pPr>
+      <w:rPr>
+        <w:rFonts w:ascii="Symbol" w:hAnsi="Symbol" w:hint="default"/>
+      </w:rPr>
+    </w:lvl>
+    <w:lvl w:ilvl="1" w:tplc="04090003" w:tentative="1">
+      <w:start w:val="1"/>
+      <w:numFmt w:val="bullet"/>
+      <w:lvlText w:val="o"/>
+      <w:lvlJc w:val="left"/>
+      <w:pPr>
+        <w:ind w:left="1440" w:hanging="360"/>
+      </w:pPr>
+      <w:rPr>
+        <w:rFonts w:ascii="Courier New" w:hAnsi="Courier New" w:cs="Courier New" w:hint="default"/>
+      </w:rPr>
+    </w:lvl>
+    <w:lvl w:ilvl="2" w:tplc="04090005" w:tentative="1">
+      <w:start w:val="1"/>
+      <w:numFmt w:val="bullet"/>
+      <w:lvlText w:val=""/>
+      <w:lvlJc w:val="left"/>
+      <w:pPr>
+        <w:ind w:left="2160" w:hanging="360"/>
+      </w:pPr>
+      <w:rPr>
+        <w:rFonts w:ascii="Wingdings" w:hAnsi="Wingdings" w:hint="default"/>
+      </w:rPr>
+    </w:lvl>
+    <w:lvl w:ilvl="3" w:tplc="04090001" w:tentative="1">
+      <w:start w:val="1"/>
+      <w:numFmt w:val="bullet"/>
+      <w:lvlText w:val=""/>
+      <w:lvlJc w:val="left"/>
+      <w:pPr>
+        <w:ind w:left="2880" w:hanging="360"/>
+      </w:pPr>
+      <w:rPr>
+        <w:rFonts w:ascii="Symbol" w:hAnsi="Symbol" w:hint="default"/>
+      </w:rPr>
+    </w:lvl>
+    <w:lvl w:ilvl="4" w:tplc="04090003" w:tentative="1">
+      <w:start w:val="1"/>
+      <w:numFmt w:val="bullet"/>
+      <w:lvlText w:val="o"/>
+      <w:lvlJc w:val="left"/>
+      <w:pPr>
+        <w:ind w:left="3600" w:hanging="360"/>
+      </w:pPr>
+      <w:rPr>
+        <w:rFonts w:ascii="Courier New" w:hAnsi="Courier New" w:cs="Courier New" w:hint="default"/>
+      </w:rPr>
+    </w:lvl>
+    <w:lvl w:ilvl="5" w:tplc="04090005" w:tentative="1">
+      <w:start w:val="1"/>
+      <w:numFmt w:val="bullet"/>
+      <w:lvlText w:val=""/>
+      <w:lvlJc w:val="left"/>
+      <w:pPr>
+        <w:ind w:left="4320" w:hanging="360"/>
+      </w:pPr>
+      <w:rPr>
+        <w:rFonts w:ascii="Wingdings" w:hAnsi="Wingdings" w:hint="default"/>
+      </w:rPr>
+    </w:lvl>
+    <w:lvl w:ilvl="6" w:tplc="04090001" w:tentative="1">
+      <w:start w:val="1"/>
+      <w:numFmt w:val="bullet"/>
+      <w:lvlText w:val=""/>
+      <w:lvlJc w:val="left"/>
+      <w:pPr>
+        <w:ind w:left="5040" w:hanging="360"/>
+      </w:pPr>
+      <w:rPr>
+        <w:rFonts w:ascii="Symbol" w:hAnsi="Symbol" w:hint="default"/>
+      </w:rPr>
+    </w:lvl>
+    <w:lvl w:ilvl="7" w:tplc="04090003" w:tentative="1">
+      <w:start w:val="1"/>
+      <w:numFmt w:val="bullet"/>
+      <w:lvlText w:val="o"/>
+      <w:lvlJc w:val="left"/>
+      <w:pPr>
+        <w:ind w:left="5760" w:hanging="360"/>
+      </w:pPr>
+      <w:rPr>
+        <w:rFonts w:ascii="Courier New" w:hAnsi="Courier New" w:cs="Courier New" w:hint="default"/>
+      </w:rPr>
+    </w:lvl>
+    <w:lvl w:ilvl="8" w:tplc="04090005" w:tentative="1">
+      <w:start w:val="1"/>
+      <w:numFmt w:val="bullet"/>
+      <w:lvlText w:val=""/>
+      <w:lvlJc w:val="left"/>
+      <w:pPr>
+        <w:ind w:left="6480" w:hanging="360"/>
+      </w:pPr>
+      <w:rPr>
+        <w:rFonts w:ascii="Wingdings" w:hAnsi="Wingdings" w:hint="default"/>
+      </w:rPr>
+    </w:lvl>
+  </w:abstractNum>
+  <w:abstractNum w:abstractNumId="28" w15:restartNumberingAfterBreak="0">
+    <w:nsid w:val="64A7295B"/>
+    <w:multiLevelType w:val="hybridMultilevel"/>
+    <w:tmpl w:val="A38A92A2"/>
+    <w:lvl w:ilvl="0" w:tplc="04090001">
+      <w:start w:val="1"/>
+      <w:numFmt w:val="bullet"/>
+      <w:lvlText w:val=""/>
+      <w:lvlJc w:val="left"/>
+      <w:pPr>
+        <w:ind w:left="720" w:hanging="360"/>
+      </w:pPr>
+      <w:rPr>
+        <w:rFonts w:ascii="Symbol" w:hAnsi="Symbol" w:hint="default"/>
+      </w:rPr>
+    </w:lvl>
+    <w:lvl w:ilvl="1" w:tplc="04090003" w:tentative="1">
+      <w:start w:val="1"/>
+      <w:numFmt w:val="bullet"/>
+      <w:lvlText w:val="o"/>
+      <w:lvlJc w:val="left"/>
+      <w:pPr>
+        <w:ind w:left="1440" w:hanging="360"/>
+      </w:pPr>
+      <w:rPr>
+        <w:rFonts w:ascii="Courier New" w:hAnsi="Courier New" w:cs="Courier New" w:hint="default"/>
+      </w:rPr>
+    </w:lvl>
+    <w:lvl w:ilvl="2" w:tplc="04090005" w:tentative="1">
+      <w:start w:val="1"/>
+      <w:numFmt w:val="bullet"/>
+      <w:lvlText w:val=""/>
+      <w:lvlJc w:val="left"/>
+      <w:pPr>
+        <w:ind w:left="2160" w:hanging="360"/>
+      </w:pPr>
+      <w:rPr>
+        <w:rFonts w:ascii="Wingdings" w:hAnsi="Wingdings" w:hint="default"/>
+      </w:rPr>
+    </w:lvl>
+    <w:lvl w:ilvl="3" w:tplc="04090001" w:tentative="1">
+      <w:start w:val="1"/>
+      <w:numFmt w:val="bullet"/>
+      <w:lvlText w:val=""/>
+      <w:lvlJc w:val="left"/>
+      <w:pPr>
+        <w:ind w:left="2880" w:hanging="360"/>
+      </w:pPr>
+      <w:rPr>
+        <w:rFonts w:ascii="Symbol" w:hAnsi="Symbol" w:hint="default"/>
+      </w:rPr>
+    </w:lvl>
+    <w:lvl w:ilvl="4" w:tplc="04090003" w:tentative="1">
+      <w:start w:val="1"/>
+      <w:numFmt w:val="bullet"/>
+      <w:lvlText w:val="o"/>
+      <w:lvlJc w:val="left"/>
+      <w:pPr>
+        <w:ind w:left="3600" w:hanging="360"/>
+      </w:pPr>
+      <w:rPr>
+        <w:rFonts w:ascii="Courier New" w:hAnsi="Courier New" w:cs="Courier New" w:hint="default"/>
+      </w:rPr>
+    </w:lvl>
+    <w:lvl w:ilvl="5" w:tplc="04090005" w:tentative="1">
+      <w:start w:val="1"/>
+      <w:numFmt w:val="bullet"/>
+      <w:lvlText w:val=""/>
+      <w:lvlJc w:val="left"/>
+      <w:pPr>
+        <w:ind w:left="4320" w:hanging="360"/>
+      </w:pPr>
+      <w:rPr>
+        <w:rFonts w:ascii="Wingdings" w:hAnsi="Wingdings" w:hint="default"/>
+      </w:rPr>
+    </w:lvl>
+    <w:lvl w:ilvl="6" w:tplc="04090001" w:tentative="1">
+      <w:start w:val="1"/>
+      <w:numFmt w:val="bullet"/>
+      <w:lvlText w:val=""/>
+      <w:lvlJc w:val="left"/>
+      <w:pPr>
+        <w:ind w:left="5040" w:hanging="360"/>
+      </w:pPr>
+      <w:rPr>
+        <w:rFonts w:ascii="Symbol" w:hAnsi="Symbol" w:hint="default"/>
+      </w:rPr>
+    </w:lvl>
+    <w:lvl w:ilvl="7" w:tplc="04090003" w:tentative="1">
+      <w:start w:val="1"/>
+      <w:numFmt w:val="bullet"/>
+      <w:lvlText w:val="o"/>
+      <w:lvlJc w:val="left"/>
+      <w:pPr>
+        <w:ind w:left="5760" w:hanging="360"/>
+      </w:pPr>
+      <w:rPr>
+        <w:rFonts w:ascii="Courier New" w:hAnsi="Courier New" w:cs="Courier New" w:hint="default"/>
+      </w:rPr>
+    </w:lvl>
+    <w:lvl w:ilvl="8" w:tplc="04090005" w:tentative="1">
+      <w:start w:val="1"/>
+      <w:numFmt w:val="bullet"/>
+      <w:lvlText w:val=""/>
+      <w:lvlJc w:val="left"/>
+      <w:pPr>
+        <w:ind w:left="6480" w:hanging="360"/>
+      </w:pPr>
+      <w:rPr>
+        <w:rFonts w:ascii="Wingdings" w:hAnsi="Wingdings" w:hint="default"/>
+      </w:rPr>
+    </w:lvl>
+  </w:abstractNum>
+  <w:abstractNum w:abstractNumId="29" w15:restartNumberingAfterBreak="0">
     <w:nsid w:val="699D0C7F"/>
     <w:multiLevelType w:val="hybridMultilevel"/>
     <w:tmpl w:val="1200ED04"/>
@@ -6195,7 +7164,7 @@
       </w:rPr>
     </w:lvl>
   </w:abstractNum>
-  <w:abstractNum w:abstractNumId="25" w15:restartNumberingAfterBreak="0">
+  <w:abstractNum w:abstractNumId="30" w15:restartNumberingAfterBreak="0">
     <w:nsid w:val="6F073640"/>
     <w:multiLevelType w:val="hybridMultilevel"/>
     <w:tmpl w:val="088E8C00"/>
@@ -6307,7 +7276,7 @@
       </w:rPr>
     </w:lvl>
   </w:abstractNum>
-  <w:abstractNum w:abstractNumId="26" w15:restartNumberingAfterBreak="0">
+  <w:abstractNum w:abstractNumId="31" w15:restartNumberingAfterBreak="0">
     <w:nsid w:val="7244725F"/>
     <w:multiLevelType w:val="hybridMultilevel"/>
     <w:tmpl w:val="FE98AA24"/>
@@ -6419,7 +7388,7 @@
       </w:rPr>
     </w:lvl>
   </w:abstractNum>
-  <w:abstractNum w:abstractNumId="27" w15:restartNumberingAfterBreak="0">
+  <w:abstractNum w:abstractNumId="32" w15:restartNumberingAfterBreak="0">
     <w:nsid w:val="763B099B"/>
     <w:multiLevelType w:val="multilevel"/>
     <w:tmpl w:val="7772F092"/>
@@ -6532,50 +7501,163 @@
       </w:pPr>
     </w:lvl>
   </w:abstractNum>
+  <w:abstractNum w:abstractNumId="33" w15:restartNumberingAfterBreak="0">
+    <w:nsid w:val="7DC070F0"/>
+    <w:multiLevelType w:val="hybridMultilevel"/>
+    <w:tmpl w:val="CF2E8C04"/>
+    <w:lvl w:ilvl="0" w:tplc="04090001">
+      <w:start w:val="1"/>
+      <w:numFmt w:val="bullet"/>
+      <w:lvlText w:val=""/>
+      <w:lvlJc w:val="left"/>
+      <w:pPr>
+        <w:ind w:left="720" w:hanging="360"/>
+      </w:pPr>
+      <w:rPr>
+        <w:rFonts w:ascii="Symbol" w:hAnsi="Symbol" w:hint="default"/>
+      </w:rPr>
+    </w:lvl>
+    <w:lvl w:ilvl="1" w:tplc="04090003" w:tentative="1">
+      <w:start w:val="1"/>
+      <w:numFmt w:val="bullet"/>
+      <w:lvlText w:val="o"/>
+      <w:lvlJc w:val="left"/>
+      <w:pPr>
+        <w:ind w:left="1440" w:hanging="360"/>
+      </w:pPr>
+      <w:rPr>
+        <w:rFonts w:ascii="Courier New" w:hAnsi="Courier New" w:cs="Courier New" w:hint="default"/>
+      </w:rPr>
+    </w:lvl>
+    <w:lvl w:ilvl="2" w:tplc="04090005" w:tentative="1">
+      <w:start w:val="1"/>
+      <w:numFmt w:val="bullet"/>
+      <w:lvlText w:val=""/>
+      <w:lvlJc w:val="left"/>
+      <w:pPr>
+        <w:ind w:left="2160" w:hanging="360"/>
+      </w:pPr>
+      <w:rPr>
+        <w:rFonts w:ascii="Wingdings" w:hAnsi="Wingdings" w:hint="default"/>
+      </w:rPr>
+    </w:lvl>
+    <w:lvl w:ilvl="3" w:tplc="04090001" w:tentative="1">
+      <w:start w:val="1"/>
+      <w:numFmt w:val="bullet"/>
+      <w:lvlText w:val=""/>
+      <w:lvlJc w:val="left"/>
+      <w:pPr>
+        <w:ind w:left="2880" w:hanging="360"/>
+      </w:pPr>
+      <w:rPr>
+        <w:rFonts w:ascii="Symbol" w:hAnsi="Symbol" w:hint="default"/>
+      </w:rPr>
+    </w:lvl>
+    <w:lvl w:ilvl="4" w:tplc="04090003" w:tentative="1">
+      <w:start w:val="1"/>
+      <w:numFmt w:val="bullet"/>
+      <w:lvlText w:val="o"/>
+      <w:lvlJc w:val="left"/>
+      <w:pPr>
+        <w:ind w:left="3600" w:hanging="360"/>
+      </w:pPr>
+      <w:rPr>
+        <w:rFonts w:ascii="Courier New" w:hAnsi="Courier New" w:cs="Courier New" w:hint="default"/>
+      </w:rPr>
+    </w:lvl>
+    <w:lvl w:ilvl="5" w:tplc="04090005" w:tentative="1">
+      <w:start w:val="1"/>
+      <w:numFmt w:val="bullet"/>
+      <w:lvlText w:val=""/>
+      <w:lvlJc w:val="left"/>
+      <w:pPr>
+        <w:ind w:left="4320" w:hanging="360"/>
+      </w:pPr>
+      <w:rPr>
+        <w:rFonts w:ascii="Wingdings" w:hAnsi="Wingdings" w:hint="default"/>
+      </w:rPr>
+    </w:lvl>
+    <w:lvl w:ilvl="6" w:tplc="04090001" w:tentative="1">
+      <w:start w:val="1"/>
+      <w:numFmt w:val="bullet"/>
+      <w:lvlText w:val=""/>
+      <w:lvlJc w:val="left"/>
+      <w:pPr>
+        <w:ind w:left="5040" w:hanging="360"/>
+      </w:pPr>
+      <w:rPr>
+        <w:rFonts w:ascii="Symbol" w:hAnsi="Symbol" w:hint="default"/>
+      </w:rPr>
+    </w:lvl>
+    <w:lvl w:ilvl="7" w:tplc="04090003" w:tentative="1">
+      <w:start w:val="1"/>
+      <w:numFmt w:val="bullet"/>
+      <w:lvlText w:val="o"/>
+      <w:lvlJc w:val="left"/>
+      <w:pPr>
+        <w:ind w:left="5760" w:hanging="360"/>
+      </w:pPr>
+      <w:rPr>
+        <w:rFonts w:ascii="Courier New" w:hAnsi="Courier New" w:cs="Courier New" w:hint="default"/>
+      </w:rPr>
+    </w:lvl>
+    <w:lvl w:ilvl="8" w:tplc="04090005" w:tentative="1">
+      <w:start w:val="1"/>
+      <w:numFmt w:val="bullet"/>
+      <w:lvlText w:val=""/>
+      <w:lvlJc w:val="left"/>
+      <w:pPr>
+        <w:ind w:left="6480" w:hanging="360"/>
+      </w:pPr>
+      <w:rPr>
+        <w:rFonts w:ascii="Wingdings" w:hAnsi="Wingdings" w:hint="default"/>
+      </w:rPr>
+    </w:lvl>
+  </w:abstractNum>
   <w:num w:numId="1" w16cid:durableId="825589060">
+    <w:abstractNumId w:val="18"/>
+  </w:num>
+  <w:num w:numId="2" w16cid:durableId="102041419">
     <w:abstractNumId w:val="15"/>
   </w:num>
-  <w:num w:numId="2" w16cid:durableId="102041419">
-    <w:abstractNumId w:val="12"/>
-  </w:num>
   <w:num w:numId="3" w16cid:durableId="896815832">
-    <w:abstractNumId w:val="16"/>
+    <w:abstractNumId w:val="19"/>
   </w:num>
   <w:num w:numId="4" w16cid:durableId="548497077">
-    <w:abstractNumId w:val="19"/>
+    <w:abstractNumId w:val="22"/>
   </w:num>
   <w:num w:numId="5" w16cid:durableId="1110012414">
     <w:abstractNumId w:val="9"/>
   </w:num>
   <w:num w:numId="6" w16cid:durableId="1145708365">
-    <w:abstractNumId w:val="20"/>
+    <w:abstractNumId w:val="23"/>
   </w:num>
   <w:num w:numId="7" w16cid:durableId="1248153105">
     <w:abstractNumId w:val="4"/>
   </w:num>
   <w:num w:numId="8" w16cid:durableId="1448348936">
-    <w:abstractNumId w:val="22"/>
+    <w:abstractNumId w:val="25"/>
   </w:num>
   <w:num w:numId="9" w16cid:durableId="638343289">
-    <w:abstractNumId w:val="11"/>
+    <w:abstractNumId w:val="13"/>
   </w:num>
   <w:num w:numId="10" w16cid:durableId="1740133904">
-    <w:abstractNumId w:val="27"/>
+    <w:abstractNumId w:val="32"/>
   </w:num>
   <w:num w:numId="11" w16cid:durableId="1617784306">
     <w:abstractNumId w:val="6"/>
   </w:num>
   <w:num w:numId="12" w16cid:durableId="576520348">
-    <w:abstractNumId w:val="21"/>
+    <w:abstractNumId w:val="24"/>
   </w:num>
   <w:num w:numId="13" w16cid:durableId="792141758">
+    <w:abstractNumId w:val="20"/>
+  </w:num>
+  <w:num w:numId="14" w16cid:durableId="1763185633">
     <w:abstractNumId w:val="17"/>
   </w:num>
-  <w:num w:numId="14" w16cid:durableId="1763185633">
-    <w:abstractNumId w:val="14"/>
-  </w:num>
   <w:num w:numId="15" w16cid:durableId="1844474115">
-    <w:abstractNumId w:val="23"/>
+    <w:abstractNumId w:val="26"/>
   </w:num>
   <w:num w:numId="16" w16cid:durableId="1914780008">
     <w:abstractNumId w:val="0"/>
@@ -6587,13 +7669,13 @@
     <w:abstractNumId w:val="3"/>
   </w:num>
   <w:num w:numId="19" w16cid:durableId="358170270">
-    <w:abstractNumId w:val="26"/>
+    <w:abstractNumId w:val="31"/>
   </w:num>
   <w:num w:numId="20" w16cid:durableId="209419095">
     <w:abstractNumId w:val="5"/>
   </w:num>
   <w:num w:numId="21" w16cid:durableId="2082556023">
-    <w:abstractNumId w:val="18"/>
+    <w:abstractNumId w:val="21"/>
   </w:num>
   <w:num w:numId="22" w16cid:durableId="1556551397">
     <w:abstractNumId w:val="2"/>
@@ -6602,19 +7684,37 @@
     <w:abstractNumId w:val="8"/>
   </w:num>
   <w:num w:numId="24" w16cid:durableId="1974407581">
-    <w:abstractNumId w:val="24"/>
+    <w:abstractNumId w:val="29"/>
   </w:num>
   <w:num w:numId="25" w16cid:durableId="1572497986">
-    <w:abstractNumId w:val="13"/>
+    <w:abstractNumId w:val="16"/>
   </w:num>
   <w:num w:numId="26" w16cid:durableId="1785810991">
-    <w:abstractNumId w:val="25"/>
+    <w:abstractNumId w:val="30"/>
   </w:num>
   <w:num w:numId="27" w16cid:durableId="915672351">
     <w:abstractNumId w:val="7"/>
   </w:num>
   <w:num w:numId="28" w16cid:durableId="961351341">
+    <w:abstractNumId w:val="11"/>
+  </w:num>
+  <w:num w:numId="29" w16cid:durableId="1893350125">
+    <w:abstractNumId w:val="28"/>
+  </w:num>
+  <w:num w:numId="30" w16cid:durableId="277564255">
+    <w:abstractNumId w:val="14"/>
+  </w:num>
+  <w:num w:numId="31" w16cid:durableId="1914853729">
+    <w:abstractNumId w:val="12"/>
+  </w:num>
+  <w:num w:numId="32" w16cid:durableId="1875120354">
+    <w:abstractNumId w:val="27"/>
+  </w:num>
+  <w:num w:numId="33" w16cid:durableId="18972634">
     <w:abstractNumId w:val="10"/>
+  </w:num>
+  <w:num w:numId="34" w16cid:durableId="1754469716">
+    <w:abstractNumId w:val="33"/>
   </w:num>
 </w:numbering>
 </file>
@@ -7086,6 +8186,7 @@
   <w:style w:type="character" w:default="1" w:styleId="Policepardfaut">
     <w:name w:val="Default Paragraph Font"/>
     <w:uiPriority w:val="1"/>
+    <w:semiHidden/>
     <w:unhideWhenUsed/>
   </w:style>
   <w:style w:type="table" w:default="1" w:styleId="TableauNormal">
@@ -7395,6 +8496,41 @@
       <w:lang w:eastAsia="ar-SA"/>
     </w:rPr>
   </w:style>
+  <w:style w:type="character" w:styleId="Lienhypertexte">
+    <w:name w:val="Hyperlink"/>
+    <w:basedOn w:val="Policepardfaut"/>
+    <w:uiPriority w:val="99"/>
+    <w:unhideWhenUsed/>
+    <w:rsid w:val="00616856"/>
+    <w:rPr>
+      <w:color w:val="0563C1" w:themeColor="hyperlink"/>
+      <w:u w:val="single"/>
+    </w:rPr>
+  </w:style>
+  <w:style w:type="character" w:styleId="Mentionnonrsolue">
+    <w:name w:val="Unresolved Mention"/>
+    <w:basedOn w:val="Policepardfaut"/>
+    <w:uiPriority w:val="99"/>
+    <w:semiHidden/>
+    <w:unhideWhenUsed/>
+    <w:rsid w:val="00616856"/>
+    <w:rPr>
+      <w:color w:val="605E5C"/>
+      <w:shd w:val="clear" w:color="auto" w:fill="E1DFDD"/>
+    </w:rPr>
+  </w:style>
+  <w:style w:type="character" w:styleId="Lienhypertextesuivivisit">
+    <w:name w:val="FollowedHyperlink"/>
+    <w:basedOn w:val="Policepardfaut"/>
+    <w:uiPriority w:val="99"/>
+    <w:semiHidden/>
+    <w:unhideWhenUsed/>
+    <w:rsid w:val="00616856"/>
+    <w:rPr>
+      <w:color w:val="954F72" w:themeColor="followedHyperlink"/>
+      <w:u w:val="single"/>
+    </w:rPr>
+  </w:style>
 </w:styles>
 </file>
 

</xml_diff>